<commit_message>
Completed the razor code for rendering the items in the dashboard grid.
</commit_message>
<xml_diff>
--- a/Documentation/AI Prompts/Vibe Coding - Pending Request Dashboard.docx
+++ b/Documentation/AI Prompts/Vibe Coding - Pending Request Dashboard.docx
@@ -931,6 +931,4632 @@
       </w:pPr>
       <w:r>
         <w:t>}</w:t>
+      </w:r>
+    </w:p>
+    <w:p>
+      <w:pPr>
+        <w:spacing w:after="0"/>
+      </w:pPr>
+    </w:p>
+    <w:p>
+      <w:pPr>
+        <w:spacing w:after="0"/>
+        <w:rPr>
+          <w:b/>
+          <w:bCs/>
+          <w:color w:val="EE0000"/>
+          <w:u w:val="single"/>
+        </w:rPr>
+      </w:pPr>
+      <w:r>
+        <w:rPr>
+          <w:b/>
+          <w:bCs/>
+          <w:color w:val="EE0000"/>
+          <w:u w:val="single"/>
+        </w:rPr>
+        <w:t>Prompt #3:</w:t>
+      </w:r>
+    </w:p>
+    <w:p>
+      <w:pPr>
+        <w:spacing w:after="0"/>
+      </w:pPr>
+      <w:r>
+        <w:t xml:space="preserve">Tell me how to remove the border line that appears at the bottom of the Approve request, </w:t>
+      </w:r>
+      <w:proofErr w:type="gramStart"/>
+      <w:r>
+        <w:t>Reject</w:t>
+      </w:r>
+      <w:proofErr w:type="gramEnd"/>
+      <w:r>
+        <w:t xml:space="preserve"> request, and View request icon buttons. Below is the Blazor markup code of the </w:t>
+      </w:r>
+      <w:proofErr w:type="spellStart"/>
+      <w:r>
+        <w:t>datagrid</w:t>
+      </w:r>
+      <w:proofErr w:type="spellEnd"/>
+      <w:r>
+        <w:t>.</w:t>
+      </w:r>
+    </w:p>
+    <w:p>
+      <w:pPr>
+        <w:spacing w:after="0"/>
+      </w:pPr>
+    </w:p>
+    <w:p>
+      <w:pPr>
+        <w:spacing w:after="0"/>
+      </w:pPr>
+      <w:r>
+        <w:t>&lt;</w:t>
+      </w:r>
+      <w:proofErr w:type="spellStart"/>
+      <w:r>
+        <w:rPr>
+          <w:b/>
+          <w:bCs/>
+        </w:rPr>
+        <w:t>MudDataGrid</w:t>
+      </w:r>
+      <w:proofErr w:type="spellEnd"/>
+      <w:r>
+        <w:t xml:space="preserve"> </w:t>
+      </w:r>
+      <w:r>
+        <w:rPr>
+          <w:b/>
+          <w:bCs/>
+        </w:rPr>
+        <w:t>T</w:t>
+      </w:r>
+      <w:r>
+        <w:t>="</w:t>
+      </w:r>
+      <w:proofErr w:type="spellStart"/>
+      <w:r>
+        <w:t>ApprovalRequestResultDTO</w:t>
+      </w:r>
+      <w:proofErr w:type="spellEnd"/>
+      <w:r>
+        <w:t xml:space="preserve">" </w:t>
+      </w:r>
+      <w:r>
+        <w:rPr>
+          <w:b/>
+          <w:bCs/>
+        </w:rPr>
+        <w:t>Items</w:t>
+      </w:r>
+      <w:r>
+        <w:t>="@_</w:t>
+      </w:r>
+      <w:proofErr w:type="spellStart"/>
+      <w:r>
+        <w:t>approvalList</w:t>
+      </w:r>
+      <w:proofErr w:type="spellEnd"/>
+      <w:r>
+        <w:t xml:space="preserve">" </w:t>
+      </w:r>
+      <w:r>
+        <w:rPr>
+          <w:b/>
+          <w:bCs/>
+        </w:rPr>
+        <w:t>Hover</w:t>
+      </w:r>
+      <w:r>
+        <w:t xml:space="preserve">="true" </w:t>
+      </w:r>
+      <w:r>
+        <w:rPr>
+          <w:b/>
+          <w:bCs/>
+        </w:rPr>
+        <w:t>Striped</w:t>
+      </w:r>
+      <w:r>
+        <w:t xml:space="preserve">="true" </w:t>
+      </w:r>
+      <w:r>
+        <w:rPr>
+          <w:b/>
+          <w:bCs/>
+        </w:rPr>
+        <w:t>Class</w:t>
+      </w:r>
+      <w:r>
+        <w:t>="</w:t>
+      </w:r>
+      <w:proofErr w:type="spellStart"/>
+      <w:r>
+        <w:t>pendingrequest</w:t>
+      </w:r>
+      <w:proofErr w:type="spellEnd"/>
+      <w:r>
+        <w:t>-grid"</w:t>
+      </w:r>
+    </w:p>
+    <w:p>
+      <w:pPr>
+        <w:spacing w:after="0"/>
+      </w:pPr>
+      <w:r>
+        <w:t xml:space="preserve">    </w:t>
+      </w:r>
+      <w:r>
+        <w:rPr>
+          <w:b/>
+          <w:bCs/>
+        </w:rPr>
+        <w:t>Filterable</w:t>
+      </w:r>
+      <w:r>
+        <w:t>="_</w:t>
+      </w:r>
+      <w:proofErr w:type="spellStart"/>
+      <w:r>
+        <w:t>enableFilter</w:t>
+      </w:r>
+      <w:proofErr w:type="spellEnd"/>
+      <w:r>
+        <w:t xml:space="preserve">" </w:t>
+      </w:r>
+      <w:proofErr w:type="spellStart"/>
+      <w:r>
+        <w:rPr>
+          <w:b/>
+          <w:bCs/>
+        </w:rPr>
+        <w:t>FilterMode</w:t>
+      </w:r>
+      <w:proofErr w:type="spellEnd"/>
+      <w:r>
+        <w:t>="@</w:t>
+      </w:r>
+      <w:proofErr w:type="spellStart"/>
+      <w:r>
+        <w:t>DataGridFilterMode.ColumnFilterMenu</w:t>
+      </w:r>
+      <w:proofErr w:type="spellEnd"/>
+      <w:r>
+        <w:t xml:space="preserve">" </w:t>
+      </w:r>
+      <w:r>
+        <w:rPr>
+          <w:b/>
+          <w:bCs/>
+        </w:rPr>
+        <w:t>FilterCaseSensitivity</w:t>
+      </w:r>
+      <w:r>
+        <w:t>="@DataGridFilterCaseSensitivity.CaseInsensitive"</w:t>
+      </w:r>
+    </w:p>
+    <w:p>
+      <w:pPr>
+        <w:spacing w:after="0"/>
+      </w:pPr>
+      <w:r>
+        <w:t xml:space="preserve">    </w:t>
+      </w:r>
+      <w:proofErr w:type="spellStart"/>
+      <w:r>
+        <w:rPr>
+          <w:b/>
+          <w:bCs/>
+        </w:rPr>
+        <w:t>QuickFilter</w:t>
+      </w:r>
+      <w:proofErr w:type="spellEnd"/>
+      <w:r>
+        <w:t>="@_</w:t>
+      </w:r>
+      <w:proofErr w:type="spellStart"/>
+      <w:r>
+        <w:t>quickFilter</w:t>
+      </w:r>
+      <w:proofErr w:type="spellEnd"/>
+      <w:r>
+        <w:t xml:space="preserve">" </w:t>
+      </w:r>
+      <w:proofErr w:type="spellStart"/>
+      <w:r>
+        <w:rPr>
+          <w:b/>
+          <w:bCs/>
+        </w:rPr>
+        <w:t>Hideable</w:t>
+      </w:r>
+      <w:proofErr w:type="spellEnd"/>
+      <w:r>
+        <w:t xml:space="preserve">="true" </w:t>
+      </w:r>
+      <w:proofErr w:type="spellStart"/>
+      <w:r>
+        <w:t>PageSize</w:t>
+      </w:r>
+      <w:proofErr w:type="spellEnd"/>
+      <w:r>
+        <w:t>="5"</w:t>
+      </w:r>
+    </w:p>
+    <w:p>
+      <w:pPr>
+        <w:spacing w:after="0"/>
+      </w:pPr>
+      <w:r>
+        <w:t xml:space="preserve">              </w:t>
+      </w:r>
+      <w:proofErr w:type="spellStart"/>
+      <w:r>
+        <w:rPr>
+          <w:b/>
+          <w:bCs/>
+        </w:rPr>
+        <w:t>EditTrigger</w:t>
+      </w:r>
+      <w:proofErr w:type="spellEnd"/>
+      <w:r>
+        <w:t>="</w:t>
+      </w:r>
+      <w:proofErr w:type="spellStart"/>
+      <w:r>
+        <w:t>DataGridEditTrigger.OnRowClick</w:t>
+      </w:r>
+      <w:proofErr w:type="spellEnd"/>
+      <w:r>
+        <w:t xml:space="preserve">" </w:t>
+      </w:r>
+      <w:proofErr w:type="spellStart"/>
+      <w:r>
+        <w:rPr>
+          <w:b/>
+          <w:bCs/>
+        </w:rPr>
+        <w:t>ReadOnly</w:t>
+      </w:r>
+      <w:proofErr w:type="spellEnd"/>
+      <w:r>
+        <w:t xml:space="preserve">="false" </w:t>
+      </w:r>
+      <w:proofErr w:type="spellStart"/>
+      <w:r>
+        <w:rPr>
+          <w:b/>
+          <w:bCs/>
+        </w:rPr>
+        <w:t>EditMode</w:t>
+      </w:r>
+      <w:proofErr w:type="spellEnd"/>
+      <w:r>
+        <w:t>="</w:t>
+      </w:r>
+      <w:proofErr w:type="spellStart"/>
+      <w:r>
+        <w:t>DataGridEditMode.Cell</w:t>
+      </w:r>
+      <w:proofErr w:type="spellEnd"/>
+      <w:r>
+        <w:t>"</w:t>
+      </w:r>
+    </w:p>
+    <w:p>
+      <w:pPr>
+        <w:spacing w:after="0"/>
+      </w:pPr>
+      <w:r>
+        <w:t xml:space="preserve">    </w:t>
+      </w:r>
+      <w:proofErr w:type="spellStart"/>
+      <w:r>
+        <w:rPr>
+          <w:b/>
+          <w:bCs/>
+        </w:rPr>
+        <w:t>EditDialogOptions</w:t>
+      </w:r>
+      <w:proofErr w:type="spellEnd"/>
+      <w:r>
+        <w:t xml:space="preserve">="new </w:t>
+      </w:r>
+      <w:proofErr w:type="spellStart"/>
+      <w:r>
+        <w:t>DialogOptions</w:t>
+      </w:r>
+      <w:proofErr w:type="spellEnd"/>
+      <w:r>
+        <w:t xml:space="preserve"> </w:t>
+      </w:r>
+    </w:p>
+    <w:p>
+      <w:pPr>
+        <w:spacing w:after="0"/>
+      </w:pPr>
+      <w:r>
+        <w:t xml:space="preserve">    { </w:t>
+      </w:r>
+    </w:p>
+    <w:p>
+      <w:pPr>
+        <w:spacing w:after="0"/>
+      </w:pPr>
+      <w:r>
+        <w:t xml:space="preserve">        </w:t>
+      </w:r>
+      <w:proofErr w:type="spellStart"/>
+      <w:r>
+        <w:t>MaxWidth</w:t>
+      </w:r>
+      <w:proofErr w:type="spellEnd"/>
+      <w:r>
+        <w:t xml:space="preserve"> = </w:t>
+      </w:r>
+      <w:proofErr w:type="spellStart"/>
+      <w:r>
+        <w:t>MaxWidth.Small</w:t>
+      </w:r>
+      <w:proofErr w:type="spellEnd"/>
+      <w:r>
+        <w:t xml:space="preserve">, </w:t>
+      </w:r>
+    </w:p>
+    <w:p>
+      <w:pPr>
+        <w:spacing w:after="0"/>
+      </w:pPr>
+      <w:r>
+        <w:t xml:space="preserve">        </w:t>
+      </w:r>
+      <w:proofErr w:type="spellStart"/>
+      <w:r>
+        <w:t>FullWidth</w:t>
+      </w:r>
+      <w:proofErr w:type="spellEnd"/>
+      <w:r>
+        <w:t xml:space="preserve"> = true,</w:t>
+      </w:r>
+    </w:p>
+    <w:p>
+      <w:pPr>
+        <w:spacing w:after="0"/>
+      </w:pPr>
+      <w:r>
+        <w:t xml:space="preserve">        </w:t>
+      </w:r>
+      <w:proofErr w:type="spellStart"/>
+      <w:r>
+        <w:t>BackdropClick</w:t>
+      </w:r>
+      <w:proofErr w:type="spellEnd"/>
+      <w:r>
+        <w:t xml:space="preserve"> = false,</w:t>
+      </w:r>
+    </w:p>
+    <w:p>
+      <w:pPr>
+        <w:spacing w:after="0"/>
+      </w:pPr>
+      <w:r>
+        <w:t xml:space="preserve">        </w:t>
+      </w:r>
+      <w:proofErr w:type="spellStart"/>
+      <w:r>
+        <w:t>CloseOnEscapeKey</w:t>
+      </w:r>
+      <w:proofErr w:type="spellEnd"/>
+      <w:r>
+        <w:t xml:space="preserve"> = false</w:t>
+      </w:r>
+    </w:p>
+    <w:p>
+      <w:pPr>
+        <w:spacing w:after="0"/>
+      </w:pPr>
+      <w:r>
+        <w:t xml:space="preserve">    }"</w:t>
+      </w:r>
+    </w:p>
+    <w:p>
+      <w:pPr>
+        <w:spacing w:after="0"/>
+      </w:pPr>
+      <w:r>
+        <w:t xml:space="preserve">    </w:t>
+      </w:r>
+      <w:proofErr w:type="spellStart"/>
+      <w:r>
+        <w:rPr>
+          <w:b/>
+          <w:bCs/>
+        </w:rPr>
+        <w:t>StartedEditingItem</w:t>
+      </w:r>
+      <w:proofErr w:type="spellEnd"/>
+      <w:r>
+        <w:t>="@</w:t>
+      </w:r>
+      <w:proofErr w:type="spellStart"/>
+      <w:r>
+        <w:t>StartedEditingItem</w:t>
+      </w:r>
+      <w:proofErr w:type="spellEnd"/>
+      <w:r>
+        <w:t xml:space="preserve">" </w:t>
+      </w:r>
+      <w:proofErr w:type="spellStart"/>
+      <w:r>
+        <w:rPr>
+          <w:b/>
+          <w:bCs/>
+        </w:rPr>
+        <w:t>CanceledEditingItem</w:t>
+      </w:r>
+      <w:proofErr w:type="spellEnd"/>
+      <w:r>
+        <w:t>="@</w:t>
+      </w:r>
+      <w:proofErr w:type="spellStart"/>
+      <w:r>
+        <w:t>CanceledEditingItem</w:t>
+      </w:r>
+      <w:proofErr w:type="spellEnd"/>
+      <w:r>
+        <w:t xml:space="preserve">" </w:t>
+      </w:r>
+      <w:proofErr w:type="spellStart"/>
+      <w:r>
+        <w:rPr>
+          <w:b/>
+          <w:bCs/>
+        </w:rPr>
+        <w:t>CommittedItemChanges</w:t>
+      </w:r>
+      <w:proofErr w:type="spellEnd"/>
+      <w:r>
+        <w:t>="@</w:t>
+      </w:r>
+      <w:proofErr w:type="spellStart"/>
+      <w:r>
+        <w:t>CommittedItemChanges</w:t>
+      </w:r>
+      <w:proofErr w:type="spellEnd"/>
+      <w:r>
+        <w:t>"</w:t>
+      </w:r>
+    </w:p>
+    <w:p>
+      <w:pPr>
+        <w:spacing w:after="0"/>
+      </w:pPr>
+      <w:r>
+        <w:t xml:space="preserve">    </w:t>
+      </w:r>
+      <w:proofErr w:type="spellStart"/>
+      <w:r>
+        <w:t>TableLayout</w:t>
+      </w:r>
+      <w:proofErr w:type="spellEnd"/>
+      <w:r>
+        <w:t>="</w:t>
+      </w:r>
+      <w:proofErr w:type="spellStart"/>
+      <w:r>
+        <w:t>TableLayout.Fixed</w:t>
+      </w:r>
+      <w:proofErr w:type="spellEnd"/>
+      <w:r>
+        <w:t xml:space="preserve">" </w:t>
+      </w:r>
+      <w:r>
+        <w:rPr>
+          <w:b/>
+          <w:bCs/>
+        </w:rPr>
+        <w:t>Bordered</w:t>
+      </w:r>
+      <w:r>
+        <w:t xml:space="preserve">="false" </w:t>
+      </w:r>
+      <w:r>
+        <w:rPr>
+          <w:b/>
+          <w:bCs/>
+        </w:rPr>
+        <w:t>Dense</w:t>
+      </w:r>
+      <w:r>
+        <w:t xml:space="preserve">="true" </w:t>
+      </w:r>
+      <w:proofErr w:type="spellStart"/>
+      <w:r>
+        <w:rPr>
+          <w:b/>
+          <w:bCs/>
+        </w:rPr>
+        <w:t>ColumnResizeMode</w:t>
+      </w:r>
+      <w:proofErr w:type="spellEnd"/>
+      <w:r>
+        <w:t>="</w:t>
+      </w:r>
+      <w:proofErr w:type="spellStart"/>
+      <w:r>
+        <w:t>ResizeMode.Column</w:t>
+      </w:r>
+      <w:proofErr w:type="spellEnd"/>
+      <w:r>
+        <w:t xml:space="preserve">" </w:t>
+      </w:r>
+      <w:proofErr w:type="spellStart"/>
+      <w:r>
+        <w:rPr>
+          <w:b/>
+          <w:bCs/>
+        </w:rPr>
+        <w:t>HorizontalScrollbar</w:t>
+      </w:r>
+      <w:proofErr w:type="spellEnd"/>
+      <w:r>
+        <w:t>="true"&gt;</w:t>
+      </w:r>
+    </w:p>
+    <w:p>
+      <w:pPr>
+        <w:spacing w:after="0"/>
+      </w:pPr>
+      <w:r>
+        <w:t xml:space="preserve">    &lt;</w:t>
+      </w:r>
+      <w:proofErr w:type="spellStart"/>
+      <w:r>
+        <w:rPr>
+          <w:b/>
+          <w:bCs/>
+        </w:rPr>
+        <w:t>ToolBarContent</w:t>
+      </w:r>
+      <w:proofErr w:type="spellEnd"/>
+      <w:r>
+        <w:t>&gt;</w:t>
+      </w:r>
+    </w:p>
+    <w:p>
+      <w:pPr>
+        <w:spacing w:after="0"/>
+      </w:pPr>
+      <w:r>
+        <w:t xml:space="preserve">        &lt;</w:t>
+      </w:r>
+      <w:proofErr w:type="spellStart"/>
+      <w:r>
+        <w:rPr>
+          <w:b/>
+          <w:bCs/>
+        </w:rPr>
+        <w:t>MudPaper</w:t>
+      </w:r>
+      <w:proofErr w:type="spellEnd"/>
+      <w:r>
+        <w:t xml:space="preserve"> </w:t>
+      </w:r>
+      <w:r>
+        <w:rPr>
+          <w:b/>
+          <w:bCs/>
+        </w:rPr>
+        <w:t>Class</w:t>
+      </w:r>
+      <w:r>
+        <w:t xml:space="preserve">="d-flex justify-content-start m-0 p-0" </w:t>
+      </w:r>
+      <w:r>
+        <w:rPr>
+          <w:b/>
+          <w:bCs/>
+        </w:rPr>
+        <w:t>Elevation</w:t>
+      </w:r>
+      <w:r>
+        <w:t>="0"&gt;</w:t>
+      </w:r>
+    </w:p>
+    <w:p>
+      <w:pPr>
+        <w:spacing w:after="0"/>
+      </w:pPr>
+      <w:r>
+        <w:t xml:space="preserve">            &lt;</w:t>
+      </w:r>
+      <w:proofErr w:type="spellStart"/>
+      <w:r>
+        <w:rPr>
+          <w:b/>
+          <w:bCs/>
+        </w:rPr>
+        <w:t>MudTextField</w:t>
+      </w:r>
+      <w:proofErr w:type="spellEnd"/>
+      <w:r>
+        <w:t xml:space="preserve"> @bind-Value="_searchString" </w:t>
+      </w:r>
+      <w:r>
+        <w:rPr>
+          <w:b/>
+          <w:bCs/>
+        </w:rPr>
+        <w:t>Placeholder</w:t>
+      </w:r>
+      <w:r>
+        <w:t xml:space="preserve">="Enter search string" </w:t>
+      </w:r>
+      <w:r>
+        <w:rPr>
+          <w:b/>
+          <w:bCs/>
+        </w:rPr>
+        <w:t>Adornment</w:t>
+      </w:r>
+      <w:r>
+        <w:t>="</w:t>
+      </w:r>
+      <w:proofErr w:type="spellStart"/>
+      <w:r>
+        <w:t>Adornment.Start</w:t>
+      </w:r>
+      <w:proofErr w:type="spellEnd"/>
+      <w:r>
+        <w:t>"</w:t>
+      </w:r>
+    </w:p>
+    <w:p>
+      <w:pPr>
+        <w:spacing w:after="0"/>
+      </w:pPr>
+      <w:r>
+        <w:t xml:space="preserve">                          </w:t>
+      </w:r>
+      <w:r>
+        <w:rPr>
+          <w:b/>
+          <w:bCs/>
+        </w:rPr>
+        <w:t>Immediate</w:t>
+      </w:r>
+      <w:r>
+        <w:t xml:space="preserve">="true" </w:t>
+      </w:r>
+      <w:r>
+        <w:rPr>
+          <w:b/>
+          <w:bCs/>
+        </w:rPr>
+        <w:t>Style</w:t>
+      </w:r>
+      <w:r>
+        <w:t xml:space="preserve">="width:400px;" </w:t>
+      </w:r>
+      <w:r>
+        <w:rPr>
+          <w:b/>
+          <w:bCs/>
+        </w:rPr>
+        <w:t>Typo</w:t>
+      </w:r>
+      <w:r>
+        <w:t>="Typo.subtitle1"</w:t>
+      </w:r>
+    </w:p>
+    <w:p>
+      <w:pPr>
+        <w:spacing w:after="0"/>
+      </w:pPr>
+      <w:r>
+        <w:t xml:space="preserve">                          </w:t>
+      </w:r>
+      <w:proofErr w:type="spellStart"/>
+      <w:r>
+        <w:rPr>
+          <w:b/>
+          <w:bCs/>
+        </w:rPr>
+        <w:t>AdornmentIcon</w:t>
+      </w:r>
+      <w:proofErr w:type="spellEnd"/>
+      <w:r>
+        <w:t>="@</w:t>
+      </w:r>
+      <w:proofErr w:type="spellStart"/>
+      <w:proofErr w:type="gramStart"/>
+      <w:r>
+        <w:t>Icons.Material.Filled.Search</w:t>
+      </w:r>
+      <w:proofErr w:type="spellEnd"/>
+      <w:proofErr w:type="gramEnd"/>
+      <w:r>
+        <w:t xml:space="preserve">" </w:t>
+      </w:r>
+      <w:proofErr w:type="spellStart"/>
+      <w:r>
+        <w:rPr>
+          <w:b/>
+          <w:bCs/>
+        </w:rPr>
+        <w:t>IconSize</w:t>
+      </w:r>
+      <w:proofErr w:type="spellEnd"/>
+      <w:r>
+        <w:t>="</w:t>
+      </w:r>
+      <w:proofErr w:type="spellStart"/>
+      <w:r>
+        <w:t>Size.Small</w:t>
+      </w:r>
+      <w:proofErr w:type="spellEnd"/>
+      <w:r>
+        <w:t xml:space="preserve">" </w:t>
+      </w:r>
+      <w:r>
+        <w:rPr>
+          <w:b/>
+          <w:bCs/>
+        </w:rPr>
+        <w:t>Class</w:t>
+      </w:r>
+      <w:r>
+        <w:t>="mt-0"&gt;</w:t>
+      </w:r>
+    </w:p>
+    <w:p>
+      <w:pPr>
+        <w:spacing w:after="0"/>
+      </w:pPr>
+      <w:r>
+        <w:t xml:space="preserve">            &lt;/</w:t>
+      </w:r>
+      <w:proofErr w:type="spellStart"/>
+      <w:r>
+        <w:rPr>
+          <w:b/>
+          <w:bCs/>
+        </w:rPr>
+        <w:t>MudTextField</w:t>
+      </w:r>
+      <w:proofErr w:type="spellEnd"/>
+      <w:r>
+        <w:t>&gt;</w:t>
+      </w:r>
+    </w:p>
+    <w:p>
+      <w:pPr>
+        <w:spacing w:after="0"/>
+      </w:pPr>
+      <w:r>
+        <w:t xml:space="preserve">        &lt;/</w:t>
+      </w:r>
+      <w:proofErr w:type="spellStart"/>
+      <w:r>
+        <w:rPr>
+          <w:b/>
+          <w:bCs/>
+        </w:rPr>
+        <w:t>MudPaper</w:t>
+      </w:r>
+      <w:proofErr w:type="spellEnd"/>
+      <w:r>
+        <w:t>&gt;</w:t>
+      </w:r>
+    </w:p>
+    <w:p>
+      <w:pPr>
+        <w:spacing w:after="0"/>
+      </w:pPr>
+      <w:r>
+        <w:t xml:space="preserve">        &lt;</w:t>
+      </w:r>
+      <w:proofErr w:type="spellStart"/>
+      <w:r>
+        <w:rPr>
+          <w:b/>
+          <w:bCs/>
+        </w:rPr>
+        <w:t>MudSpacer</w:t>
+      </w:r>
+      <w:proofErr w:type="spellEnd"/>
+      <w:r>
+        <w:t xml:space="preserve"> /&gt;</w:t>
+      </w:r>
+    </w:p>
+    <w:p>
+      <w:pPr>
+        <w:spacing w:after="0"/>
+      </w:pPr>
+      <w:r>
+        <w:t xml:space="preserve">        &lt;</w:t>
+      </w:r>
+      <w:proofErr w:type="spellStart"/>
+      <w:r>
+        <w:rPr>
+          <w:b/>
+          <w:bCs/>
+        </w:rPr>
+        <w:t>MudPaper</w:t>
+      </w:r>
+      <w:proofErr w:type="spellEnd"/>
+      <w:r>
+        <w:t xml:space="preserve"> </w:t>
+      </w:r>
+      <w:r>
+        <w:rPr>
+          <w:b/>
+          <w:bCs/>
+        </w:rPr>
+        <w:t>Class</w:t>
+      </w:r>
+      <w:r>
+        <w:t xml:space="preserve">="d-flex justify-content-end m-0 p-0" </w:t>
+      </w:r>
+      <w:r>
+        <w:rPr>
+          <w:b/>
+          <w:bCs/>
+        </w:rPr>
+        <w:t>Elevation</w:t>
+      </w:r>
+      <w:r>
+        <w:t>="0"&gt;</w:t>
+      </w:r>
+    </w:p>
+    <w:p>
+      <w:pPr>
+        <w:spacing w:after="0"/>
+      </w:pPr>
+      <w:r>
+        <w:t xml:space="preserve">            &lt;</w:t>
+      </w:r>
+      <w:proofErr w:type="spellStart"/>
+      <w:r>
+        <w:rPr>
+          <w:b/>
+          <w:bCs/>
+        </w:rPr>
+        <w:t>MudSwitch</w:t>
+      </w:r>
+      <w:proofErr w:type="spellEnd"/>
+      <w:r>
+        <w:t xml:space="preserve"> @bind-Value="_enableFilter" </w:t>
+      </w:r>
+      <w:proofErr w:type="spellStart"/>
+      <w:r>
+        <w:rPr>
+          <w:b/>
+          <w:bCs/>
+        </w:rPr>
+        <w:t>ThumbIcon</w:t>
+      </w:r>
+      <w:proofErr w:type="spellEnd"/>
+      <w:r>
+        <w:t>="</w:t>
+      </w:r>
+      <w:proofErr w:type="gramStart"/>
+      <w:r>
+        <w:t>@(</w:t>
+      </w:r>
+      <w:proofErr w:type="gramEnd"/>
+      <w:r>
+        <w:t>_</w:t>
+      </w:r>
+      <w:proofErr w:type="spellStart"/>
+      <w:r>
+        <w:t>enableFilter</w:t>
+      </w:r>
+      <w:proofErr w:type="spellEnd"/>
+      <w:r>
+        <w:t>==</w:t>
+      </w:r>
+      <w:proofErr w:type="gramStart"/>
+      <w:r>
+        <w:t>true ?</w:t>
+      </w:r>
+      <w:proofErr w:type="gramEnd"/>
+      <w:r>
+        <w:t xml:space="preserve"> </w:t>
+      </w:r>
+      <w:proofErr w:type="spellStart"/>
+      <w:proofErr w:type="gramStart"/>
+      <w:r>
+        <w:t>Icons.Material.Filled.Done</w:t>
+      </w:r>
+      <w:proofErr w:type="spellEnd"/>
+      <w:proofErr w:type="gramEnd"/>
+      <w:r>
+        <w:t xml:space="preserve"> : </w:t>
+      </w:r>
+      <w:proofErr w:type="spellStart"/>
+      <w:proofErr w:type="gramStart"/>
+      <w:r>
+        <w:t>Icons.Material.Filled.Close</w:t>
+      </w:r>
+      <w:proofErr w:type="spellEnd"/>
+      <w:proofErr w:type="gramEnd"/>
+      <w:r>
+        <w:t xml:space="preserve">)" </w:t>
+      </w:r>
+      <w:proofErr w:type="spellStart"/>
+      <w:r>
+        <w:rPr>
+          <w:b/>
+          <w:bCs/>
+        </w:rPr>
+        <w:t>ThumbIconColor</w:t>
+      </w:r>
+      <w:proofErr w:type="spellEnd"/>
+      <w:r>
+        <w:t>="</w:t>
+      </w:r>
+      <w:proofErr w:type="gramStart"/>
+      <w:r>
+        <w:t>@(</w:t>
+      </w:r>
+      <w:proofErr w:type="gramEnd"/>
+      <w:r>
+        <w:t>_</w:t>
+      </w:r>
+      <w:proofErr w:type="spellStart"/>
+      <w:r>
+        <w:t>enableFilter</w:t>
+      </w:r>
+      <w:proofErr w:type="spellEnd"/>
+      <w:r>
+        <w:t>==</w:t>
+      </w:r>
+      <w:proofErr w:type="gramStart"/>
+      <w:r>
+        <w:t>true ?</w:t>
+      </w:r>
+      <w:proofErr w:type="gramEnd"/>
+      <w:r>
+        <w:t xml:space="preserve"> </w:t>
+      </w:r>
+      <w:proofErr w:type="spellStart"/>
+      <w:proofErr w:type="gramStart"/>
+      <w:r>
+        <w:t>Color.Success</w:t>
+      </w:r>
+      <w:proofErr w:type="spellEnd"/>
+      <w:r>
+        <w:t xml:space="preserve"> :</w:t>
+      </w:r>
+      <w:proofErr w:type="gramEnd"/>
+      <w:r>
+        <w:t xml:space="preserve"> </w:t>
+      </w:r>
+      <w:proofErr w:type="spellStart"/>
+      <w:r>
+        <w:t>Color.Error</w:t>
+      </w:r>
+      <w:proofErr w:type="spellEnd"/>
+      <w:r>
+        <w:t>)"&gt;Custom Filter&lt;/</w:t>
+      </w:r>
+      <w:proofErr w:type="spellStart"/>
+      <w:r>
+        <w:rPr>
+          <w:b/>
+          <w:bCs/>
+        </w:rPr>
+        <w:t>MudSwitch</w:t>
+      </w:r>
+      <w:proofErr w:type="spellEnd"/>
+      <w:r>
+        <w:t>&gt;</w:t>
+      </w:r>
+    </w:p>
+    <w:p>
+      <w:pPr>
+        <w:spacing w:after="0"/>
+      </w:pPr>
+      <w:r>
+        <w:lastRenderedPageBreak/>
+        <w:t xml:space="preserve">            @* &lt;</w:t>
+      </w:r>
+      <w:proofErr w:type="spellStart"/>
+      <w:r>
+        <w:t>MudPaper</w:t>
+      </w:r>
+      <w:proofErr w:type="spellEnd"/>
+      <w:r>
+        <w:t xml:space="preserve"> Class="ms-3" Elevation="0"&gt;</w:t>
+      </w:r>
+    </w:p>
+    <w:p>
+      <w:pPr>
+        <w:spacing w:after="0"/>
+      </w:pPr>
+      <w:r>
+        <w:t xml:space="preserve">                &lt;</w:t>
+      </w:r>
+      <w:proofErr w:type="spellStart"/>
+      <w:r>
+        <w:t>MudFab</w:t>
+      </w:r>
+      <w:proofErr w:type="spellEnd"/>
+      <w:r>
+        <w:t xml:space="preserve"> Color="</w:t>
+      </w:r>
+      <w:proofErr w:type="spellStart"/>
+      <w:r>
+        <w:t>Color.Info</w:t>
+      </w:r>
+      <w:proofErr w:type="spellEnd"/>
+      <w:r>
+        <w:t xml:space="preserve">" </w:t>
+      </w:r>
+      <w:proofErr w:type="spellStart"/>
+      <w:r>
+        <w:t>StartIcon</w:t>
+      </w:r>
+      <w:proofErr w:type="spellEnd"/>
+      <w:r>
+        <w:t>="@</w:t>
+      </w:r>
+      <w:proofErr w:type="spellStart"/>
+      <w:proofErr w:type="gramStart"/>
+      <w:r>
+        <w:t>Icons.Material.Filled.Add</w:t>
+      </w:r>
+      <w:proofErr w:type="spellEnd"/>
+      <w:proofErr w:type="gramEnd"/>
+      <w:r>
+        <w:t>" Size="</w:t>
+      </w:r>
+      <w:proofErr w:type="spellStart"/>
+      <w:r>
+        <w:t>Size.Small</w:t>
+      </w:r>
+      <w:proofErr w:type="spellEnd"/>
+      <w:r>
+        <w:t>" title="Add new leave request" /&gt;</w:t>
+      </w:r>
+    </w:p>
+    <w:p>
+      <w:pPr>
+        <w:spacing w:after="0"/>
+      </w:pPr>
+      <w:r>
+        <w:t xml:space="preserve">            &lt;/</w:t>
+      </w:r>
+      <w:proofErr w:type="spellStart"/>
+      <w:r>
+        <w:t>MudPaper</w:t>
+      </w:r>
+      <w:proofErr w:type="spellEnd"/>
+      <w:r>
+        <w:t>&gt; *@</w:t>
+      </w:r>
+    </w:p>
+    <w:p>
+      <w:pPr>
+        <w:spacing w:after="0"/>
+      </w:pPr>
+      <w:r>
+        <w:t xml:space="preserve">        &lt;/</w:t>
+      </w:r>
+      <w:proofErr w:type="spellStart"/>
+      <w:r>
+        <w:rPr>
+          <w:b/>
+          <w:bCs/>
+        </w:rPr>
+        <w:t>MudPaper</w:t>
+      </w:r>
+      <w:proofErr w:type="spellEnd"/>
+      <w:r>
+        <w:t>&gt;</w:t>
+      </w:r>
+    </w:p>
+    <w:p>
+      <w:pPr>
+        <w:spacing w:after="0"/>
+      </w:pPr>
+      <w:r>
+        <w:t xml:space="preserve">    &lt;/</w:t>
+      </w:r>
+      <w:proofErr w:type="spellStart"/>
+      <w:r>
+        <w:rPr>
+          <w:b/>
+          <w:bCs/>
+        </w:rPr>
+        <w:t>ToolBarContent</w:t>
+      </w:r>
+      <w:proofErr w:type="spellEnd"/>
+      <w:r>
+        <w:t>&gt;</w:t>
+      </w:r>
+    </w:p>
+    <w:p>
+      <w:pPr>
+        <w:spacing w:after="0"/>
+      </w:pPr>
+      <w:r>
+        <w:t xml:space="preserve">    &lt;</w:t>
+      </w:r>
+      <w:r>
+        <w:rPr>
+          <w:b/>
+          <w:bCs/>
+        </w:rPr>
+        <w:t>Columns</w:t>
+      </w:r>
+      <w:r>
+        <w:t>&gt;</w:t>
+      </w:r>
+    </w:p>
+    <w:p>
+      <w:pPr>
+        <w:spacing w:after="0"/>
+      </w:pPr>
+      <w:r>
+        <w:t xml:space="preserve">         &lt;</w:t>
+      </w:r>
+      <w:proofErr w:type="spellStart"/>
+      <w:r>
+        <w:rPr>
+          <w:b/>
+          <w:bCs/>
+        </w:rPr>
+        <w:t>PropertyColumn</w:t>
+      </w:r>
+      <w:proofErr w:type="spellEnd"/>
+      <w:r>
+        <w:t xml:space="preserve"> </w:t>
+      </w:r>
+      <w:r>
+        <w:rPr>
+          <w:b/>
+          <w:bCs/>
+        </w:rPr>
+        <w:t>Property</w:t>
+      </w:r>
+      <w:r>
+        <w:t xml:space="preserve">="x =&gt; </w:t>
+      </w:r>
+      <w:proofErr w:type="spellStart"/>
+      <w:proofErr w:type="gramStart"/>
+      <w:r>
+        <w:t>x.RequestTypeCode</w:t>
+      </w:r>
+      <w:proofErr w:type="spellEnd"/>
+      <w:proofErr w:type="gramEnd"/>
+      <w:r>
+        <w:t xml:space="preserve">" </w:t>
+      </w:r>
+      <w:r>
+        <w:rPr>
+          <w:b/>
+          <w:bCs/>
+        </w:rPr>
+        <w:t>Hidden</w:t>
+      </w:r>
+      <w:r>
+        <w:t xml:space="preserve"> </w:t>
+      </w:r>
+      <w:r>
+        <w:rPr>
+          <w:b/>
+          <w:bCs/>
+        </w:rPr>
+        <w:t>Editable</w:t>
+      </w:r>
+      <w:r>
+        <w:t>="false"&gt;</w:t>
+      </w:r>
+    </w:p>
+    <w:p>
+      <w:pPr>
+        <w:spacing w:after="0"/>
+      </w:pPr>
+      <w:r>
+        <w:t xml:space="preserve">             &lt;</w:t>
+      </w:r>
+      <w:proofErr w:type="spellStart"/>
+      <w:r>
+        <w:rPr>
+          <w:b/>
+          <w:bCs/>
+        </w:rPr>
+        <w:t>EditTemplate</w:t>
+      </w:r>
+      <w:proofErr w:type="spellEnd"/>
+      <w:r>
+        <w:t>&gt;</w:t>
+      </w:r>
+    </w:p>
+    <w:p>
+      <w:pPr>
+        <w:spacing w:after="0"/>
+      </w:pPr>
+      <w:r>
+        <w:t xml:space="preserve">                 @* Empty to prevent rendering *@</w:t>
+      </w:r>
+    </w:p>
+    <w:p>
+      <w:pPr>
+        <w:spacing w:after="0"/>
+      </w:pPr>
+      <w:r>
+        <w:t xml:space="preserve">             &lt;/</w:t>
+      </w:r>
+      <w:proofErr w:type="spellStart"/>
+      <w:r>
+        <w:rPr>
+          <w:b/>
+          <w:bCs/>
+        </w:rPr>
+        <w:t>EditTemplate</w:t>
+      </w:r>
+      <w:proofErr w:type="spellEnd"/>
+      <w:r>
+        <w:t>&gt;</w:t>
+      </w:r>
+    </w:p>
+    <w:p>
+      <w:pPr>
+        <w:spacing w:after="0"/>
+      </w:pPr>
+      <w:r>
+        <w:t xml:space="preserve">        &lt;/</w:t>
+      </w:r>
+      <w:proofErr w:type="spellStart"/>
+      <w:r>
+        <w:rPr>
+          <w:b/>
+          <w:bCs/>
+        </w:rPr>
+        <w:t>PropertyColumn</w:t>
+      </w:r>
+      <w:proofErr w:type="spellEnd"/>
+      <w:r>
+        <w:t>&gt;</w:t>
+      </w:r>
+    </w:p>
+    <w:p>
+      <w:pPr>
+        <w:spacing w:after="0"/>
+      </w:pPr>
+      <w:r>
+        <w:t xml:space="preserve">         &lt;</w:t>
+      </w:r>
+      <w:proofErr w:type="spellStart"/>
+      <w:r>
+        <w:rPr>
+          <w:b/>
+          <w:bCs/>
+        </w:rPr>
+        <w:t>PropertyColumn</w:t>
+      </w:r>
+      <w:proofErr w:type="spellEnd"/>
+      <w:r>
+        <w:t xml:space="preserve"> </w:t>
+      </w:r>
+      <w:r>
+        <w:rPr>
+          <w:b/>
+          <w:bCs/>
+        </w:rPr>
+        <w:t>Property</w:t>
+      </w:r>
+      <w:r>
+        <w:t xml:space="preserve">="x =&gt; </w:t>
+      </w:r>
+      <w:proofErr w:type="spellStart"/>
+      <w:proofErr w:type="gramStart"/>
+      <w:r>
+        <w:t>x.StepInstanceId</w:t>
+      </w:r>
+      <w:proofErr w:type="spellEnd"/>
+      <w:proofErr w:type="gramEnd"/>
+      <w:r>
+        <w:t xml:space="preserve">" </w:t>
+      </w:r>
+      <w:r>
+        <w:rPr>
+          <w:b/>
+          <w:bCs/>
+        </w:rPr>
+        <w:t>Hidden</w:t>
+      </w:r>
+      <w:r>
+        <w:t xml:space="preserve"> </w:t>
+      </w:r>
+      <w:r>
+        <w:rPr>
+          <w:b/>
+          <w:bCs/>
+        </w:rPr>
+        <w:t>Editable</w:t>
+      </w:r>
+      <w:r>
+        <w:t>="false"&gt;</w:t>
+      </w:r>
+    </w:p>
+    <w:p>
+      <w:pPr>
+        <w:spacing w:after="0"/>
+      </w:pPr>
+      <w:r>
+        <w:t xml:space="preserve">             &lt;</w:t>
+      </w:r>
+      <w:proofErr w:type="spellStart"/>
+      <w:r>
+        <w:rPr>
+          <w:b/>
+          <w:bCs/>
+        </w:rPr>
+        <w:t>EditTemplate</w:t>
+      </w:r>
+      <w:proofErr w:type="spellEnd"/>
+      <w:r>
+        <w:t>&gt;</w:t>
+      </w:r>
+    </w:p>
+    <w:p>
+      <w:pPr>
+        <w:spacing w:after="0"/>
+      </w:pPr>
+      <w:r>
+        <w:t xml:space="preserve">                 @* Empty to prevent rendering *@</w:t>
+      </w:r>
+    </w:p>
+    <w:p>
+      <w:pPr>
+        <w:spacing w:after="0"/>
+      </w:pPr>
+      <w:r>
+        <w:t xml:space="preserve">             &lt;/</w:t>
+      </w:r>
+      <w:proofErr w:type="spellStart"/>
+      <w:r>
+        <w:rPr>
+          <w:b/>
+          <w:bCs/>
+        </w:rPr>
+        <w:t>EditTemplate</w:t>
+      </w:r>
+      <w:proofErr w:type="spellEnd"/>
+      <w:r>
+        <w:t>&gt;</w:t>
+      </w:r>
+    </w:p>
+    <w:p>
+      <w:pPr>
+        <w:spacing w:after="0"/>
+      </w:pPr>
+      <w:r>
+        <w:t xml:space="preserve">         &lt;/</w:t>
+      </w:r>
+      <w:proofErr w:type="spellStart"/>
+      <w:r>
+        <w:rPr>
+          <w:b/>
+          <w:bCs/>
+        </w:rPr>
+        <w:t>PropertyColumn</w:t>
+      </w:r>
+      <w:proofErr w:type="spellEnd"/>
+      <w:r>
+        <w:t>&gt;</w:t>
+      </w:r>
+    </w:p>
+    <w:p>
+      <w:pPr>
+        <w:spacing w:after="0"/>
+      </w:pPr>
+      <w:r>
+        <w:t xml:space="preserve">        &lt;</w:t>
+      </w:r>
+      <w:proofErr w:type="spellStart"/>
+      <w:r>
+        <w:rPr>
+          <w:b/>
+          <w:bCs/>
+        </w:rPr>
+        <w:t>PropertyColumn</w:t>
+      </w:r>
+      <w:proofErr w:type="spellEnd"/>
+      <w:r>
+        <w:t xml:space="preserve"> </w:t>
+      </w:r>
+      <w:r>
+        <w:rPr>
+          <w:b/>
+          <w:bCs/>
+        </w:rPr>
+        <w:t>Property</w:t>
+      </w:r>
+      <w:r>
+        <w:t xml:space="preserve">="x =&gt; </w:t>
+      </w:r>
+      <w:proofErr w:type="spellStart"/>
+      <w:proofErr w:type="gramStart"/>
+      <w:r>
+        <w:t>x.RequestNo</w:t>
+      </w:r>
+      <w:proofErr w:type="spellEnd"/>
+      <w:proofErr w:type="gramEnd"/>
+      <w:r>
+        <w:t xml:space="preserve">" </w:t>
+      </w:r>
+      <w:r>
+        <w:rPr>
+          <w:b/>
+          <w:bCs/>
+        </w:rPr>
+        <w:t>Title</w:t>
+      </w:r>
+      <w:r>
+        <w:t xml:space="preserve">="Request No." </w:t>
+      </w:r>
+      <w:r>
+        <w:rPr>
+          <w:b/>
+          <w:bCs/>
+        </w:rPr>
+        <w:t>Class</w:t>
+      </w:r>
+      <w:r>
+        <w:t>="col-</w:t>
+      </w:r>
+      <w:proofErr w:type="spellStart"/>
+      <w:r>
+        <w:t>RequestNo</w:t>
+      </w:r>
+      <w:proofErr w:type="spellEnd"/>
+      <w:r>
+        <w:t>"</w:t>
+      </w:r>
+    </w:p>
+    <w:p>
+      <w:pPr>
+        <w:spacing w:after="0"/>
+      </w:pPr>
+      <w:r>
+        <w:t xml:space="preserve">            </w:t>
+      </w:r>
+      <w:r>
+        <w:rPr>
+          <w:b/>
+          <w:bCs/>
+        </w:rPr>
+        <w:t>StickyLeft</w:t>
+      </w:r>
+      <w:r>
+        <w:t xml:space="preserve">="true" </w:t>
+      </w:r>
+      <w:r>
+        <w:rPr>
+          <w:b/>
+          <w:bCs/>
+        </w:rPr>
+        <w:t>Editable</w:t>
+      </w:r>
+      <w:r>
+        <w:t>="false"&gt;</w:t>
+      </w:r>
+    </w:p>
+    <w:p>
+      <w:pPr>
+        <w:spacing w:after="0"/>
+      </w:pPr>
+      <w:r>
+        <w:t xml:space="preserve">            &lt;</w:t>
+      </w:r>
+      <w:proofErr w:type="spellStart"/>
+      <w:r>
+        <w:rPr>
+          <w:b/>
+          <w:bCs/>
+        </w:rPr>
+        <w:t>CellTemplate</w:t>
+      </w:r>
+      <w:proofErr w:type="spellEnd"/>
+      <w:r>
+        <w:t xml:space="preserve"> </w:t>
+      </w:r>
+      <w:r>
+        <w:rPr>
+          <w:b/>
+          <w:bCs/>
+        </w:rPr>
+        <w:t>Context</w:t>
+      </w:r>
+      <w:r>
+        <w:t>="row"&gt;</w:t>
+      </w:r>
+    </w:p>
+    <w:p>
+      <w:pPr>
+        <w:spacing w:after="0"/>
+      </w:pPr>
+      <w:r>
+        <w:t xml:space="preserve">                &lt;</w:t>
+      </w:r>
+      <w:proofErr w:type="spellStart"/>
+      <w:r>
+        <w:rPr>
+          <w:b/>
+          <w:bCs/>
+        </w:rPr>
+        <w:t>MudChip</w:t>
+      </w:r>
+      <w:proofErr w:type="spellEnd"/>
+      <w:r>
+        <w:t xml:space="preserve"> </w:t>
+      </w:r>
+      <w:r>
+        <w:rPr>
+          <w:b/>
+          <w:bCs/>
+        </w:rPr>
+        <w:t>T</w:t>
+      </w:r>
+      <w:r>
+        <w:t>="long"</w:t>
+      </w:r>
+    </w:p>
+    <w:p>
+      <w:pPr>
+        <w:spacing w:after="0"/>
+      </w:pPr>
+      <w:r>
+        <w:t xml:space="preserve">                         </w:t>
+      </w:r>
+      <w:r>
+        <w:rPr>
+          <w:b/>
+          <w:bCs/>
+        </w:rPr>
+        <w:t>Size</w:t>
+      </w:r>
+      <w:r>
+        <w:t>=</w:t>
+      </w:r>
+      <w:proofErr w:type="spellStart"/>
+      <w:r>
+        <w:t>Size.Small</w:t>
+      </w:r>
+      <w:proofErr w:type="spellEnd"/>
+    </w:p>
+    <w:p>
+      <w:pPr>
+        <w:spacing w:after="0"/>
+      </w:pPr>
+      <w:r>
+        <w:t xml:space="preserve">                         </w:t>
+      </w:r>
+      <w:r>
+        <w:rPr>
+          <w:b/>
+          <w:bCs/>
+        </w:rPr>
+        <w:t>Color</w:t>
+      </w:r>
+      <w:r>
+        <w:t>="</w:t>
+      </w:r>
+      <w:proofErr w:type="spellStart"/>
+      <w:r>
+        <w:t>Color.Info</w:t>
+      </w:r>
+      <w:proofErr w:type="spellEnd"/>
+      <w:r>
+        <w:t>"</w:t>
+      </w:r>
+    </w:p>
+    <w:p>
+      <w:pPr>
+        <w:spacing w:after="0"/>
+      </w:pPr>
+      <w:r>
+        <w:t xml:space="preserve">                         </w:t>
+      </w:r>
+      <w:r>
+        <w:rPr>
+          <w:b/>
+          <w:bCs/>
+        </w:rPr>
+        <w:t>Label</w:t>
+      </w:r>
+      <w:r>
+        <w:t>="true"</w:t>
+      </w:r>
+    </w:p>
+    <w:p>
+      <w:pPr>
+        <w:spacing w:after="0"/>
+      </w:pPr>
+      <w:r>
+        <w:t xml:space="preserve">                         </w:t>
+      </w:r>
+      <w:r>
+        <w:rPr>
+          <w:b/>
+          <w:bCs/>
+        </w:rPr>
+        <w:t>Class</w:t>
+      </w:r>
+      <w:r>
+        <w:t>="</w:t>
+      </w:r>
+      <w:proofErr w:type="spellStart"/>
+      <w:r>
+        <w:t>fw</w:t>
+      </w:r>
+      <w:proofErr w:type="spellEnd"/>
+      <w:r>
+        <w:t>-bold"</w:t>
+      </w:r>
+    </w:p>
+    <w:p>
+      <w:pPr>
+        <w:spacing w:after="0"/>
+      </w:pPr>
+      <w:r>
+        <w:t xml:space="preserve">                         </w:t>
+      </w:r>
+      <w:r>
+        <w:rPr>
+          <w:b/>
+          <w:bCs/>
+        </w:rPr>
+        <w:t>Style</w:t>
+      </w:r>
+      <w:r>
+        <w:t>="font-size: 14px;"</w:t>
+      </w:r>
+    </w:p>
+    <w:p>
+      <w:pPr>
+        <w:spacing w:after="0"/>
+      </w:pPr>
+      <w:r>
+        <w:t xml:space="preserve">                         </w:t>
+      </w:r>
+      <w:proofErr w:type="spellStart"/>
+      <w:r>
+        <w:rPr>
+          <w:b/>
+          <w:bCs/>
+        </w:rPr>
+        <w:t>OnClick</w:t>
+      </w:r>
+      <w:proofErr w:type="spellEnd"/>
+      <w:r>
+        <w:t>="@(</w:t>
+      </w:r>
+      <w:proofErr w:type="gramStart"/>
+      <w:r>
+        <w:t>()=</w:t>
+      </w:r>
+      <w:proofErr w:type="gramEnd"/>
+      <w:r>
+        <w:t>&gt;</w:t>
+      </w:r>
+      <w:proofErr w:type="spellStart"/>
+      <w:r>
+        <w:t>OpenLeaveRequest</w:t>
+      </w:r>
+      <w:proofErr w:type="spellEnd"/>
+      <w:r>
+        <w:t>(</w:t>
+      </w:r>
+      <w:proofErr w:type="spellStart"/>
+      <w:proofErr w:type="gramStart"/>
+      <w:r>
+        <w:t>row.Item</w:t>
+      </w:r>
+      <w:proofErr w:type="spellEnd"/>
+      <w:proofErr w:type="gramEnd"/>
+      <w:r>
+        <w:t>))"&gt;</w:t>
+      </w:r>
+    </w:p>
+    <w:p>
+      <w:pPr>
+        <w:spacing w:after="0"/>
+      </w:pPr>
+      <w:r>
+        <w:t xml:space="preserve">                    @</w:t>
+      </w:r>
+      <w:proofErr w:type="gramStart"/>
+      <w:r>
+        <w:t>row.Item.RequestNo</w:t>
+      </w:r>
+      <w:proofErr w:type="gramEnd"/>
+    </w:p>
+    <w:p>
+      <w:pPr>
+        <w:spacing w:after="0"/>
+      </w:pPr>
+      <w:r>
+        <w:t xml:space="preserve">                &lt;/</w:t>
+      </w:r>
+      <w:proofErr w:type="spellStart"/>
+      <w:r>
+        <w:rPr>
+          <w:b/>
+          <w:bCs/>
+        </w:rPr>
+        <w:t>MudChip</w:t>
+      </w:r>
+      <w:proofErr w:type="spellEnd"/>
+      <w:r>
+        <w:t>&gt;</w:t>
+      </w:r>
+    </w:p>
+    <w:p>
+      <w:pPr>
+        <w:spacing w:after="0"/>
+      </w:pPr>
+      <w:r>
+        <w:t xml:space="preserve">            &lt;/</w:t>
+      </w:r>
+      <w:proofErr w:type="spellStart"/>
+      <w:r>
+        <w:rPr>
+          <w:b/>
+          <w:bCs/>
+        </w:rPr>
+        <w:t>CellTemplate</w:t>
+      </w:r>
+      <w:proofErr w:type="spellEnd"/>
+      <w:r>
+        <w:t>&gt;</w:t>
+      </w:r>
+    </w:p>
+    <w:p>
+      <w:pPr>
+        <w:spacing w:after="0"/>
+      </w:pPr>
+      <w:r>
+        <w:t xml:space="preserve">        &lt;/</w:t>
+      </w:r>
+      <w:proofErr w:type="spellStart"/>
+      <w:r>
+        <w:rPr>
+          <w:b/>
+          <w:bCs/>
+        </w:rPr>
+        <w:t>PropertyColumn</w:t>
+      </w:r>
+      <w:proofErr w:type="spellEnd"/>
+      <w:r>
+        <w:t>&gt;</w:t>
+      </w:r>
+    </w:p>
+    <w:p>
+      <w:pPr>
+        <w:spacing w:after="0"/>
+      </w:pPr>
+      <w:r>
+        <w:t xml:space="preserve">        &lt;</w:t>
+      </w:r>
+      <w:proofErr w:type="spellStart"/>
+      <w:r>
+        <w:rPr>
+          <w:b/>
+          <w:bCs/>
+        </w:rPr>
+        <w:t>PropertyColumn</w:t>
+      </w:r>
+      <w:proofErr w:type="spellEnd"/>
+      <w:r>
+        <w:t xml:space="preserve"> </w:t>
+      </w:r>
+      <w:r>
+        <w:rPr>
+          <w:b/>
+          <w:bCs/>
+        </w:rPr>
+        <w:t>Property</w:t>
+      </w:r>
+      <w:r>
+        <w:t xml:space="preserve">="x =&gt; </w:t>
+      </w:r>
+      <w:proofErr w:type="spellStart"/>
+      <w:proofErr w:type="gramStart"/>
+      <w:r>
+        <w:t>x.RequestTypeDesc</w:t>
+      </w:r>
+      <w:proofErr w:type="spellEnd"/>
+      <w:proofErr w:type="gramEnd"/>
+      <w:r>
+        <w:t xml:space="preserve">" </w:t>
+      </w:r>
+      <w:r>
+        <w:rPr>
+          <w:b/>
+          <w:bCs/>
+        </w:rPr>
+        <w:t>Title</w:t>
+      </w:r>
+      <w:r>
+        <w:t xml:space="preserve">="Request Type" </w:t>
+      </w:r>
+      <w:r>
+        <w:rPr>
+          <w:b/>
+          <w:bCs/>
+        </w:rPr>
+        <w:t>Class</w:t>
+      </w:r>
+      <w:r>
+        <w:t>="col-</w:t>
+      </w:r>
+      <w:proofErr w:type="spellStart"/>
+      <w:r>
+        <w:t>RequestTypeDesc</w:t>
+      </w:r>
+      <w:proofErr w:type="spellEnd"/>
+      <w:r>
+        <w:t xml:space="preserve">" </w:t>
+      </w:r>
+      <w:r>
+        <w:rPr>
+          <w:b/>
+          <w:bCs/>
+        </w:rPr>
+        <w:t>Editable</w:t>
+      </w:r>
+      <w:r>
+        <w:t>="false"&gt;</w:t>
+      </w:r>
+    </w:p>
+    <w:p>
+      <w:pPr>
+        <w:spacing w:after="0"/>
+      </w:pPr>
+      <w:r>
+        <w:t xml:space="preserve">             &lt;</w:t>
+      </w:r>
+      <w:proofErr w:type="spellStart"/>
+      <w:r>
+        <w:rPr>
+          <w:b/>
+          <w:bCs/>
+        </w:rPr>
+        <w:t>CellTemplate</w:t>
+      </w:r>
+      <w:proofErr w:type="spellEnd"/>
+      <w:r>
+        <w:t>&gt;</w:t>
+      </w:r>
+    </w:p>
+    <w:p>
+      <w:pPr>
+        <w:spacing w:after="0"/>
+      </w:pPr>
+      <w:r>
+        <w:t xml:space="preserve">                 @</w:t>
+      </w:r>
+      <w:proofErr w:type="gramStart"/>
+      <w:r>
+        <w:t>context.Item.RequestTypeDesc</w:t>
+      </w:r>
+      <w:proofErr w:type="gramEnd"/>
+    </w:p>
+    <w:p>
+      <w:pPr>
+        <w:spacing w:after="0"/>
+      </w:pPr>
+      <w:r>
+        <w:t xml:space="preserve">            &lt;/</w:t>
+      </w:r>
+      <w:proofErr w:type="spellStart"/>
+      <w:r>
+        <w:rPr>
+          <w:b/>
+          <w:bCs/>
+        </w:rPr>
+        <w:t>CellTemplate</w:t>
+      </w:r>
+      <w:proofErr w:type="spellEnd"/>
+      <w:r>
+        <w:t>&gt;</w:t>
+      </w:r>
+    </w:p>
+    <w:p>
+      <w:pPr>
+        <w:spacing w:after="0"/>
+      </w:pPr>
+      <w:r>
+        <w:t xml:space="preserve">        &lt;/</w:t>
+      </w:r>
+      <w:proofErr w:type="spellStart"/>
+      <w:r>
+        <w:rPr>
+          <w:b/>
+          <w:bCs/>
+        </w:rPr>
+        <w:t>PropertyColumn</w:t>
+      </w:r>
+      <w:proofErr w:type="spellEnd"/>
+      <w:r>
+        <w:t>&gt;</w:t>
+      </w:r>
+    </w:p>
+    <w:p>
+      <w:pPr>
+        <w:spacing w:after="0"/>
+      </w:pPr>
+      <w:r>
+        <w:lastRenderedPageBreak/>
+        <w:t xml:space="preserve">        &lt;</w:t>
+      </w:r>
+      <w:proofErr w:type="spellStart"/>
+      <w:r>
+        <w:rPr>
+          <w:b/>
+          <w:bCs/>
+        </w:rPr>
+        <w:t>PropertyColumn</w:t>
+      </w:r>
+      <w:proofErr w:type="spellEnd"/>
+      <w:r>
+        <w:t xml:space="preserve"> </w:t>
+      </w:r>
+      <w:r>
+        <w:rPr>
+          <w:b/>
+          <w:bCs/>
+        </w:rPr>
+        <w:t>Property</w:t>
+      </w:r>
+      <w:r>
+        <w:t xml:space="preserve">="x =&gt; </w:t>
+      </w:r>
+      <w:proofErr w:type="spellStart"/>
+      <w:proofErr w:type="gramStart"/>
+      <w:r>
+        <w:t>x.AppliedDate</w:t>
+      </w:r>
+      <w:proofErr w:type="spellEnd"/>
+      <w:proofErr w:type="gramEnd"/>
+      <w:r>
+        <w:t xml:space="preserve">" </w:t>
+      </w:r>
+      <w:r>
+        <w:rPr>
+          <w:b/>
+          <w:bCs/>
+        </w:rPr>
+        <w:t>Title</w:t>
+      </w:r>
+      <w:r>
+        <w:t xml:space="preserve">="Applied Date" </w:t>
+      </w:r>
+      <w:r>
+        <w:rPr>
+          <w:b/>
+          <w:bCs/>
+        </w:rPr>
+        <w:t>Class</w:t>
+      </w:r>
+      <w:r>
+        <w:t>="col-</w:t>
+      </w:r>
+      <w:proofErr w:type="spellStart"/>
+      <w:r>
+        <w:t>AppliedDate</w:t>
+      </w:r>
+      <w:proofErr w:type="spellEnd"/>
+      <w:r>
+        <w:t xml:space="preserve">" </w:t>
+      </w:r>
+      <w:r>
+        <w:rPr>
+          <w:b/>
+          <w:bCs/>
+        </w:rPr>
+        <w:t>Editable</w:t>
+      </w:r>
+      <w:r>
+        <w:t>="false"&gt;</w:t>
+      </w:r>
+    </w:p>
+    <w:p>
+      <w:pPr>
+        <w:spacing w:after="0"/>
+      </w:pPr>
+      <w:r>
+        <w:t xml:space="preserve">            &lt;</w:t>
+      </w:r>
+      <w:proofErr w:type="spellStart"/>
+      <w:r>
+        <w:rPr>
+          <w:b/>
+          <w:bCs/>
+        </w:rPr>
+        <w:t>CellTemplate</w:t>
+      </w:r>
+      <w:proofErr w:type="spellEnd"/>
+      <w:r>
+        <w:t>&gt;</w:t>
+      </w:r>
+    </w:p>
+    <w:p>
+      <w:pPr>
+        <w:spacing w:after="0"/>
+      </w:pPr>
+      <w:r>
+        <w:t xml:space="preserve">                </w:t>
+      </w:r>
+      <w:proofErr w:type="gramStart"/>
+      <w:r>
+        <w:t>@(context.Item.AppliedDate</w:t>
+      </w:r>
+      <w:proofErr w:type="gramEnd"/>
+      <w:r>
+        <w:t>.</w:t>
+      </w:r>
+      <w:proofErr w:type="gramStart"/>
+      <w:r>
+        <w:t>HasValue ?</w:t>
+      </w:r>
+      <w:proofErr w:type="gramEnd"/>
+      <w:r>
+        <w:t xml:space="preserve"> </w:t>
+      </w:r>
+      <w:proofErr w:type="spellStart"/>
+      <w:proofErr w:type="gramStart"/>
+      <w:r>
+        <w:t>context.Item.AppliedDate</w:t>
+      </w:r>
+      <w:proofErr w:type="gramEnd"/>
+      <w:r>
+        <w:t>.Value.ToString</w:t>
+      </w:r>
+      <w:proofErr w:type="spellEnd"/>
+      <w:r>
+        <w:t>("dd-MMM-</w:t>
+      </w:r>
+      <w:proofErr w:type="spellStart"/>
+      <w:r>
+        <w:t>yyyy</w:t>
+      </w:r>
+      <w:proofErr w:type="spellEnd"/>
+      <w:r>
+        <w:t>"</w:t>
+      </w:r>
+      <w:proofErr w:type="gramStart"/>
+      <w:r>
+        <w:t>) :</w:t>
+      </w:r>
+      <w:proofErr w:type="gramEnd"/>
+      <w:r>
+        <w:t xml:space="preserve"> "")</w:t>
+      </w:r>
+    </w:p>
+    <w:p>
+      <w:pPr>
+        <w:spacing w:after="0"/>
+      </w:pPr>
+      <w:r>
+        <w:t xml:space="preserve">            &lt;/</w:t>
+      </w:r>
+      <w:proofErr w:type="spellStart"/>
+      <w:r>
+        <w:rPr>
+          <w:b/>
+          <w:bCs/>
+        </w:rPr>
+        <w:t>CellTemplate</w:t>
+      </w:r>
+      <w:proofErr w:type="spellEnd"/>
+      <w:r>
+        <w:t>&gt;</w:t>
+      </w:r>
+    </w:p>
+    <w:p>
+      <w:pPr>
+        <w:spacing w:after="0"/>
+      </w:pPr>
+      <w:r>
+        <w:t xml:space="preserve">        &lt;/</w:t>
+      </w:r>
+      <w:proofErr w:type="spellStart"/>
+      <w:r>
+        <w:rPr>
+          <w:b/>
+          <w:bCs/>
+        </w:rPr>
+        <w:t>PropertyColumn</w:t>
+      </w:r>
+      <w:proofErr w:type="spellEnd"/>
+      <w:r>
+        <w:t>&gt;</w:t>
+      </w:r>
+    </w:p>
+    <w:p>
+      <w:pPr>
+        <w:spacing w:after="0"/>
+      </w:pPr>
+      <w:r>
+        <w:t xml:space="preserve">        &lt;</w:t>
+      </w:r>
+      <w:proofErr w:type="spellStart"/>
+      <w:r>
+        <w:rPr>
+          <w:b/>
+          <w:bCs/>
+        </w:rPr>
+        <w:t>PropertyColumn</w:t>
+      </w:r>
+      <w:proofErr w:type="spellEnd"/>
+      <w:r>
+        <w:t xml:space="preserve"> </w:t>
+      </w:r>
+      <w:r>
+        <w:rPr>
+          <w:b/>
+          <w:bCs/>
+        </w:rPr>
+        <w:t>Property</w:t>
+      </w:r>
+      <w:r>
+        <w:t xml:space="preserve">="x =&gt; </w:t>
+      </w:r>
+      <w:proofErr w:type="spellStart"/>
+      <w:proofErr w:type="gramStart"/>
+      <w:r>
+        <w:t>x.RequesterName</w:t>
+      </w:r>
+      <w:proofErr w:type="spellEnd"/>
+      <w:proofErr w:type="gramEnd"/>
+      <w:r>
+        <w:t xml:space="preserve">" </w:t>
+      </w:r>
+      <w:r>
+        <w:rPr>
+          <w:b/>
+          <w:bCs/>
+        </w:rPr>
+        <w:t>Title</w:t>
+      </w:r>
+      <w:r>
+        <w:t xml:space="preserve">="Requested By" </w:t>
+      </w:r>
+      <w:r>
+        <w:rPr>
+          <w:b/>
+          <w:bCs/>
+        </w:rPr>
+        <w:t>Class</w:t>
+      </w:r>
+      <w:r>
+        <w:t>="col-</w:t>
+      </w:r>
+      <w:proofErr w:type="spellStart"/>
+      <w:r>
+        <w:t>RequesterName</w:t>
+      </w:r>
+      <w:proofErr w:type="spellEnd"/>
+      <w:r>
+        <w:t xml:space="preserve">" </w:t>
+      </w:r>
+      <w:r>
+        <w:rPr>
+          <w:b/>
+          <w:bCs/>
+        </w:rPr>
+        <w:t>Editable</w:t>
+      </w:r>
+      <w:r>
+        <w:t>="false"&gt;</w:t>
+      </w:r>
+    </w:p>
+    <w:p>
+      <w:pPr>
+        <w:spacing w:after="0"/>
+      </w:pPr>
+      <w:r>
+        <w:t xml:space="preserve">            &lt;</w:t>
+      </w:r>
+      <w:proofErr w:type="spellStart"/>
+      <w:r>
+        <w:rPr>
+          <w:b/>
+          <w:bCs/>
+        </w:rPr>
+        <w:t>CellTemplate</w:t>
+      </w:r>
+      <w:proofErr w:type="spellEnd"/>
+      <w:r>
+        <w:t>&gt;</w:t>
+      </w:r>
+    </w:p>
+    <w:p>
+      <w:pPr>
+        <w:spacing w:after="0"/>
+      </w:pPr>
+      <w:r>
+        <w:t xml:space="preserve">                @</w:t>
+      </w:r>
+      <w:proofErr w:type="gramStart"/>
+      <w:r>
+        <w:t>context.Item.RequesterName</w:t>
+      </w:r>
+      <w:proofErr w:type="gramEnd"/>
+    </w:p>
+    <w:p>
+      <w:pPr>
+        <w:spacing w:after="0"/>
+      </w:pPr>
+      <w:r>
+        <w:t xml:space="preserve">            &lt;/</w:t>
+      </w:r>
+      <w:proofErr w:type="spellStart"/>
+      <w:r>
+        <w:rPr>
+          <w:b/>
+          <w:bCs/>
+        </w:rPr>
+        <w:t>CellTemplate</w:t>
+      </w:r>
+      <w:proofErr w:type="spellEnd"/>
+      <w:r>
+        <w:t>&gt;</w:t>
+      </w:r>
+    </w:p>
+    <w:p>
+      <w:pPr>
+        <w:spacing w:after="0"/>
+      </w:pPr>
+      <w:r>
+        <w:t xml:space="preserve">        &lt;/</w:t>
+      </w:r>
+      <w:proofErr w:type="spellStart"/>
+      <w:r>
+        <w:rPr>
+          <w:b/>
+          <w:bCs/>
+        </w:rPr>
+        <w:t>PropertyColumn</w:t>
+      </w:r>
+      <w:proofErr w:type="spellEnd"/>
+      <w:r>
+        <w:t>&gt;</w:t>
+      </w:r>
+    </w:p>
+    <w:p>
+      <w:pPr>
+        <w:spacing w:after="0"/>
+      </w:pPr>
+      <w:r>
+        <w:t xml:space="preserve">        &lt;</w:t>
+      </w:r>
+      <w:proofErr w:type="spellStart"/>
+      <w:r>
+        <w:rPr>
+          <w:b/>
+          <w:bCs/>
+        </w:rPr>
+        <w:t>PropertyColumn</w:t>
+      </w:r>
+      <w:proofErr w:type="spellEnd"/>
+      <w:r>
+        <w:t xml:space="preserve"> </w:t>
+      </w:r>
+      <w:r>
+        <w:rPr>
+          <w:b/>
+          <w:bCs/>
+        </w:rPr>
+        <w:t>Property</w:t>
+      </w:r>
+      <w:r>
+        <w:t xml:space="preserve">="x =&gt; </w:t>
+      </w:r>
+      <w:proofErr w:type="spellStart"/>
+      <w:proofErr w:type="gramStart"/>
+      <w:r>
+        <w:t>x.Detail</w:t>
+      </w:r>
+      <w:proofErr w:type="spellEnd"/>
+      <w:proofErr w:type="gramEnd"/>
+      <w:r>
+        <w:t xml:space="preserve">" </w:t>
+      </w:r>
+      <w:r>
+        <w:rPr>
+          <w:b/>
+          <w:bCs/>
+        </w:rPr>
+        <w:t>Title</w:t>
+      </w:r>
+      <w:r>
+        <w:t xml:space="preserve">="Details" </w:t>
+      </w:r>
+      <w:r>
+        <w:rPr>
+          <w:b/>
+          <w:bCs/>
+        </w:rPr>
+        <w:t>Class</w:t>
+      </w:r>
+      <w:r>
+        <w:t xml:space="preserve">="col-Detail" </w:t>
+      </w:r>
+      <w:r>
+        <w:rPr>
+          <w:b/>
+          <w:bCs/>
+        </w:rPr>
+        <w:t>Editable</w:t>
+      </w:r>
+      <w:r>
+        <w:t>="false"&gt;</w:t>
+      </w:r>
+    </w:p>
+    <w:p>
+      <w:pPr>
+        <w:spacing w:after="0"/>
+      </w:pPr>
+      <w:r>
+        <w:t xml:space="preserve">            &lt;</w:t>
+      </w:r>
+      <w:proofErr w:type="spellStart"/>
+      <w:r>
+        <w:rPr>
+          <w:b/>
+          <w:bCs/>
+        </w:rPr>
+        <w:t>CellTemplate</w:t>
+      </w:r>
+      <w:proofErr w:type="spellEnd"/>
+      <w:r>
+        <w:t>&gt;</w:t>
+      </w:r>
+    </w:p>
+    <w:p>
+      <w:pPr>
+        <w:spacing w:after="0"/>
+      </w:pPr>
+      <w:r>
+        <w:t xml:space="preserve">                @</w:t>
+      </w:r>
+      <w:proofErr w:type="gramStart"/>
+      <w:r>
+        <w:t>context.Item.Detail</w:t>
+      </w:r>
+      <w:proofErr w:type="gramEnd"/>
+    </w:p>
+    <w:p>
+      <w:pPr>
+        <w:spacing w:after="0"/>
+      </w:pPr>
+      <w:r>
+        <w:t xml:space="preserve">            &lt;/</w:t>
+      </w:r>
+      <w:proofErr w:type="spellStart"/>
+      <w:r>
+        <w:rPr>
+          <w:b/>
+          <w:bCs/>
+        </w:rPr>
+        <w:t>CellTemplate</w:t>
+      </w:r>
+      <w:proofErr w:type="spellEnd"/>
+      <w:r>
+        <w:t>&gt;</w:t>
+      </w:r>
+    </w:p>
+    <w:p>
+      <w:pPr>
+        <w:spacing w:after="0"/>
+      </w:pPr>
+      <w:r>
+        <w:t xml:space="preserve">        &lt;/</w:t>
+      </w:r>
+      <w:proofErr w:type="spellStart"/>
+      <w:r>
+        <w:rPr>
+          <w:b/>
+          <w:bCs/>
+        </w:rPr>
+        <w:t>PropertyColumn</w:t>
+      </w:r>
+      <w:proofErr w:type="spellEnd"/>
+      <w:r>
+        <w:t>&gt;</w:t>
+      </w:r>
+    </w:p>
+    <w:p>
+      <w:pPr>
+        <w:spacing w:after="0"/>
+      </w:pPr>
+      <w:r>
+        <w:t xml:space="preserve">        &lt;</w:t>
+      </w:r>
+      <w:proofErr w:type="spellStart"/>
+      <w:r>
+        <w:rPr>
+          <w:b/>
+          <w:bCs/>
+        </w:rPr>
+        <w:t>PropertyColumn</w:t>
+      </w:r>
+      <w:proofErr w:type="spellEnd"/>
+      <w:r>
+        <w:t xml:space="preserve"> </w:t>
+      </w:r>
+      <w:r>
+        <w:rPr>
+          <w:b/>
+          <w:bCs/>
+        </w:rPr>
+        <w:t>Property</w:t>
+      </w:r>
+      <w:r>
+        <w:t xml:space="preserve">="x =&gt; </w:t>
+      </w:r>
+      <w:proofErr w:type="spellStart"/>
+      <w:proofErr w:type="gramStart"/>
+      <w:r>
+        <w:t>x.CurrentStatus</w:t>
+      </w:r>
+      <w:proofErr w:type="spellEnd"/>
+      <w:proofErr w:type="gramEnd"/>
+      <w:r>
+        <w:t xml:space="preserve">" </w:t>
+      </w:r>
+      <w:r>
+        <w:rPr>
+          <w:b/>
+          <w:bCs/>
+        </w:rPr>
+        <w:t>Title</w:t>
+      </w:r>
+      <w:r>
+        <w:t xml:space="preserve">="Status" </w:t>
+      </w:r>
+      <w:r>
+        <w:rPr>
+          <w:b/>
+          <w:bCs/>
+        </w:rPr>
+        <w:t>Class</w:t>
+      </w:r>
+      <w:r>
+        <w:t>="col-</w:t>
+      </w:r>
+      <w:proofErr w:type="spellStart"/>
+      <w:r>
+        <w:t>CurrentStatus</w:t>
+      </w:r>
+      <w:proofErr w:type="spellEnd"/>
+      <w:r>
+        <w:t xml:space="preserve">" </w:t>
+      </w:r>
+      <w:r>
+        <w:rPr>
+          <w:b/>
+          <w:bCs/>
+        </w:rPr>
+        <w:t>Editable</w:t>
+      </w:r>
+      <w:r>
+        <w:t>="false"&gt;</w:t>
+      </w:r>
+    </w:p>
+    <w:p>
+      <w:pPr>
+        <w:spacing w:after="0"/>
+      </w:pPr>
+      <w:r>
+        <w:t xml:space="preserve">            &lt;</w:t>
+      </w:r>
+      <w:proofErr w:type="spellStart"/>
+      <w:r>
+        <w:rPr>
+          <w:b/>
+          <w:bCs/>
+        </w:rPr>
+        <w:t>CellTemplate</w:t>
+      </w:r>
+      <w:proofErr w:type="spellEnd"/>
+      <w:r>
+        <w:t>&gt;</w:t>
+      </w:r>
+    </w:p>
+    <w:p>
+      <w:pPr>
+        <w:spacing w:after="0"/>
+      </w:pPr>
+      <w:r>
+        <w:t xml:space="preserve">                @</w:t>
+      </w:r>
+      <w:proofErr w:type="gramStart"/>
+      <w:r>
+        <w:t>context.Item.CurrentStatus</w:t>
+      </w:r>
+      <w:proofErr w:type="gramEnd"/>
+    </w:p>
+    <w:p>
+      <w:pPr>
+        <w:spacing w:after="0"/>
+      </w:pPr>
+      <w:r>
+        <w:t xml:space="preserve">            &lt;/</w:t>
+      </w:r>
+      <w:proofErr w:type="spellStart"/>
+      <w:r>
+        <w:rPr>
+          <w:b/>
+          <w:bCs/>
+        </w:rPr>
+        <w:t>CellTemplate</w:t>
+      </w:r>
+      <w:proofErr w:type="spellEnd"/>
+      <w:r>
+        <w:t>&gt;</w:t>
+      </w:r>
+    </w:p>
+    <w:p>
+      <w:pPr>
+        <w:spacing w:after="0"/>
+      </w:pPr>
+      <w:r>
+        <w:t xml:space="preserve">            &lt;</w:t>
+      </w:r>
+      <w:proofErr w:type="spellStart"/>
+      <w:r>
+        <w:rPr>
+          <w:b/>
+          <w:bCs/>
+        </w:rPr>
+        <w:t>CellTemplate</w:t>
+      </w:r>
+      <w:proofErr w:type="spellEnd"/>
+      <w:r>
+        <w:t xml:space="preserve"> </w:t>
+      </w:r>
+      <w:r>
+        <w:rPr>
+          <w:b/>
+          <w:bCs/>
+        </w:rPr>
+        <w:t>Context</w:t>
+      </w:r>
+      <w:r>
+        <w:t>="row"&gt;</w:t>
+      </w:r>
+    </w:p>
+    <w:p>
+      <w:pPr>
+        <w:spacing w:after="0"/>
+      </w:pPr>
+      <w:r>
+        <w:t xml:space="preserve">                &lt;</w:t>
+      </w:r>
+      <w:proofErr w:type="spellStart"/>
+      <w:r>
+        <w:rPr>
+          <w:b/>
+          <w:bCs/>
+        </w:rPr>
+        <w:t>MudChip</w:t>
+      </w:r>
+      <w:proofErr w:type="spellEnd"/>
+      <w:r>
+        <w:t xml:space="preserve"> </w:t>
+      </w:r>
+      <w:r>
+        <w:rPr>
+          <w:b/>
+          <w:bCs/>
+        </w:rPr>
+        <w:t>T</w:t>
+      </w:r>
+      <w:r>
+        <w:t xml:space="preserve">="string" </w:t>
+      </w:r>
+      <w:r>
+        <w:rPr>
+          <w:b/>
+          <w:bCs/>
+        </w:rPr>
+        <w:t>Size</w:t>
+      </w:r>
+      <w:r>
+        <w:t>=</w:t>
+      </w:r>
+      <w:proofErr w:type="spellStart"/>
+      <w:r>
+        <w:t>Size.Small</w:t>
+      </w:r>
+      <w:proofErr w:type="spellEnd"/>
+      <w:r>
+        <w:t xml:space="preserve"> </w:t>
+      </w:r>
+      <w:r>
+        <w:rPr>
+          <w:b/>
+          <w:bCs/>
+        </w:rPr>
+        <w:t>Variant</w:t>
+      </w:r>
+      <w:r>
+        <w:t>="</w:t>
+      </w:r>
+      <w:proofErr w:type="spellStart"/>
+      <w:r>
+        <w:t>Variant.Outlined</w:t>
+      </w:r>
+      <w:proofErr w:type="spellEnd"/>
+      <w:r>
+        <w:t>"</w:t>
+      </w:r>
+    </w:p>
+    <w:p>
+      <w:pPr>
+        <w:spacing w:after="0"/>
+      </w:pPr>
+      <w:r>
+        <w:t xml:space="preserve">                    </w:t>
+      </w:r>
+      <w:r>
+        <w:rPr>
+          <w:b/>
+          <w:bCs/>
+        </w:rPr>
+        <w:t>Color</w:t>
+      </w:r>
+      <w:r>
+        <w:t>="</w:t>
+      </w:r>
+      <w:proofErr w:type="gramStart"/>
+      <w:r>
+        <w:t>@(</w:t>
+      </w:r>
+      <w:proofErr w:type="spellStart"/>
+      <w:r>
+        <w:t>row.Item.CurrentStatus</w:t>
+      </w:r>
+      <w:proofErr w:type="spellEnd"/>
+      <w:proofErr w:type="gramEnd"/>
+      <w:r>
+        <w:t xml:space="preserve"> == </w:t>
+      </w:r>
+      <w:proofErr w:type="spellStart"/>
+      <w:proofErr w:type="gramStart"/>
+      <w:r>
+        <w:t>WorkflowStatus.Pending.ToString</w:t>
+      </w:r>
+      <w:proofErr w:type="spellEnd"/>
+      <w:proofErr w:type="gramEnd"/>
+      <w:r>
+        <w:t>(</w:t>
+      </w:r>
+      <w:proofErr w:type="gramStart"/>
+      <w:r>
+        <w:t>) ?</w:t>
+      </w:r>
+      <w:proofErr w:type="gramEnd"/>
+      <w:r>
+        <w:t xml:space="preserve"> </w:t>
+      </w:r>
+      <w:proofErr w:type="spellStart"/>
+      <w:r>
+        <w:t>Color.Info</w:t>
+      </w:r>
+      <w:proofErr w:type="spellEnd"/>
+    </w:p>
+    <w:p>
+      <w:pPr>
+        <w:spacing w:after="0"/>
+      </w:pPr>
+      <w:r>
+        <w:t xml:space="preserve">                      : </w:t>
+      </w:r>
+      <w:proofErr w:type="spellStart"/>
+      <w:proofErr w:type="gramStart"/>
+      <w:r>
+        <w:t>row.Item.CurrentStatus</w:t>
+      </w:r>
+      <w:proofErr w:type="spellEnd"/>
+      <w:proofErr w:type="gramEnd"/>
+      <w:r>
+        <w:t xml:space="preserve"> == </w:t>
+      </w:r>
+      <w:proofErr w:type="spellStart"/>
+      <w:proofErr w:type="gramStart"/>
+      <w:r>
+        <w:t>WorkflowStatus.Completed.ToString</w:t>
+      </w:r>
+      <w:proofErr w:type="spellEnd"/>
+      <w:proofErr w:type="gramEnd"/>
+      <w:r>
+        <w:t>(</w:t>
+      </w:r>
+      <w:proofErr w:type="gramStart"/>
+      <w:r>
+        <w:t>) ?</w:t>
+      </w:r>
+      <w:proofErr w:type="gramEnd"/>
+      <w:r>
+        <w:t xml:space="preserve"> </w:t>
+      </w:r>
+      <w:proofErr w:type="spellStart"/>
+      <w:r>
+        <w:t>Color.Tertiary</w:t>
+      </w:r>
+      <w:proofErr w:type="spellEnd"/>
+    </w:p>
+    <w:p>
+      <w:pPr>
+        <w:spacing w:after="0"/>
+      </w:pPr>
+      <w:r>
+        <w:t xml:space="preserve">                      : </w:t>
+      </w:r>
+      <w:proofErr w:type="spellStart"/>
+      <w:proofErr w:type="gramStart"/>
+      <w:r>
+        <w:t>row.Item.CurrentStatus</w:t>
+      </w:r>
+      <w:proofErr w:type="spellEnd"/>
+      <w:proofErr w:type="gramEnd"/>
+      <w:r>
+        <w:t xml:space="preserve"> == </w:t>
+      </w:r>
+      <w:proofErr w:type="spellStart"/>
+      <w:proofErr w:type="gramStart"/>
+      <w:r>
+        <w:t>WorkflowStatus.Rejected.ToString</w:t>
+      </w:r>
+      <w:proofErr w:type="spellEnd"/>
+      <w:proofErr w:type="gramEnd"/>
+      <w:r>
+        <w:t>(</w:t>
+      </w:r>
+      <w:proofErr w:type="gramStart"/>
+      <w:r>
+        <w:t>) ?</w:t>
+      </w:r>
+      <w:proofErr w:type="gramEnd"/>
+      <w:r>
+        <w:t xml:space="preserve"> </w:t>
+      </w:r>
+      <w:proofErr w:type="spellStart"/>
+      <w:r>
+        <w:t>Color.Error</w:t>
+      </w:r>
+      <w:proofErr w:type="spellEnd"/>
+    </w:p>
+    <w:p>
+      <w:pPr>
+        <w:spacing w:after="0"/>
+      </w:pPr>
+      <w:r>
+        <w:t xml:space="preserve">                      : </w:t>
+      </w:r>
+      <w:proofErr w:type="spellStart"/>
+      <w:proofErr w:type="gramStart"/>
+      <w:r>
+        <w:t>row.Item.CurrentStatus</w:t>
+      </w:r>
+      <w:proofErr w:type="spellEnd"/>
+      <w:proofErr w:type="gramEnd"/>
+      <w:r>
+        <w:t xml:space="preserve"> == </w:t>
+      </w:r>
+      <w:proofErr w:type="spellStart"/>
+      <w:proofErr w:type="gramStart"/>
+      <w:r>
+        <w:t>WorkflowStatus.Cancelled.ToString</w:t>
+      </w:r>
+      <w:proofErr w:type="spellEnd"/>
+      <w:proofErr w:type="gramEnd"/>
+      <w:r>
+        <w:t>(</w:t>
+      </w:r>
+      <w:proofErr w:type="gramStart"/>
+      <w:r>
+        <w:t>) ?</w:t>
+      </w:r>
+      <w:proofErr w:type="gramEnd"/>
+      <w:r>
+        <w:t xml:space="preserve"> </w:t>
+      </w:r>
+      <w:proofErr w:type="spellStart"/>
+      <w:r>
+        <w:t>Color.Warning</w:t>
+      </w:r>
+      <w:proofErr w:type="spellEnd"/>
+    </w:p>
+    <w:p>
+      <w:pPr>
+        <w:spacing w:after="0"/>
+      </w:pPr>
+      <w:r>
+        <w:t xml:space="preserve">                      : </w:t>
+      </w:r>
+      <w:proofErr w:type="spellStart"/>
+      <w:proofErr w:type="gramStart"/>
+      <w:r>
+        <w:t>row.Item.CurrentStatus</w:t>
+      </w:r>
+      <w:proofErr w:type="spellEnd"/>
+      <w:proofErr w:type="gramEnd"/>
+      <w:r>
+        <w:t xml:space="preserve"> == </w:t>
+      </w:r>
+      <w:proofErr w:type="spellStart"/>
+      <w:proofErr w:type="gramStart"/>
+      <w:r>
+        <w:t>WorkflowStatus.Approved.ToString</w:t>
+      </w:r>
+      <w:proofErr w:type="spellEnd"/>
+      <w:proofErr w:type="gramEnd"/>
+      <w:r>
+        <w:t>(</w:t>
+      </w:r>
+      <w:proofErr w:type="gramStart"/>
+      <w:r>
+        <w:t>) ?</w:t>
+      </w:r>
+      <w:proofErr w:type="gramEnd"/>
+      <w:r>
+        <w:t xml:space="preserve"> </w:t>
+      </w:r>
+      <w:proofErr w:type="spellStart"/>
+      <w:r>
+        <w:t>Color.Success</w:t>
+      </w:r>
+      <w:proofErr w:type="spellEnd"/>
+    </w:p>
+    <w:p>
+      <w:pPr>
+        <w:spacing w:after="0"/>
+      </w:pPr>
+      <w:r>
+        <w:t xml:space="preserve">                      : </w:t>
+      </w:r>
+      <w:proofErr w:type="spellStart"/>
+      <w:proofErr w:type="gramStart"/>
+      <w:r>
+        <w:t>row.Item.CurrentStatus</w:t>
+      </w:r>
+      <w:proofErr w:type="spellEnd"/>
+      <w:proofErr w:type="gramEnd"/>
+      <w:r>
+        <w:t xml:space="preserve"> == </w:t>
+      </w:r>
+      <w:proofErr w:type="spellStart"/>
+      <w:proofErr w:type="gramStart"/>
+      <w:r>
+        <w:t>WorkflowStatus.Skipped.ToString</w:t>
+      </w:r>
+      <w:proofErr w:type="spellEnd"/>
+      <w:proofErr w:type="gramEnd"/>
+      <w:r>
+        <w:t>(</w:t>
+      </w:r>
+      <w:proofErr w:type="gramStart"/>
+      <w:r>
+        <w:t>) ?</w:t>
+      </w:r>
+      <w:proofErr w:type="gramEnd"/>
+      <w:r>
+        <w:t xml:space="preserve"> </w:t>
+      </w:r>
+      <w:proofErr w:type="spellStart"/>
+      <w:r>
+        <w:t>Color.Secondary</w:t>
+      </w:r>
+      <w:proofErr w:type="spellEnd"/>
+    </w:p>
+    <w:p>
+      <w:pPr>
+        <w:spacing w:after="0"/>
+      </w:pPr>
+      <w:r>
+        <w:t xml:space="preserve">                      : </w:t>
+      </w:r>
+      <w:proofErr w:type="spellStart"/>
+      <w:proofErr w:type="gramStart"/>
+      <w:r>
+        <w:t>row.Item.CurrentStatus</w:t>
+      </w:r>
+      <w:proofErr w:type="spellEnd"/>
+      <w:proofErr w:type="gramEnd"/>
+      <w:r>
+        <w:t xml:space="preserve"> == </w:t>
+      </w:r>
+      <w:proofErr w:type="spellStart"/>
+      <w:proofErr w:type="gramStart"/>
+      <w:r>
+        <w:t>WorkflowStatus.Running.ToString</w:t>
+      </w:r>
+      <w:proofErr w:type="spellEnd"/>
+      <w:proofErr w:type="gramEnd"/>
+      <w:r>
+        <w:t>(</w:t>
+      </w:r>
+      <w:proofErr w:type="gramStart"/>
+      <w:r>
+        <w:t>) ?</w:t>
+      </w:r>
+      <w:proofErr w:type="gramEnd"/>
+      <w:r>
+        <w:t xml:space="preserve"> </w:t>
+      </w:r>
+      <w:proofErr w:type="spellStart"/>
+      <w:r>
+        <w:t>Color.Primary</w:t>
+      </w:r>
+      <w:proofErr w:type="spellEnd"/>
+    </w:p>
+    <w:p>
+      <w:pPr>
+        <w:spacing w:after="0"/>
+      </w:pPr>
+      <w:r>
+        <w:t xml:space="preserve">                      : </w:t>
+      </w:r>
+      <w:proofErr w:type="spellStart"/>
+      <w:r>
+        <w:t>Color.Surface</w:t>
+      </w:r>
+      <w:proofErr w:type="spellEnd"/>
+      <w:r>
+        <w:t>)"&gt;</w:t>
+      </w:r>
+    </w:p>
+    <w:p>
+      <w:pPr>
+        <w:spacing w:after="0"/>
+      </w:pPr>
+      <w:r>
+        <w:t xml:space="preserve">                    @</w:t>
+      </w:r>
+      <w:proofErr w:type="gramStart"/>
+      <w:r>
+        <w:t>row.Item.CurrentStatus</w:t>
+      </w:r>
+      <w:proofErr w:type="gramEnd"/>
+    </w:p>
+    <w:p>
+      <w:pPr>
+        <w:spacing w:after="0"/>
+      </w:pPr>
+      <w:r>
+        <w:t xml:space="preserve">                &lt;/</w:t>
+      </w:r>
+      <w:proofErr w:type="spellStart"/>
+      <w:r>
+        <w:rPr>
+          <w:b/>
+          <w:bCs/>
+        </w:rPr>
+        <w:t>MudChip</w:t>
+      </w:r>
+      <w:proofErr w:type="spellEnd"/>
+      <w:r>
+        <w:t>&gt;</w:t>
+      </w:r>
+    </w:p>
+    <w:p>
+      <w:pPr>
+        <w:spacing w:after="0"/>
+      </w:pPr>
+      <w:r>
+        <w:t xml:space="preserve">            &lt;/</w:t>
+      </w:r>
+      <w:proofErr w:type="spellStart"/>
+      <w:r>
+        <w:rPr>
+          <w:b/>
+          <w:bCs/>
+        </w:rPr>
+        <w:t>CellTemplate</w:t>
+      </w:r>
+      <w:proofErr w:type="spellEnd"/>
+      <w:r>
+        <w:t>&gt;</w:t>
+      </w:r>
+    </w:p>
+    <w:p>
+      <w:pPr>
+        <w:spacing w:after="0"/>
+      </w:pPr>
+      <w:r>
+        <w:t xml:space="preserve">        &lt;/</w:t>
+      </w:r>
+      <w:proofErr w:type="spellStart"/>
+      <w:r>
+        <w:rPr>
+          <w:b/>
+          <w:bCs/>
+        </w:rPr>
+        <w:t>PropertyColumn</w:t>
+      </w:r>
+      <w:proofErr w:type="spellEnd"/>
+      <w:r>
+        <w:t>&gt;</w:t>
+      </w:r>
+    </w:p>
+    <w:p>
+      <w:pPr>
+        <w:spacing w:after="0"/>
+      </w:pPr>
+      <w:r>
+        <w:lastRenderedPageBreak/>
+        <w:t xml:space="preserve">        &lt;</w:t>
+      </w:r>
+      <w:proofErr w:type="spellStart"/>
+      <w:r>
+        <w:rPr>
+          <w:b/>
+          <w:bCs/>
+        </w:rPr>
+        <w:t>PropertyColumn</w:t>
+      </w:r>
+      <w:proofErr w:type="spellEnd"/>
+      <w:r>
+        <w:t xml:space="preserve"> </w:t>
+      </w:r>
+      <w:r>
+        <w:rPr>
+          <w:b/>
+          <w:bCs/>
+        </w:rPr>
+        <w:t>Property</w:t>
+      </w:r>
+      <w:r>
+        <w:t xml:space="preserve">="x =&gt; </w:t>
+      </w:r>
+      <w:proofErr w:type="spellStart"/>
+      <w:proofErr w:type="gramStart"/>
+      <w:r>
+        <w:t>x.ApproverFullName</w:t>
+      </w:r>
+      <w:proofErr w:type="spellEnd"/>
+      <w:proofErr w:type="gramEnd"/>
+      <w:r>
+        <w:t xml:space="preserve">" </w:t>
+      </w:r>
+      <w:r>
+        <w:rPr>
+          <w:b/>
+          <w:bCs/>
+        </w:rPr>
+        <w:t>Title</w:t>
+      </w:r>
+      <w:r>
+        <w:t xml:space="preserve">="Currently Assigned To" </w:t>
+      </w:r>
+      <w:r>
+        <w:rPr>
+          <w:b/>
+          <w:bCs/>
+        </w:rPr>
+        <w:t>Class</w:t>
+      </w:r>
+      <w:r>
+        <w:t>="col-</w:t>
+      </w:r>
+      <w:proofErr w:type="spellStart"/>
+      <w:r>
+        <w:t>ApproverFullName</w:t>
+      </w:r>
+      <w:proofErr w:type="spellEnd"/>
+      <w:r>
+        <w:t xml:space="preserve">" </w:t>
+      </w:r>
+      <w:r>
+        <w:rPr>
+          <w:b/>
+          <w:bCs/>
+        </w:rPr>
+        <w:t>Editable</w:t>
+      </w:r>
+      <w:r>
+        <w:t>="false"&gt;</w:t>
+      </w:r>
+    </w:p>
+    <w:p>
+      <w:pPr>
+        <w:spacing w:after="0"/>
+      </w:pPr>
+      <w:r>
+        <w:t xml:space="preserve">            &lt;</w:t>
+      </w:r>
+      <w:proofErr w:type="spellStart"/>
+      <w:r>
+        <w:rPr>
+          <w:b/>
+          <w:bCs/>
+        </w:rPr>
+        <w:t>CellTemplate</w:t>
+      </w:r>
+      <w:proofErr w:type="spellEnd"/>
+      <w:r>
+        <w:t>&gt;</w:t>
+      </w:r>
+    </w:p>
+    <w:p>
+      <w:pPr>
+        <w:spacing w:after="0"/>
+      </w:pPr>
+      <w:r>
+        <w:t xml:space="preserve">                @</w:t>
+      </w:r>
+      <w:proofErr w:type="gramStart"/>
+      <w:r>
+        <w:t>context.Item.ApproverFullName</w:t>
+      </w:r>
+      <w:proofErr w:type="gramEnd"/>
+    </w:p>
+    <w:p>
+      <w:pPr>
+        <w:spacing w:after="0"/>
+      </w:pPr>
+      <w:r>
+        <w:t xml:space="preserve">            &lt;/</w:t>
+      </w:r>
+      <w:proofErr w:type="spellStart"/>
+      <w:r>
+        <w:rPr>
+          <w:b/>
+          <w:bCs/>
+        </w:rPr>
+        <w:t>CellTemplate</w:t>
+      </w:r>
+      <w:proofErr w:type="spellEnd"/>
+      <w:r>
+        <w:t>&gt;</w:t>
+      </w:r>
+    </w:p>
+    <w:p>
+      <w:pPr>
+        <w:spacing w:after="0"/>
+      </w:pPr>
+      <w:r>
+        <w:t xml:space="preserve">        &lt;/</w:t>
+      </w:r>
+      <w:proofErr w:type="spellStart"/>
+      <w:r>
+        <w:rPr>
+          <w:b/>
+          <w:bCs/>
+        </w:rPr>
+        <w:t>PropertyColumn</w:t>
+      </w:r>
+      <w:proofErr w:type="spellEnd"/>
+      <w:r>
+        <w:t>&gt;</w:t>
+      </w:r>
+    </w:p>
+    <w:p>
+      <w:pPr>
+        <w:spacing w:after="0"/>
+      </w:pPr>
+      <w:r>
+        <w:t xml:space="preserve">        &lt;</w:t>
+      </w:r>
+      <w:proofErr w:type="spellStart"/>
+      <w:r>
+        <w:rPr>
+          <w:b/>
+          <w:bCs/>
+        </w:rPr>
+        <w:t>PropertyColumn</w:t>
+      </w:r>
+      <w:proofErr w:type="spellEnd"/>
+      <w:r>
+        <w:t xml:space="preserve"> </w:t>
+      </w:r>
+      <w:r>
+        <w:rPr>
+          <w:b/>
+          <w:bCs/>
+        </w:rPr>
+        <w:t>Property</w:t>
+      </w:r>
+      <w:r>
+        <w:t xml:space="preserve">="x =&gt; </w:t>
+      </w:r>
+      <w:proofErr w:type="spellStart"/>
+      <w:proofErr w:type="gramStart"/>
+      <w:r>
+        <w:t>x.PendingSince</w:t>
+      </w:r>
+      <w:proofErr w:type="spellEnd"/>
+      <w:proofErr w:type="gramEnd"/>
+      <w:r>
+        <w:t xml:space="preserve">" </w:t>
+      </w:r>
+      <w:r>
+        <w:rPr>
+          <w:b/>
+          <w:bCs/>
+        </w:rPr>
+        <w:t>Title</w:t>
+      </w:r>
+      <w:r>
+        <w:t xml:space="preserve">="Pending Since" </w:t>
+      </w:r>
+      <w:r>
+        <w:rPr>
+          <w:b/>
+          <w:bCs/>
+        </w:rPr>
+        <w:t>Class</w:t>
+      </w:r>
+      <w:r>
+        <w:t>="col-</w:t>
+      </w:r>
+      <w:proofErr w:type="spellStart"/>
+      <w:r>
+        <w:t>PendingSince</w:t>
+      </w:r>
+      <w:proofErr w:type="spellEnd"/>
+      <w:r>
+        <w:t xml:space="preserve">" </w:t>
+      </w:r>
+      <w:r>
+        <w:rPr>
+          <w:b/>
+          <w:bCs/>
+        </w:rPr>
+        <w:t>Editable</w:t>
+      </w:r>
+      <w:r>
+        <w:t>="false"&gt;</w:t>
+      </w:r>
+    </w:p>
+    <w:p>
+      <w:pPr>
+        <w:spacing w:after="0"/>
+      </w:pPr>
+      <w:r>
+        <w:t xml:space="preserve">            &lt;</w:t>
+      </w:r>
+      <w:proofErr w:type="spellStart"/>
+      <w:r>
+        <w:rPr>
+          <w:b/>
+          <w:bCs/>
+        </w:rPr>
+        <w:t>CellTemplate</w:t>
+      </w:r>
+      <w:proofErr w:type="spellEnd"/>
+      <w:r>
+        <w:t>&gt;</w:t>
+      </w:r>
+    </w:p>
+    <w:p>
+      <w:pPr>
+        <w:spacing w:after="0"/>
+      </w:pPr>
+      <w:r>
+        <w:t xml:space="preserve">                @</w:t>
+      </w:r>
+      <w:proofErr w:type="gramStart"/>
+      <w:r>
+        <w:t>context.Item.PendingSince</w:t>
+      </w:r>
+      <w:proofErr w:type="gramEnd"/>
+    </w:p>
+    <w:p>
+      <w:pPr>
+        <w:spacing w:after="0"/>
+      </w:pPr>
+      <w:r>
+        <w:t xml:space="preserve">            &lt;/</w:t>
+      </w:r>
+      <w:proofErr w:type="spellStart"/>
+      <w:r>
+        <w:rPr>
+          <w:b/>
+          <w:bCs/>
+        </w:rPr>
+        <w:t>CellTemplate</w:t>
+      </w:r>
+      <w:proofErr w:type="spellEnd"/>
+      <w:r>
+        <w:t>&gt;</w:t>
+      </w:r>
+    </w:p>
+    <w:p>
+      <w:pPr>
+        <w:spacing w:after="0"/>
+      </w:pPr>
+      <w:r>
+        <w:t xml:space="preserve">        &lt;/</w:t>
+      </w:r>
+      <w:proofErr w:type="spellStart"/>
+      <w:r>
+        <w:rPr>
+          <w:b/>
+          <w:bCs/>
+        </w:rPr>
+        <w:t>PropertyColumn</w:t>
+      </w:r>
+      <w:proofErr w:type="spellEnd"/>
+      <w:r>
+        <w:t>&gt;</w:t>
+      </w:r>
+    </w:p>
+    <w:p>
+      <w:pPr>
+        <w:spacing w:after="0"/>
+      </w:pPr>
+      <w:r>
+        <w:t xml:space="preserve">        &lt;</w:t>
+      </w:r>
+      <w:proofErr w:type="spellStart"/>
+      <w:r>
+        <w:rPr>
+          <w:b/>
+          <w:bCs/>
+        </w:rPr>
+        <w:t>PropertyColumn</w:t>
+      </w:r>
+      <w:proofErr w:type="spellEnd"/>
+      <w:r>
+        <w:t xml:space="preserve"> </w:t>
+      </w:r>
+      <w:r>
+        <w:rPr>
+          <w:b/>
+          <w:bCs/>
+        </w:rPr>
+        <w:t>Property</w:t>
+      </w:r>
+      <w:r>
+        <w:t xml:space="preserve">="x =&gt; </w:t>
+      </w:r>
+      <w:proofErr w:type="spellStart"/>
+      <w:proofErr w:type="gramStart"/>
+      <w:r>
+        <w:t>x.ApproverRemarks</w:t>
+      </w:r>
+      <w:proofErr w:type="spellEnd"/>
+      <w:proofErr w:type="gramEnd"/>
+      <w:r>
+        <w:t xml:space="preserve">" </w:t>
+      </w:r>
+      <w:r>
+        <w:rPr>
+          <w:b/>
+          <w:bCs/>
+        </w:rPr>
+        <w:t>Title</w:t>
+      </w:r>
+      <w:r>
+        <w:t xml:space="preserve">="Remarks" </w:t>
+      </w:r>
+      <w:r>
+        <w:rPr>
+          <w:b/>
+          <w:bCs/>
+        </w:rPr>
+        <w:t>Class</w:t>
+      </w:r>
+      <w:r>
+        <w:t>="col-</w:t>
+      </w:r>
+      <w:proofErr w:type="spellStart"/>
+      <w:r>
+        <w:t>ApproverRemarks</w:t>
+      </w:r>
+      <w:proofErr w:type="spellEnd"/>
+      <w:r>
+        <w:t>"&gt;</w:t>
+      </w:r>
+    </w:p>
+    <w:p>
+      <w:pPr>
+        <w:spacing w:after="0"/>
+      </w:pPr>
+      <w:r>
+        <w:t xml:space="preserve">            &lt;</w:t>
+      </w:r>
+      <w:proofErr w:type="spellStart"/>
+      <w:r>
+        <w:rPr>
+          <w:b/>
+          <w:bCs/>
+        </w:rPr>
+        <w:t>EditTemplate</w:t>
+      </w:r>
+      <w:proofErr w:type="spellEnd"/>
+      <w:r>
+        <w:t xml:space="preserve"> </w:t>
+      </w:r>
+      <w:r>
+        <w:rPr>
+          <w:b/>
+          <w:bCs/>
+        </w:rPr>
+        <w:t>Context</w:t>
+      </w:r>
+      <w:r>
+        <w:t>="row"&gt;</w:t>
+      </w:r>
+    </w:p>
+    <w:p>
+      <w:pPr>
+        <w:spacing w:after="0"/>
+      </w:pPr>
+      <w:r>
+        <w:t xml:space="preserve">                &lt;</w:t>
+      </w:r>
+      <w:proofErr w:type="spellStart"/>
+      <w:r>
+        <w:rPr>
+          <w:b/>
+          <w:bCs/>
+        </w:rPr>
+        <w:t>MudTextField</w:t>
+      </w:r>
+      <w:proofErr w:type="spellEnd"/>
+      <w:r>
+        <w:t xml:space="preserve"> @bind-Value="@</w:t>
+      </w:r>
+      <w:proofErr w:type="gramStart"/>
+      <w:r>
+        <w:t>row.Item.ApproverRemarks</w:t>
+      </w:r>
+      <w:proofErr w:type="gramEnd"/>
+      <w:r>
+        <w:t xml:space="preserve">" </w:t>
+      </w:r>
+    </w:p>
+    <w:p>
+      <w:pPr>
+        <w:spacing w:after="0"/>
+      </w:pPr>
+      <w:r>
+        <w:t xml:space="preserve">                              </w:t>
+      </w:r>
+      <w:r>
+        <w:rPr>
+          <w:b/>
+          <w:bCs/>
+        </w:rPr>
+        <w:t>For</w:t>
+      </w:r>
+      <w:r>
+        <w:t>="</w:t>
+      </w:r>
+      <w:proofErr w:type="gramStart"/>
+      <w:r>
+        <w:t>@(</w:t>
+      </w:r>
+      <w:proofErr w:type="gramEnd"/>
+      <w:r>
+        <w:t xml:space="preserve">() =&gt; </w:t>
+      </w:r>
+      <w:proofErr w:type="spellStart"/>
+      <w:proofErr w:type="gramStart"/>
+      <w:r>
+        <w:t>row.Item.ApproverRemarks</w:t>
+      </w:r>
+      <w:proofErr w:type="spellEnd"/>
+      <w:proofErr w:type="gramEnd"/>
+      <w:r>
+        <w:t>)"</w:t>
+      </w:r>
+    </w:p>
+    <w:p>
+      <w:pPr>
+        <w:spacing w:after="0"/>
+      </w:pPr>
+      <w:r>
+        <w:t xml:space="preserve">                              </w:t>
+      </w:r>
+      <w:proofErr w:type="spellStart"/>
+      <w:r>
+        <w:rPr>
+          <w:b/>
+          <w:bCs/>
+        </w:rPr>
+        <w:t>HelperText</w:t>
+      </w:r>
+      <w:proofErr w:type="spellEnd"/>
+      <w:r>
+        <w:t>="Max. text input is 300 chars."</w:t>
+      </w:r>
+    </w:p>
+    <w:p>
+      <w:pPr>
+        <w:spacing w:after="0"/>
+      </w:pPr>
+      <w:r>
+        <w:t xml:space="preserve">                              </w:t>
+      </w:r>
+      <w:r>
+        <w:rPr>
+          <w:b/>
+          <w:bCs/>
+        </w:rPr>
+        <w:t>Variant</w:t>
+      </w:r>
+      <w:r>
+        <w:t>="</w:t>
+      </w:r>
+      <w:proofErr w:type="spellStart"/>
+      <w:r>
+        <w:t>Variant.Text</w:t>
+      </w:r>
+      <w:proofErr w:type="spellEnd"/>
+      <w:r>
+        <w:t xml:space="preserve">" </w:t>
+      </w:r>
+      <w:proofErr w:type="spellStart"/>
+      <w:r>
+        <w:rPr>
+          <w:b/>
+          <w:bCs/>
+        </w:rPr>
+        <w:t>HelperTextOnFocus</w:t>
+      </w:r>
+      <w:proofErr w:type="spellEnd"/>
+      <w:r>
+        <w:t xml:space="preserve">="true" </w:t>
+      </w:r>
+      <w:r>
+        <w:rPr>
+          <w:b/>
+          <w:bCs/>
+        </w:rPr>
+        <w:t>Counter</w:t>
+      </w:r>
+      <w:r>
+        <w:t xml:space="preserve">="300" </w:t>
+      </w:r>
+      <w:proofErr w:type="spellStart"/>
+      <w:r>
+        <w:rPr>
+          <w:b/>
+          <w:bCs/>
+        </w:rPr>
+        <w:t>MaxLength</w:t>
+      </w:r>
+      <w:proofErr w:type="spellEnd"/>
+      <w:r>
+        <w:t xml:space="preserve">="300" </w:t>
+      </w:r>
+      <w:r>
+        <w:rPr>
+          <w:b/>
+          <w:bCs/>
+        </w:rPr>
+        <w:t>Lines</w:t>
+      </w:r>
+      <w:r>
+        <w:t>="2"</w:t>
+      </w:r>
+    </w:p>
+    <w:p>
+      <w:pPr>
+        <w:spacing w:after="0"/>
+      </w:pPr>
+      <w:r>
+        <w:t xml:space="preserve">                              </w:t>
+      </w:r>
+      <w:r>
+        <w:rPr>
+          <w:b/>
+          <w:bCs/>
+        </w:rPr>
+        <w:t>Clearable</w:t>
+      </w:r>
+      <w:r>
+        <w:t xml:space="preserve">="true" </w:t>
+      </w:r>
+      <w:r>
+        <w:rPr>
+          <w:b/>
+          <w:bCs/>
+        </w:rPr>
+        <w:t>Immediate</w:t>
+      </w:r>
+      <w:r>
+        <w:t xml:space="preserve">="true" </w:t>
+      </w:r>
+      <w:r>
+        <w:rPr>
+          <w:b/>
+          <w:bCs/>
+        </w:rPr>
+        <w:t>Margin</w:t>
+      </w:r>
+      <w:r>
+        <w:t>="</w:t>
+      </w:r>
+      <w:proofErr w:type="spellStart"/>
+      <w:r>
+        <w:t>Margin.Dense</w:t>
+      </w:r>
+      <w:proofErr w:type="spellEnd"/>
+      <w:r>
+        <w:t xml:space="preserve">" </w:t>
+      </w:r>
+      <w:r>
+        <w:rPr>
+          <w:b/>
+          <w:bCs/>
+        </w:rPr>
+        <w:t>Typo</w:t>
+      </w:r>
+      <w:r>
+        <w:t>="Typo.subtitle2" /&gt;</w:t>
+      </w:r>
+    </w:p>
+    <w:p>
+      <w:pPr>
+        <w:spacing w:after="0"/>
+      </w:pPr>
+      <w:r>
+        <w:t xml:space="preserve">            &lt;/</w:t>
+      </w:r>
+      <w:proofErr w:type="spellStart"/>
+      <w:r>
+        <w:rPr>
+          <w:b/>
+          <w:bCs/>
+        </w:rPr>
+        <w:t>EditTemplate</w:t>
+      </w:r>
+      <w:proofErr w:type="spellEnd"/>
+      <w:r>
+        <w:t>&gt;</w:t>
+      </w:r>
+    </w:p>
+    <w:p>
+      <w:pPr>
+        <w:spacing w:after="0"/>
+      </w:pPr>
+      <w:r>
+        <w:t xml:space="preserve">        &lt;/</w:t>
+      </w:r>
+      <w:proofErr w:type="spellStart"/>
+      <w:r>
+        <w:rPr>
+          <w:b/>
+          <w:bCs/>
+        </w:rPr>
+        <w:t>PropertyColumn</w:t>
+      </w:r>
+      <w:proofErr w:type="spellEnd"/>
+      <w:r>
+        <w:t xml:space="preserve">&gt;                                        </w:t>
+      </w:r>
+    </w:p>
+    <w:p>
+      <w:pPr>
+        <w:spacing w:after="0"/>
+      </w:pPr>
+      <w:r>
+        <w:t xml:space="preserve">        &lt;</w:t>
+      </w:r>
+      <w:proofErr w:type="spellStart"/>
+      <w:r>
+        <w:rPr>
+          <w:b/>
+          <w:bCs/>
+        </w:rPr>
+        <w:t>TemplateColumn</w:t>
+      </w:r>
+      <w:proofErr w:type="spellEnd"/>
+      <w:r>
+        <w:t xml:space="preserve"> </w:t>
+      </w:r>
+      <w:proofErr w:type="spellStart"/>
+      <w:r>
+        <w:rPr>
+          <w:b/>
+          <w:bCs/>
+        </w:rPr>
+        <w:t>CellClass</w:t>
+      </w:r>
+      <w:proofErr w:type="spellEnd"/>
+      <w:r>
+        <w:t>="d-flex justify-end"&gt;</w:t>
+      </w:r>
+    </w:p>
+    <w:p>
+      <w:pPr>
+        <w:spacing w:after="0"/>
+      </w:pPr>
+      <w:r>
+        <w:t xml:space="preserve">            &lt;</w:t>
+      </w:r>
+      <w:proofErr w:type="spellStart"/>
+      <w:r>
+        <w:rPr>
+          <w:b/>
+          <w:bCs/>
+        </w:rPr>
+        <w:t>EditTemplate</w:t>
+      </w:r>
+      <w:proofErr w:type="spellEnd"/>
+      <w:r>
+        <w:t xml:space="preserve"> </w:t>
+      </w:r>
+      <w:r>
+        <w:rPr>
+          <w:b/>
+          <w:bCs/>
+        </w:rPr>
+        <w:t>Context</w:t>
+      </w:r>
+      <w:r>
+        <w:t>="row"&gt;</w:t>
+      </w:r>
+    </w:p>
+    <w:p>
+      <w:pPr>
+        <w:spacing w:after="0"/>
+      </w:pPr>
+      <w:r>
+        <w:t xml:space="preserve">                &lt;</w:t>
+      </w:r>
+      <w:proofErr w:type="spellStart"/>
+      <w:r>
+        <w:rPr>
+          <w:b/>
+          <w:bCs/>
+        </w:rPr>
+        <w:t>MudStack</w:t>
+      </w:r>
+      <w:proofErr w:type="spellEnd"/>
+      <w:r>
+        <w:t xml:space="preserve"> </w:t>
+      </w:r>
+      <w:r>
+        <w:rPr>
+          <w:b/>
+          <w:bCs/>
+        </w:rPr>
+        <w:t>Row</w:t>
+      </w:r>
+      <w:r>
+        <w:t xml:space="preserve"> </w:t>
+      </w:r>
+      <w:proofErr w:type="spellStart"/>
+      <w:r>
+        <w:rPr>
+          <w:b/>
+          <w:bCs/>
+        </w:rPr>
+        <w:t>AlignItems</w:t>
+      </w:r>
+      <w:proofErr w:type="spellEnd"/>
+      <w:r>
+        <w:t>="</w:t>
+      </w:r>
+      <w:proofErr w:type="spellStart"/>
+      <w:r>
+        <w:t>AlignItems.End</w:t>
+      </w:r>
+      <w:proofErr w:type="spellEnd"/>
+      <w:r>
+        <w:t xml:space="preserve">" </w:t>
+      </w:r>
+      <w:r>
+        <w:rPr>
+          <w:b/>
+          <w:bCs/>
+        </w:rPr>
+        <w:t>Justify</w:t>
+      </w:r>
+      <w:r>
+        <w:t>="</w:t>
+      </w:r>
+      <w:proofErr w:type="spellStart"/>
+      <w:r>
+        <w:t>Justify.FlexStart</w:t>
+      </w:r>
+      <w:proofErr w:type="spellEnd"/>
+      <w:r>
+        <w:t xml:space="preserve">" </w:t>
+      </w:r>
+      <w:r>
+        <w:rPr>
+          <w:b/>
+          <w:bCs/>
+        </w:rPr>
+        <w:t>Spacing</w:t>
+      </w:r>
+      <w:r>
+        <w:t>="2"&gt;</w:t>
+      </w:r>
+    </w:p>
+    <w:p>
+      <w:pPr>
+        <w:spacing w:after="0"/>
+      </w:pPr>
+      <w:r>
+        <w:t xml:space="preserve">                     &lt;</w:t>
+      </w:r>
+      <w:proofErr w:type="spellStart"/>
+      <w:r>
+        <w:rPr>
+          <w:b/>
+          <w:bCs/>
+        </w:rPr>
+        <w:t>MudIconButton</w:t>
+      </w:r>
+      <w:proofErr w:type="spellEnd"/>
+      <w:r>
+        <w:t xml:space="preserve"> </w:t>
+      </w:r>
+      <w:r>
+        <w:rPr>
+          <w:b/>
+          <w:bCs/>
+        </w:rPr>
+        <w:t>Color</w:t>
+      </w:r>
+      <w:r>
+        <w:t>="</w:t>
+      </w:r>
+      <w:proofErr w:type="spellStart"/>
+      <w:r>
+        <w:t>Color.Success</w:t>
+      </w:r>
+      <w:proofErr w:type="spellEnd"/>
+      <w:r>
+        <w:t xml:space="preserve">" title="Approve request" </w:t>
+      </w:r>
+      <w:r>
+        <w:rPr>
+          <w:b/>
+          <w:bCs/>
+        </w:rPr>
+        <w:t>Size</w:t>
+      </w:r>
+      <w:r>
+        <w:t>="</w:t>
+      </w:r>
+      <w:proofErr w:type="spellStart"/>
+      <w:r>
+        <w:t>Size.Small</w:t>
+      </w:r>
+      <w:proofErr w:type="spellEnd"/>
+      <w:r>
+        <w:t>"</w:t>
+      </w:r>
+    </w:p>
+    <w:p>
+      <w:pPr>
+        <w:spacing w:after="0"/>
+      </w:pPr>
+      <w:r>
+        <w:t xml:space="preserve">                                    </w:t>
+      </w:r>
+      <w:r>
+        <w:rPr>
+          <w:b/>
+          <w:bCs/>
+        </w:rPr>
+        <w:t>Icon</w:t>
+      </w:r>
+      <w:r>
+        <w:t>="</w:t>
+      </w:r>
+      <w:proofErr w:type="spellStart"/>
+      <w:r>
+        <w:t>fas</w:t>
+      </w:r>
+      <w:proofErr w:type="spellEnd"/>
+      <w:r>
+        <w:t xml:space="preserve"> fa-thumbs-up"</w:t>
+      </w:r>
+    </w:p>
+    <w:p>
+      <w:pPr>
+        <w:spacing w:after="0"/>
+      </w:pPr>
+      <w:r>
+        <w:t xml:space="preserve">                                    </w:t>
+      </w:r>
+      <w:proofErr w:type="spellStart"/>
+      <w:r>
+        <w:rPr>
+          <w:b/>
+          <w:bCs/>
+        </w:rPr>
+        <w:t>OnClick</w:t>
+      </w:r>
+      <w:proofErr w:type="spellEnd"/>
+      <w:r>
+        <w:t>="</w:t>
+      </w:r>
+      <w:proofErr w:type="gramStart"/>
+      <w:r>
+        <w:t>@(</w:t>
+      </w:r>
+      <w:proofErr w:type="gramEnd"/>
+      <w:r>
+        <w:t xml:space="preserve">() =&gt; </w:t>
+      </w:r>
+      <w:proofErr w:type="spellStart"/>
+      <w:r>
+        <w:t>BeginApproveRequest</w:t>
+      </w:r>
+      <w:proofErr w:type="spellEnd"/>
+      <w:r>
+        <w:t>(</w:t>
+      </w:r>
+      <w:proofErr w:type="spellStart"/>
+      <w:proofErr w:type="gramStart"/>
+      <w:r>
+        <w:t>row.Item</w:t>
+      </w:r>
+      <w:proofErr w:type="spellEnd"/>
+      <w:proofErr w:type="gramEnd"/>
+      <w:r>
+        <w:t>))"&gt;</w:t>
+      </w:r>
+    </w:p>
+    <w:p>
+      <w:pPr>
+        <w:spacing w:after="0"/>
+      </w:pPr>
+      <w:r>
+        <w:t xml:space="preserve">                     &lt;/</w:t>
+      </w:r>
+      <w:proofErr w:type="spellStart"/>
+      <w:r>
+        <w:rPr>
+          <w:b/>
+          <w:bCs/>
+        </w:rPr>
+        <w:t>MudIconButton</w:t>
+      </w:r>
+      <w:proofErr w:type="spellEnd"/>
+      <w:r>
+        <w:t>&gt;</w:t>
+      </w:r>
+    </w:p>
+    <w:p>
+      <w:pPr>
+        <w:spacing w:after="0"/>
+      </w:pPr>
+      <w:r>
+        <w:t xml:space="preserve">                     &lt;</w:t>
+      </w:r>
+      <w:proofErr w:type="spellStart"/>
+      <w:r>
+        <w:rPr>
+          <w:b/>
+          <w:bCs/>
+        </w:rPr>
+        <w:t>MudIconButton</w:t>
+      </w:r>
+      <w:proofErr w:type="spellEnd"/>
+      <w:r>
+        <w:t xml:space="preserve"> </w:t>
+      </w:r>
+      <w:r>
+        <w:rPr>
+          <w:b/>
+          <w:bCs/>
+        </w:rPr>
+        <w:t>Color</w:t>
+      </w:r>
+      <w:r>
+        <w:t>="</w:t>
+      </w:r>
+      <w:proofErr w:type="spellStart"/>
+      <w:r>
+        <w:t>Color.Error</w:t>
+      </w:r>
+      <w:proofErr w:type="spellEnd"/>
+      <w:r>
+        <w:t xml:space="preserve">" title="Reject request" </w:t>
+      </w:r>
+      <w:r>
+        <w:rPr>
+          <w:b/>
+          <w:bCs/>
+        </w:rPr>
+        <w:t>Size</w:t>
+      </w:r>
+      <w:r>
+        <w:t>="</w:t>
+      </w:r>
+      <w:proofErr w:type="spellStart"/>
+      <w:r>
+        <w:t>Size.Small</w:t>
+      </w:r>
+      <w:proofErr w:type="spellEnd"/>
+      <w:r>
+        <w:t>"</w:t>
+      </w:r>
+    </w:p>
+    <w:p>
+      <w:pPr>
+        <w:spacing w:after="0"/>
+      </w:pPr>
+      <w:r>
+        <w:t xml:space="preserve">                                    </w:t>
+      </w:r>
+      <w:r>
+        <w:rPr>
+          <w:b/>
+          <w:bCs/>
+        </w:rPr>
+        <w:t>Icon</w:t>
+      </w:r>
+      <w:r>
+        <w:t>="</w:t>
+      </w:r>
+      <w:proofErr w:type="spellStart"/>
+      <w:r>
+        <w:t>fas</w:t>
+      </w:r>
+      <w:proofErr w:type="spellEnd"/>
+      <w:r>
+        <w:t xml:space="preserve"> fa-thumbs-down"</w:t>
+      </w:r>
+    </w:p>
+    <w:p>
+      <w:pPr>
+        <w:spacing w:after="0"/>
+      </w:pPr>
+      <w:r>
+        <w:t xml:space="preserve">                                    </w:t>
+      </w:r>
+      <w:proofErr w:type="spellStart"/>
+      <w:r>
+        <w:rPr>
+          <w:b/>
+          <w:bCs/>
+        </w:rPr>
+        <w:t>OnClick</w:t>
+      </w:r>
+      <w:proofErr w:type="spellEnd"/>
+      <w:r>
+        <w:t xml:space="preserve">="() =&gt; </w:t>
+      </w:r>
+      <w:proofErr w:type="spellStart"/>
+      <w:r>
+        <w:t>BeginRejectRequest</w:t>
+      </w:r>
+      <w:proofErr w:type="spellEnd"/>
+      <w:r>
+        <w:t>(</w:t>
+      </w:r>
+      <w:proofErr w:type="spellStart"/>
+      <w:proofErr w:type="gramStart"/>
+      <w:r>
+        <w:t>row.Item</w:t>
+      </w:r>
+      <w:proofErr w:type="spellEnd"/>
+      <w:proofErr w:type="gramEnd"/>
+      <w:r>
+        <w:t>)"&gt;</w:t>
+      </w:r>
+    </w:p>
+    <w:p>
+      <w:pPr>
+        <w:spacing w:after="0"/>
+      </w:pPr>
+      <w:r>
+        <w:t xml:space="preserve">                     &lt;/</w:t>
+      </w:r>
+      <w:proofErr w:type="spellStart"/>
+      <w:r>
+        <w:rPr>
+          <w:b/>
+          <w:bCs/>
+        </w:rPr>
+        <w:t>MudIconButton</w:t>
+      </w:r>
+      <w:proofErr w:type="spellEnd"/>
+      <w:r>
+        <w:t>&gt;</w:t>
+      </w:r>
+    </w:p>
+    <w:p>
+      <w:pPr>
+        <w:spacing w:after="0"/>
+      </w:pPr>
+      <w:r>
+        <w:t xml:space="preserve">                     &lt;</w:t>
+      </w:r>
+      <w:proofErr w:type="spellStart"/>
+      <w:r>
+        <w:rPr>
+          <w:b/>
+          <w:bCs/>
+        </w:rPr>
+        <w:t>MudIconButton</w:t>
+      </w:r>
+      <w:proofErr w:type="spellEnd"/>
+      <w:r>
+        <w:t xml:space="preserve"> </w:t>
+      </w:r>
+      <w:r>
+        <w:rPr>
+          <w:b/>
+          <w:bCs/>
+        </w:rPr>
+        <w:t>Color</w:t>
+      </w:r>
+      <w:r>
+        <w:t>="</w:t>
+      </w:r>
+      <w:proofErr w:type="spellStart"/>
+      <w:r>
+        <w:t>Color.Info</w:t>
+      </w:r>
+      <w:proofErr w:type="spellEnd"/>
+      <w:r>
+        <w:t xml:space="preserve">" title="View request" </w:t>
+      </w:r>
+      <w:r>
+        <w:rPr>
+          <w:b/>
+          <w:bCs/>
+        </w:rPr>
+        <w:t>Size</w:t>
+      </w:r>
+      <w:r>
+        <w:t>="</w:t>
+      </w:r>
+      <w:proofErr w:type="spellStart"/>
+      <w:r>
+        <w:t>Size.Small</w:t>
+      </w:r>
+      <w:proofErr w:type="spellEnd"/>
+      <w:r>
+        <w:t>"</w:t>
+      </w:r>
+    </w:p>
+    <w:p>
+      <w:pPr>
+        <w:spacing w:after="0"/>
+      </w:pPr>
+      <w:r>
+        <w:t xml:space="preserve">                                    </w:t>
+      </w:r>
+      <w:r>
+        <w:rPr>
+          <w:b/>
+          <w:bCs/>
+        </w:rPr>
+        <w:t>Icon</w:t>
+      </w:r>
+      <w:r>
+        <w:t>="</w:t>
+      </w:r>
+      <w:proofErr w:type="spellStart"/>
+      <w:r>
+        <w:t>fas</w:t>
+      </w:r>
+      <w:proofErr w:type="spellEnd"/>
+      <w:r>
+        <w:t xml:space="preserve"> fa-eye"</w:t>
+      </w:r>
+    </w:p>
+    <w:p>
+      <w:pPr>
+        <w:spacing w:after="0"/>
+      </w:pPr>
+      <w:r>
+        <w:t xml:space="preserve">                                    </w:t>
+      </w:r>
+      <w:proofErr w:type="spellStart"/>
+      <w:r>
+        <w:rPr>
+          <w:b/>
+          <w:bCs/>
+        </w:rPr>
+        <w:t>OnClick</w:t>
+      </w:r>
+      <w:proofErr w:type="spellEnd"/>
+      <w:r>
+        <w:t>="</w:t>
+      </w:r>
+      <w:proofErr w:type="gramStart"/>
+      <w:r>
+        <w:t>@(</w:t>
+      </w:r>
+      <w:proofErr w:type="gramEnd"/>
+      <w:r>
+        <w:t xml:space="preserve">() =&gt; </w:t>
+      </w:r>
+      <w:proofErr w:type="spellStart"/>
+      <w:r>
+        <w:t>OpenLeaveRequest</w:t>
+      </w:r>
+      <w:proofErr w:type="spellEnd"/>
+      <w:r>
+        <w:t>(</w:t>
+      </w:r>
+      <w:proofErr w:type="spellStart"/>
+      <w:proofErr w:type="gramStart"/>
+      <w:r>
+        <w:t>row.Item</w:t>
+      </w:r>
+      <w:proofErr w:type="spellEnd"/>
+      <w:proofErr w:type="gramEnd"/>
+      <w:r>
+        <w:t>))"&gt;</w:t>
+      </w:r>
+    </w:p>
+    <w:p>
+      <w:pPr>
+        <w:spacing w:after="0"/>
+      </w:pPr>
+      <w:r>
+        <w:lastRenderedPageBreak/>
+        <w:t xml:space="preserve">                     &lt;/</w:t>
+      </w:r>
+      <w:proofErr w:type="spellStart"/>
+      <w:r>
+        <w:rPr>
+          <w:b/>
+          <w:bCs/>
+        </w:rPr>
+        <w:t>MudIconButton</w:t>
+      </w:r>
+      <w:proofErr w:type="spellEnd"/>
+      <w:r>
+        <w:t>&gt;</w:t>
+      </w:r>
+    </w:p>
+    <w:p>
+      <w:pPr>
+        <w:spacing w:after="0"/>
+      </w:pPr>
+      <w:r>
+        <w:t xml:space="preserve">                &lt;/</w:t>
+      </w:r>
+      <w:proofErr w:type="spellStart"/>
+      <w:r>
+        <w:rPr>
+          <w:b/>
+          <w:bCs/>
+        </w:rPr>
+        <w:t>MudStack</w:t>
+      </w:r>
+      <w:proofErr w:type="spellEnd"/>
+      <w:r>
+        <w:t xml:space="preserve">&gt;                                                                                          </w:t>
+      </w:r>
+    </w:p>
+    <w:p>
+      <w:pPr>
+        <w:spacing w:after="0"/>
+      </w:pPr>
+      <w:r>
+        <w:t xml:space="preserve">            &lt;/</w:t>
+      </w:r>
+      <w:proofErr w:type="spellStart"/>
+      <w:r>
+        <w:rPr>
+          <w:b/>
+          <w:bCs/>
+        </w:rPr>
+        <w:t>EditTemplate</w:t>
+      </w:r>
+      <w:proofErr w:type="spellEnd"/>
+      <w:r>
+        <w:t>&gt;</w:t>
+      </w:r>
+    </w:p>
+    <w:p>
+      <w:pPr>
+        <w:spacing w:after="0"/>
+      </w:pPr>
+      <w:r>
+        <w:t xml:space="preserve">        &lt;/</w:t>
+      </w:r>
+      <w:proofErr w:type="spellStart"/>
+      <w:r>
+        <w:rPr>
+          <w:b/>
+          <w:bCs/>
+        </w:rPr>
+        <w:t>TemplateColumn</w:t>
+      </w:r>
+      <w:proofErr w:type="spellEnd"/>
+      <w:r>
+        <w:t>&gt;</w:t>
+      </w:r>
+    </w:p>
+    <w:p>
+      <w:pPr>
+        <w:spacing w:after="0"/>
+      </w:pPr>
+      <w:r>
+        <w:t xml:space="preserve">    &lt;/</w:t>
+      </w:r>
+      <w:r>
+        <w:rPr>
+          <w:b/>
+          <w:bCs/>
+        </w:rPr>
+        <w:t>Columns</w:t>
+      </w:r>
+      <w:r>
+        <w:t>&gt;</w:t>
+      </w:r>
+    </w:p>
+    <w:p>
+      <w:pPr>
+        <w:spacing w:after="0"/>
+      </w:pPr>
+      <w:r>
+        <w:t xml:space="preserve">    &lt;</w:t>
+      </w:r>
+      <w:proofErr w:type="spellStart"/>
+      <w:r>
+        <w:rPr>
+          <w:b/>
+          <w:bCs/>
+        </w:rPr>
+        <w:t>NoRecordsContent</w:t>
+      </w:r>
+      <w:proofErr w:type="spellEnd"/>
+      <w:r>
+        <w:t>&gt;</w:t>
+      </w:r>
+    </w:p>
+    <w:p>
+      <w:pPr>
+        <w:spacing w:after="0"/>
+      </w:pPr>
+      <w:r>
+        <w:t xml:space="preserve">        &lt;div class="no-data-box"&gt;</w:t>
+      </w:r>
+    </w:p>
+    <w:p>
+      <w:pPr>
+        <w:spacing w:after="0"/>
+      </w:pPr>
+      <w:r>
+        <w:t xml:space="preserve">            &lt;</w:t>
+      </w:r>
+      <w:proofErr w:type="spellStart"/>
+      <w:r>
+        <w:rPr>
+          <w:b/>
+          <w:bCs/>
+        </w:rPr>
+        <w:t>MudIcon</w:t>
+      </w:r>
+      <w:proofErr w:type="spellEnd"/>
+      <w:r>
+        <w:t xml:space="preserve"> </w:t>
+      </w:r>
+      <w:r>
+        <w:rPr>
+          <w:b/>
+          <w:bCs/>
+        </w:rPr>
+        <w:t>Icon</w:t>
+      </w:r>
+      <w:r>
+        <w:t>="@</w:t>
+      </w:r>
+      <w:proofErr w:type="spellStart"/>
+      <w:proofErr w:type="gramStart"/>
+      <w:r>
+        <w:t>Icons.Material.Filled.Info</w:t>
+      </w:r>
+      <w:proofErr w:type="spellEnd"/>
+      <w:proofErr w:type="gramEnd"/>
+      <w:r>
+        <w:t xml:space="preserve">" </w:t>
+      </w:r>
+      <w:r>
+        <w:rPr>
+          <w:b/>
+          <w:bCs/>
+        </w:rPr>
+        <w:t>Class</w:t>
+      </w:r>
+      <w:r>
+        <w:t>="no-data-icon" /&gt;</w:t>
+      </w:r>
+    </w:p>
+    <w:p>
+      <w:pPr>
+        <w:spacing w:after="0"/>
+      </w:pPr>
+      <w:r>
+        <w:t xml:space="preserve">            &lt;span&gt;No data found&lt;/span&gt;</w:t>
+      </w:r>
+    </w:p>
+    <w:p>
+      <w:pPr>
+        <w:spacing w:after="0"/>
+      </w:pPr>
+      <w:r>
+        <w:t xml:space="preserve">        &lt;/div&gt;</w:t>
+      </w:r>
+    </w:p>
+    <w:p>
+      <w:pPr>
+        <w:spacing w:after="0"/>
+      </w:pPr>
+      <w:r>
+        <w:t xml:space="preserve">    &lt;/</w:t>
+      </w:r>
+      <w:proofErr w:type="spellStart"/>
+      <w:r>
+        <w:rPr>
+          <w:b/>
+          <w:bCs/>
+        </w:rPr>
+        <w:t>NoRecordsContent</w:t>
+      </w:r>
+      <w:proofErr w:type="spellEnd"/>
+      <w:r>
+        <w:t>&gt;</w:t>
+      </w:r>
+    </w:p>
+    <w:p>
+      <w:pPr>
+        <w:spacing w:after="0"/>
+      </w:pPr>
+      <w:r>
+        <w:t xml:space="preserve">    &lt;</w:t>
+      </w:r>
+      <w:proofErr w:type="spellStart"/>
+      <w:r>
+        <w:rPr>
+          <w:b/>
+          <w:bCs/>
+        </w:rPr>
+        <w:t>PagerContent</w:t>
+      </w:r>
+      <w:proofErr w:type="spellEnd"/>
+      <w:r>
+        <w:t>&gt;</w:t>
+      </w:r>
+    </w:p>
+    <w:p>
+      <w:pPr>
+        <w:spacing w:after="0"/>
+      </w:pPr>
+      <w:r>
+        <w:t xml:space="preserve">        &lt;</w:t>
+      </w:r>
+      <w:proofErr w:type="spellStart"/>
+      <w:r>
+        <w:rPr>
+          <w:b/>
+          <w:bCs/>
+        </w:rPr>
+        <w:t>MudDataGridPager</w:t>
+      </w:r>
+      <w:proofErr w:type="spellEnd"/>
+      <w:r>
+        <w:t xml:space="preserve"> </w:t>
+      </w:r>
+      <w:r>
+        <w:rPr>
+          <w:b/>
+          <w:bCs/>
+        </w:rPr>
+        <w:t>T</w:t>
+      </w:r>
+      <w:r>
+        <w:t>="</w:t>
+      </w:r>
+      <w:proofErr w:type="spellStart"/>
+      <w:r>
+        <w:t>ApprovalRequestResultDTO</w:t>
+      </w:r>
+      <w:proofErr w:type="spellEnd"/>
+      <w:r>
+        <w:t xml:space="preserve">" </w:t>
+      </w:r>
+      <w:proofErr w:type="spellStart"/>
+      <w:r>
+        <w:rPr>
+          <w:b/>
+          <w:bCs/>
+        </w:rPr>
+        <w:t>PageSizeOptions</w:t>
+      </w:r>
+      <w:proofErr w:type="spellEnd"/>
+      <w:r>
+        <w:t xml:space="preserve">="new </w:t>
+      </w:r>
+      <w:proofErr w:type="gramStart"/>
+      <w:r>
+        <w:t>int[</w:t>
+      </w:r>
+      <w:proofErr w:type="gramEnd"/>
+      <w:r>
+        <w:t>] {5,10,20,50,100,500}" /&gt;</w:t>
+      </w:r>
+    </w:p>
+    <w:p>
+      <w:pPr>
+        <w:spacing w:after="0"/>
+      </w:pPr>
+      <w:r>
+        <w:t xml:space="preserve">    &lt;/</w:t>
+      </w:r>
+      <w:proofErr w:type="spellStart"/>
+      <w:r>
+        <w:rPr>
+          <w:b/>
+          <w:bCs/>
+        </w:rPr>
+        <w:t>PagerContent</w:t>
+      </w:r>
+      <w:proofErr w:type="spellEnd"/>
+      <w:r>
+        <w:t>&gt;</w:t>
+      </w:r>
+    </w:p>
+    <w:p>
+      <w:pPr>
+        <w:spacing w:after="0"/>
+      </w:pPr>
+      <w:r>
+        <w:t>&lt;/</w:t>
+      </w:r>
+      <w:proofErr w:type="spellStart"/>
+      <w:r>
+        <w:rPr>
+          <w:b/>
+          <w:bCs/>
+        </w:rPr>
+        <w:t>MudDataGrid</w:t>
+      </w:r>
+      <w:proofErr w:type="spellEnd"/>
+      <w:r>
+        <w:t>&gt;</w:t>
+      </w:r>
+    </w:p>
+    <w:p>
+      <w:pPr>
+        <w:spacing w:after="0"/>
+      </w:pPr>
+    </w:p>
+    <w:p>
+      <w:pPr>
+        <w:spacing w:after="0"/>
+      </w:pPr>
+      <w:r>
+        <w:t>Prompt #4:</w:t>
+      </w:r>
+    </w:p>
+    <w:p>
+      <w:pPr>
+        <w:spacing w:after="0"/>
+      </w:pPr>
+      <w:r>
+        <w:t xml:space="preserve">The bottom border line has been removed. Now, tell me how to align these action buttons vertically center on the </w:t>
+      </w:r>
+      <w:proofErr w:type="spellStart"/>
+      <w:r>
+        <w:t>datagrid</w:t>
+      </w:r>
+      <w:proofErr w:type="spellEnd"/>
+      <w:r>
+        <w:t xml:space="preserve"> row.</w:t>
       </w:r>
     </w:p>
     <w:sectPr>

</xml_diff>

<commit_message>
Implemented code for fetching the list of approved, rejected, and on-hold workflows from the database.
</commit_message>
<xml_diff>
--- a/Documentation/AI Prompts/Vibe Coding - Pending Request Dashboard.docx
+++ b/Documentation/AI Prompts/Vibe Coding - Pending Request Dashboard.docx
@@ -399,6 +399,7 @@
         <w:t xml:space="preserve">                &lt;</w:t>
       </w:r>
       <w:proofErr w:type="spellStart"/>
+      <w:proofErr w:type="gramStart"/>
       <w:r>
         <w:rPr>
           <w:b/>
@@ -408,7 +409,11 @@
       </w:r>
       <w:proofErr w:type="spellEnd"/>
       <w:r>
-        <w:t xml:space="preserve"> @bind-icon="</w:t>
+        <w:t xml:space="preserve"> @</w:t>
+      </w:r>
+      <w:proofErr w:type="gramEnd"/>
+      <w:r>
+        <w:t>bind-icon="</w:t>
       </w:r>
       <w:proofErr w:type="gramStart"/>
       <w:r>
@@ -653,11 +658,19 @@
       </w:r>
       <w:proofErr w:type="spellStart"/>
       <w:r>
-        <w:t>Variant.Filled</w:t>
-      </w:r>
-      <w:proofErr w:type="spellEnd"/>
-      <w:r>
-        <w:t>" @bind-Text="</w:t>
+        <w:t>Variant.</w:t>
+      </w:r>
+      <w:proofErr w:type="gramStart"/>
+      <w:r>
+        <w:t>Filled</w:t>
+      </w:r>
+      <w:proofErr w:type="spellEnd"/>
+      <w:r>
+        <w:t>" @</w:t>
+      </w:r>
+      <w:proofErr w:type="gramEnd"/>
+      <w:r>
+        <w:t>bind-Text="</w:t>
       </w:r>
       <w:proofErr w:type="gramStart"/>
       <w:r>
@@ -1667,11 +1680,11 @@
         <w:t>AdornmentIcon</w:t>
       </w:r>
       <w:proofErr w:type="spellEnd"/>
+      <w:proofErr w:type="gramStart"/>
       <w:r>
         <w:t>="@</w:t>
       </w:r>
       <w:proofErr w:type="spellStart"/>
-      <w:proofErr w:type="gramStart"/>
       <w:r>
         <w:t>Icons.Material.Filled.Search</w:t>
       </w:r>
@@ -1819,6 +1832,7 @@
         <w:t xml:space="preserve">            &lt;</w:t>
       </w:r>
       <w:proofErr w:type="spellStart"/>
+      <w:proofErr w:type="gramStart"/>
       <w:r>
         <w:rPr>
           <w:b/>
@@ -1828,7 +1842,11 @@
       </w:r>
       <w:proofErr w:type="spellEnd"/>
       <w:r>
-        <w:t xml:space="preserve"> @bind-Value="_enableFilter" </w:t>
+        <w:t xml:space="preserve"> @</w:t>
+      </w:r>
+      <w:proofErr w:type="gramEnd"/>
+      <w:r>
+        <w:t xml:space="preserve">bind-Value="_enableFilter" </w:t>
       </w:r>
       <w:proofErr w:type="spellStart"/>
       <w:r>
@@ -2001,11 +2019,11 @@
         <w:t>StartIcon</w:t>
       </w:r>
       <w:proofErr w:type="spellEnd"/>
+      <w:proofErr w:type="gramStart"/>
       <w:r>
         <w:t>="@</w:t>
       </w:r>
       <w:proofErr w:type="spellStart"/>
-      <w:proofErr w:type="gramStart"/>
       <w:r>
         <w:t>Icons.Material.Filled.Add</w:t>
       </w:r>
@@ -2636,8 +2654,13 @@
         <w:t>OnClick</w:t>
       </w:r>
       <w:proofErr w:type="spellEnd"/>
-      <w:r>
-        <w:t>="@(</w:t>
+      <w:proofErr w:type="gramStart"/>
+      <w:r>
+        <w:t>="@</w:t>
+      </w:r>
+      <w:proofErr w:type="gramEnd"/>
+      <w:r>
+        <w:t>(</w:t>
       </w:r>
       <w:proofErr w:type="gramStart"/>
       <w:r>
@@ -3290,7 +3313,15 @@
         <w:t>Class</w:t>
       </w:r>
       <w:r>
-        <w:t xml:space="preserve">="col-Detail" </w:t>
+        <w:t>="</w:t>
+      </w:r>
+      <w:proofErr w:type="gramStart"/>
+      <w:r>
+        <w:t>col</w:t>
+      </w:r>
+      <w:proofErr w:type="gramEnd"/>
+      <w:r>
+        <w:t xml:space="preserve">-Detail" </w:t>
       </w:r>
       <w:r>
         <w:rPr>
@@ -4401,6 +4432,7 @@
         <w:t xml:space="preserve">                &lt;</w:t>
       </w:r>
       <w:proofErr w:type="spellStart"/>
+      <w:proofErr w:type="gramStart"/>
       <w:r>
         <w:rPr>
           <w:b/>
@@ -4410,11 +4442,15 @@
       </w:r>
       <w:proofErr w:type="spellEnd"/>
       <w:r>
-        <w:t xml:space="preserve"> @bind-Value="@</w:t>
-      </w:r>
-      <w:proofErr w:type="gramStart"/>
-      <w:r>
-        <w:t>row.Item.ApproverRemarks</w:t>
+        <w:t xml:space="preserve"> @</w:t>
+      </w:r>
+      <w:proofErr w:type="gramEnd"/>
+      <w:r>
+        <w:t>bind-Value</w:t>
+      </w:r>
+      <w:proofErr w:type="gramStart"/>
+      <w:r>
+        <w:t>="@row.Item.ApproverRemarks</w:t>
       </w:r>
       <w:proofErr w:type="gramEnd"/>
       <w:r>
@@ -5352,11 +5388,11 @@
         </w:rPr>
         <w:t>Icon</w:t>
       </w:r>
+      <w:proofErr w:type="gramStart"/>
       <w:r>
         <w:t>="@</w:t>
       </w:r>
       <w:proofErr w:type="spellStart"/>
-      <w:proofErr w:type="gramStart"/>
       <w:r>
         <w:t>Icons.Material.Filled.Info</w:t>
       </w:r>
@@ -5487,7 +5523,15 @@
       </w:r>
       <w:proofErr w:type="gramEnd"/>
       <w:r>
-        <w:t>] {5,10,20,50,100,500}" /&gt;</w:t>
+        <w:t>] {5,10,20,50,</w:t>
+      </w:r>
+      <w:proofErr w:type="gramStart"/>
+      <w:r>
+        <w:t>100,500}"</w:t>
+      </w:r>
+      <w:proofErr w:type="gramEnd"/>
+      <w:r>
+        <w:t xml:space="preserve"> /&gt;</w:t>
       </w:r>
     </w:p>
     <w:p>
@@ -5538,8 +5582,20 @@
     <w:p>
       <w:pPr>
         <w:spacing w:after="0"/>
-      </w:pPr>
-      <w:r>
+        <w:rPr>
+          <w:b/>
+          <w:bCs/>
+          <w:color w:val="EE0000"/>
+          <w:u w:val="single"/>
+        </w:rPr>
+      </w:pPr>
+      <w:r>
+        <w:rPr>
+          <w:b/>
+          <w:bCs/>
+          <w:color w:val="EE0000"/>
+          <w:u w:val="single"/>
+        </w:rPr>
         <w:t>Prompt #4:</w:t>
       </w:r>
     </w:p>
@@ -5557,6 +5613,2481 @@
       <w:proofErr w:type="spellEnd"/>
       <w:r>
         <w:t xml:space="preserve"> row.</w:t>
+      </w:r>
+    </w:p>
+    <w:p>
+      <w:pPr>
+        <w:spacing w:after="0"/>
+      </w:pPr>
+    </w:p>
+    <w:p>
+      <w:pPr>
+        <w:spacing w:after="0"/>
+        <w:rPr>
+          <w:b/>
+          <w:bCs/>
+          <w:color w:val="EE0000"/>
+          <w:u w:val="single"/>
+        </w:rPr>
+      </w:pPr>
+      <w:r>
+        <w:rPr>
+          <w:b/>
+          <w:bCs/>
+          <w:color w:val="EE0000"/>
+          <w:u w:val="single"/>
+        </w:rPr>
+        <w:t>Prompt #5:</w:t>
+      </w:r>
+    </w:p>
+    <w:p>
+      <w:pPr>
+        <w:spacing w:after="0"/>
+      </w:pPr>
+      <w:r>
+        <w:t xml:space="preserve">Write a production-ready code in the </w:t>
+      </w:r>
+      <w:proofErr w:type="gramStart"/>
+      <w:r>
+        <w:t>Infrastructure</w:t>
+      </w:r>
+      <w:proofErr w:type="gramEnd"/>
+      <w:r>
+        <w:t xml:space="preserve"> repository layer to call the below stored procedure using Entity Framework Core to insert approval history record in “</w:t>
+      </w:r>
+      <w:proofErr w:type="spellStart"/>
+      <w:proofErr w:type="gramStart"/>
+      <w:r>
+        <w:rPr>
+          <w:lang w:val="en-GB"/>
+        </w:rPr>
+        <w:t>kenuser.RequestApprovals</w:t>
+      </w:r>
+      <w:proofErr w:type="spellEnd"/>
+      <w:proofErr w:type="gramEnd"/>
+      <w:r>
+        <w:t xml:space="preserve">”. The generated method will be called in the </w:t>
+      </w:r>
+      <w:proofErr w:type="spellStart"/>
+      <w:proofErr w:type="gramStart"/>
+      <w:r>
+        <w:rPr>
+          <w:lang w:val="en-GB"/>
+        </w:rPr>
+        <w:t>ApproveStepAsync</w:t>
+      </w:r>
+      <w:proofErr w:type="spellEnd"/>
+      <w:r>
+        <w:rPr>
+          <w:lang w:val="en-GB"/>
+        </w:rPr>
+        <w:t>(</w:t>
+      </w:r>
+      <w:proofErr w:type="gramEnd"/>
+      <w:r>
+        <w:rPr>
+          <w:lang w:val="en-GB"/>
+        </w:rPr>
+        <w:t>) method once the approval process is complete. Note that the output parameter of the stored procedure called “</w:t>
+      </w:r>
+      <w:r>
+        <w:rPr>
+          <w:lang w:val="en-GB"/>
+        </w:rPr>
+        <w:t>@</w:t>
+      </w:r>
+      <w:proofErr w:type="spellStart"/>
+      <w:r>
+        <w:rPr>
+          <w:lang w:val="en-GB"/>
+        </w:rPr>
+        <w:t>affectedRow</w:t>
+      </w:r>
+      <w:proofErr w:type="spellEnd"/>
+      <w:r>
+        <w:rPr>
+          <w:lang w:val="en-GB"/>
+        </w:rPr>
+        <w:t xml:space="preserve">” should be set as the return value of the </w:t>
+      </w:r>
+      <w:r>
+        <w:rPr>
+          <w:lang w:val="en-GB"/>
+        </w:rPr>
+        <w:t>function method in the repository later. Implement error catching in the method.</w:t>
+      </w:r>
+    </w:p>
+    <w:p>
+      <w:pPr>
+        <w:spacing w:after="0"/>
+      </w:pPr>
+    </w:p>
+    <w:p>
+      <w:pPr>
+        <w:spacing w:after="0"/>
+        <w:rPr>
+          <w:lang w:val="en-GB"/>
+        </w:rPr>
+      </w:pPr>
+      <w:r>
+        <w:rPr>
+          <w:lang w:val="en-GB"/>
+        </w:rPr>
+        <w:t xml:space="preserve">ALTER PROCEDURE </w:t>
+      </w:r>
+      <w:proofErr w:type="spellStart"/>
+      <w:proofErr w:type="gramStart"/>
+      <w:r>
+        <w:rPr>
+          <w:lang w:val="en-GB"/>
+        </w:rPr>
+        <w:t>kenuser.Pr</w:t>
+      </w:r>
+      <w:proofErr w:type="gramEnd"/>
+      <w:r>
+        <w:rPr>
+          <w:lang w:val="en-GB"/>
+        </w:rPr>
+        <w:t>_ApprovalHistory_CRUD</w:t>
+      </w:r>
+      <w:proofErr w:type="spellEnd"/>
+    </w:p>
+    <w:p>
+      <w:pPr>
+        <w:spacing w:after="0"/>
+        <w:rPr>
+          <w:lang w:val="en-GB"/>
+        </w:rPr>
+      </w:pPr>
+      <w:r>
+        <w:rPr>
+          <w:lang w:val="en-GB"/>
+        </w:rPr>
+        <w:t>(</w:t>
+      </w:r>
+      <w:r>
+        <w:rPr>
+          <w:lang w:val="en-GB"/>
+        </w:rPr>
+        <w:tab/>
+      </w:r>
+    </w:p>
+    <w:p>
+      <w:pPr>
+        <w:spacing w:after="0"/>
+        <w:rPr>
+          <w:lang w:val="en-GB"/>
+        </w:rPr>
+      </w:pPr>
+      <w:r>
+        <w:rPr>
+          <w:lang w:val="en-GB"/>
+        </w:rPr>
+        <w:tab/>
+        <w:t>@actionType</w:t>
+      </w:r>
+      <w:r>
+        <w:rPr>
+          <w:lang w:val="en-GB"/>
+        </w:rPr>
+        <w:tab/>
+      </w:r>
+      <w:r>
+        <w:rPr>
+          <w:lang w:val="en-GB"/>
+        </w:rPr>
+        <w:tab/>
+      </w:r>
+      <w:r>
+        <w:rPr>
+          <w:lang w:val="en-GB"/>
+        </w:rPr>
+        <w:tab/>
+        <w:t>TINYINT,</w:t>
+      </w:r>
+      <w:r>
+        <w:rPr>
+          <w:lang w:val="en-GB"/>
+        </w:rPr>
+        <w:tab/>
+        <w:t>--(Notes: 0 = Check records, 1 = Insert, 2 = Update, 3 = Delete)</w:t>
+      </w:r>
+      <w:r>
+        <w:rPr>
+          <w:lang w:val="en-GB"/>
+        </w:rPr>
+        <w:tab/>
+      </w:r>
+    </w:p>
+    <w:p>
+      <w:pPr>
+        <w:spacing w:after="0"/>
+        <w:rPr>
+          <w:lang w:val="en-GB"/>
+        </w:rPr>
+      </w:pPr>
+      <w:r>
+        <w:rPr>
+          <w:lang w:val="en-GB"/>
+        </w:rPr>
+        <w:tab/>
+        <w:t>@stepInstanceId</w:t>
+      </w:r>
+      <w:r>
+        <w:rPr>
+          <w:lang w:val="en-GB"/>
+        </w:rPr>
+        <w:tab/>
+      </w:r>
+      <w:r>
+        <w:rPr>
+          <w:lang w:val="en-GB"/>
+        </w:rPr>
+        <w:tab/>
+        <w:t>INT,</w:t>
+      </w:r>
+    </w:p>
+    <w:p>
+      <w:pPr>
+        <w:spacing w:after="0"/>
+        <w:rPr>
+          <w:lang w:val="en-GB"/>
+        </w:rPr>
+      </w:pPr>
+      <w:r>
+        <w:rPr>
+          <w:lang w:val="en-GB"/>
+        </w:rPr>
+        <w:tab/>
+        <w:t>@approverEmpNo</w:t>
+      </w:r>
+      <w:r>
+        <w:rPr>
+          <w:lang w:val="en-GB"/>
+        </w:rPr>
+        <w:tab/>
+      </w:r>
+      <w:r>
+        <w:rPr>
+          <w:lang w:val="en-GB"/>
+        </w:rPr>
+        <w:tab/>
+        <w:t>INT,</w:t>
+      </w:r>
+    </w:p>
+    <w:p>
+      <w:pPr>
+        <w:spacing w:after="0"/>
+        <w:rPr>
+          <w:lang w:val="en-GB"/>
+        </w:rPr>
+      </w:pPr>
+      <w:r>
+        <w:rPr>
+          <w:lang w:val="en-GB"/>
+        </w:rPr>
+        <w:tab/>
+        <w:t>@approverUserID</w:t>
+      </w:r>
+      <w:r>
+        <w:rPr>
+          <w:lang w:val="en-GB"/>
+        </w:rPr>
+        <w:tab/>
+      </w:r>
+      <w:r>
+        <w:rPr>
+          <w:lang w:val="en-GB"/>
+        </w:rPr>
+        <w:tab/>
+      </w:r>
+      <w:proofErr w:type="gramStart"/>
+      <w:r>
+        <w:rPr>
+          <w:lang w:val="en-GB"/>
+        </w:rPr>
+        <w:t>VARCHAR(</w:t>
+      </w:r>
+      <w:proofErr w:type="gramEnd"/>
+      <w:r>
+        <w:rPr>
+          <w:lang w:val="en-GB"/>
+        </w:rPr>
+        <w:t>50),</w:t>
+      </w:r>
+    </w:p>
+    <w:p>
+      <w:pPr>
+        <w:spacing w:after="0"/>
+        <w:rPr>
+          <w:lang w:val="en-GB"/>
+        </w:rPr>
+      </w:pPr>
+      <w:r>
+        <w:rPr>
+          <w:lang w:val="en-GB"/>
+        </w:rPr>
+        <w:tab/>
+        <w:t>@isApproved</w:t>
+      </w:r>
+      <w:r>
+        <w:rPr>
+          <w:lang w:val="en-GB"/>
+        </w:rPr>
+        <w:tab/>
+      </w:r>
+      <w:r>
+        <w:rPr>
+          <w:lang w:val="en-GB"/>
+        </w:rPr>
+        <w:tab/>
+      </w:r>
+      <w:r>
+        <w:rPr>
+          <w:lang w:val="en-GB"/>
+        </w:rPr>
+        <w:tab/>
+        <w:t>BIT,</w:t>
+      </w:r>
+    </w:p>
+    <w:p>
+      <w:pPr>
+        <w:spacing w:after="0"/>
+        <w:rPr>
+          <w:lang w:val="en-GB"/>
+        </w:rPr>
+      </w:pPr>
+      <w:r>
+        <w:rPr>
+          <w:lang w:val="en-GB"/>
+        </w:rPr>
+        <w:tab/>
+        <w:t>@isHold</w:t>
+      </w:r>
+      <w:r>
+        <w:rPr>
+          <w:lang w:val="en-GB"/>
+        </w:rPr>
+        <w:tab/>
+      </w:r>
+      <w:r>
+        <w:rPr>
+          <w:lang w:val="en-GB"/>
+        </w:rPr>
+        <w:tab/>
+      </w:r>
+      <w:r>
+        <w:rPr>
+          <w:lang w:val="en-GB"/>
+        </w:rPr>
+        <w:tab/>
+      </w:r>
+      <w:r>
+        <w:rPr>
+          <w:lang w:val="en-GB"/>
+        </w:rPr>
+        <w:tab/>
+        <w:t xml:space="preserve">BIT, </w:t>
+      </w:r>
+    </w:p>
+    <w:p>
+      <w:pPr>
+        <w:spacing w:after="0"/>
+        <w:rPr>
+          <w:lang w:val="en-GB"/>
+        </w:rPr>
+      </w:pPr>
+      <w:r>
+        <w:rPr>
+          <w:lang w:val="en-GB"/>
+        </w:rPr>
+        <w:lastRenderedPageBreak/>
+        <w:tab/>
+        <w:t>@approverRemarks</w:t>
+      </w:r>
+      <w:r>
+        <w:rPr>
+          <w:lang w:val="en-GB"/>
+        </w:rPr>
+        <w:tab/>
+      </w:r>
+      <w:proofErr w:type="gramStart"/>
+      <w:r>
+        <w:rPr>
+          <w:lang w:val="en-GB"/>
+        </w:rPr>
+        <w:t>VARCHAR(</w:t>
+      </w:r>
+      <w:proofErr w:type="gramEnd"/>
+      <w:r>
+        <w:rPr>
+          <w:lang w:val="en-GB"/>
+        </w:rPr>
+        <w:t>500),</w:t>
+      </w:r>
+    </w:p>
+    <w:p>
+      <w:pPr>
+        <w:spacing w:after="0"/>
+        <w:rPr>
+          <w:lang w:val="en-GB"/>
+        </w:rPr>
+      </w:pPr>
+      <w:r>
+        <w:rPr>
+          <w:lang w:val="en-GB"/>
+        </w:rPr>
+        <w:tab/>
+        <w:t>@affectedRow</w:t>
+      </w:r>
+      <w:r>
+        <w:rPr>
+          <w:lang w:val="en-GB"/>
+        </w:rPr>
+        <w:tab/>
+      </w:r>
+      <w:r>
+        <w:rPr>
+          <w:lang w:val="en-GB"/>
+        </w:rPr>
+        <w:tab/>
+        <w:t>INT OUTPUT</w:t>
+      </w:r>
+    </w:p>
+    <w:p>
+      <w:pPr>
+        <w:spacing w:after="0"/>
+        <w:rPr>
+          <w:lang w:val="en-GB"/>
+        </w:rPr>
+      </w:pPr>
+      <w:r>
+        <w:rPr>
+          <w:lang w:val="en-GB"/>
+        </w:rPr>
+        <w:t>)</w:t>
+      </w:r>
+    </w:p>
+    <w:p>
+      <w:pPr>
+        <w:spacing w:after="0"/>
+        <w:rPr>
+          <w:lang w:val="en-GB"/>
+        </w:rPr>
+      </w:pPr>
+      <w:r>
+        <w:rPr>
+          <w:lang w:val="en-GB"/>
+        </w:rPr>
+        <w:t>AS</w:t>
+      </w:r>
+      <w:r>
+        <w:rPr>
+          <w:lang w:val="en-GB"/>
+        </w:rPr>
+        <w:tab/>
+      </w:r>
+    </w:p>
+    <w:p>
+      <w:pPr>
+        <w:spacing w:after="0"/>
+        <w:rPr>
+          <w:lang w:val="en-GB"/>
+        </w:rPr>
+      </w:pPr>
+      <w:r>
+        <w:rPr>
+          <w:lang w:val="en-GB"/>
+        </w:rPr>
+        <w:t>BEGIN</w:t>
+      </w:r>
+    </w:p>
+    <w:p>
+      <w:pPr>
+        <w:spacing w:after="0"/>
+        <w:rPr>
+          <w:lang w:val="en-GB"/>
+        </w:rPr>
+      </w:pPr>
+    </w:p>
+    <w:p>
+      <w:pPr>
+        <w:spacing w:after="0"/>
+        <w:rPr>
+          <w:lang w:val="en-GB"/>
+        </w:rPr>
+      </w:pPr>
+      <w:r>
+        <w:rPr>
+          <w:lang w:val="en-GB"/>
+        </w:rPr>
+        <w:tab/>
+        <w:t>--Initialize output parameter</w:t>
+      </w:r>
+    </w:p>
+    <w:p>
+      <w:pPr>
+        <w:spacing w:after="0"/>
+        <w:rPr>
+          <w:lang w:val="en-GB"/>
+        </w:rPr>
+      </w:pPr>
+      <w:r>
+        <w:rPr>
+          <w:lang w:val="en-GB"/>
+        </w:rPr>
+        <w:tab/>
+        <w:t>SET @affectedRow = 0</w:t>
+      </w:r>
+    </w:p>
+    <w:p>
+      <w:pPr>
+        <w:spacing w:after="0"/>
+        <w:rPr>
+          <w:lang w:val="en-GB"/>
+        </w:rPr>
+      </w:pPr>
+    </w:p>
+    <w:p>
+      <w:pPr>
+        <w:spacing w:after="0"/>
+        <w:rPr>
+          <w:lang w:val="en-GB"/>
+        </w:rPr>
+      </w:pPr>
+      <w:r>
+        <w:rPr>
+          <w:lang w:val="en-GB"/>
+        </w:rPr>
+        <w:tab/>
+        <w:t>IF @actionType = 1</w:t>
+      </w:r>
+    </w:p>
+    <w:p>
+      <w:pPr>
+        <w:spacing w:after="0"/>
+        <w:rPr>
+          <w:lang w:val="en-GB"/>
+        </w:rPr>
+      </w:pPr>
+      <w:r>
+        <w:rPr>
+          <w:lang w:val="en-GB"/>
+        </w:rPr>
+        <w:tab/>
+        <w:t>BEGIN</w:t>
+      </w:r>
+    </w:p>
+    <w:p>
+      <w:pPr>
+        <w:spacing w:after="0"/>
+        <w:rPr>
+          <w:lang w:val="en-GB"/>
+        </w:rPr>
+      </w:pPr>
+    </w:p>
+    <w:p>
+      <w:pPr>
+        <w:spacing w:after="0"/>
+        <w:rPr>
+          <w:lang w:val="en-GB"/>
+        </w:rPr>
+      </w:pPr>
+      <w:r>
+        <w:rPr>
+          <w:lang w:val="en-GB"/>
+        </w:rPr>
+        <w:tab/>
+      </w:r>
+      <w:r>
+        <w:rPr>
+          <w:lang w:val="en-GB"/>
+        </w:rPr>
+        <w:tab/>
+        <w:t xml:space="preserve">INSERT INTO </w:t>
+      </w:r>
+      <w:proofErr w:type="spellStart"/>
+      <w:proofErr w:type="gramStart"/>
+      <w:r>
+        <w:rPr>
+          <w:lang w:val="en-GB"/>
+        </w:rPr>
+        <w:t>kenuser.RequestApprovals</w:t>
+      </w:r>
+      <w:proofErr w:type="spellEnd"/>
+      <w:proofErr w:type="gramEnd"/>
+    </w:p>
+    <w:p>
+      <w:pPr>
+        <w:spacing w:after="0"/>
+        <w:rPr>
+          <w:lang w:val="en-GB"/>
+        </w:rPr>
+      </w:pPr>
+      <w:r>
+        <w:rPr>
+          <w:lang w:val="en-GB"/>
+        </w:rPr>
+        <w:tab/>
+      </w:r>
+      <w:r>
+        <w:rPr>
+          <w:lang w:val="en-GB"/>
+        </w:rPr>
+        <w:tab/>
+        <w:t>(</w:t>
+      </w:r>
+    </w:p>
+    <w:p>
+      <w:pPr>
+        <w:spacing w:after="0"/>
+        <w:rPr>
+          <w:lang w:val="en-GB"/>
+        </w:rPr>
+      </w:pPr>
+      <w:r>
+        <w:rPr>
+          <w:lang w:val="en-GB"/>
+        </w:rPr>
+        <w:tab/>
+      </w:r>
+      <w:r>
+        <w:rPr>
+          <w:lang w:val="en-GB"/>
+        </w:rPr>
+        <w:tab/>
+      </w:r>
+      <w:r>
+        <w:rPr>
+          <w:lang w:val="en-GB"/>
+        </w:rPr>
+        <w:tab/>
+        <w:t>[</w:t>
+      </w:r>
+      <w:proofErr w:type="spellStart"/>
+      <w:r>
+        <w:rPr>
+          <w:lang w:val="en-GB"/>
+        </w:rPr>
+        <w:t>RequestTypeCode</w:t>
+      </w:r>
+      <w:proofErr w:type="spellEnd"/>
+      <w:r>
+        <w:rPr>
+          <w:lang w:val="en-GB"/>
+        </w:rPr>
+        <w:t>]</w:t>
+      </w:r>
+    </w:p>
+    <w:p>
+      <w:pPr>
+        <w:spacing w:after="0"/>
+        <w:rPr>
+          <w:lang w:val="en-GB"/>
+        </w:rPr>
+      </w:pPr>
+      <w:r>
+        <w:rPr>
+          <w:lang w:val="en-GB"/>
+        </w:rPr>
+        <w:tab/>
+      </w:r>
+      <w:r>
+        <w:rPr>
+          <w:lang w:val="en-GB"/>
+        </w:rPr>
+        <w:tab/>
+      </w:r>
+      <w:r>
+        <w:rPr>
+          <w:lang w:val="en-GB"/>
+        </w:rPr>
+        <w:tab/>
+      </w:r>
+      <w:proofErr w:type="gramStart"/>
+      <w:r>
+        <w:rPr>
+          <w:lang w:val="en-GB"/>
+        </w:rPr>
+        <w:t>,[</w:t>
+      </w:r>
+      <w:proofErr w:type="spellStart"/>
+      <w:proofErr w:type="gramEnd"/>
+      <w:r>
+        <w:rPr>
+          <w:lang w:val="en-GB"/>
+        </w:rPr>
+        <w:t>RequisitionNo</w:t>
+      </w:r>
+      <w:proofErr w:type="spellEnd"/>
+      <w:r>
+        <w:rPr>
+          <w:lang w:val="en-GB"/>
+        </w:rPr>
+        <w:t>]</w:t>
+      </w:r>
+    </w:p>
+    <w:p>
+      <w:pPr>
+        <w:spacing w:after="0"/>
+        <w:rPr>
+          <w:lang w:val="en-GB"/>
+        </w:rPr>
+      </w:pPr>
+      <w:r>
+        <w:rPr>
+          <w:lang w:val="en-GB"/>
+        </w:rPr>
+        <w:tab/>
+      </w:r>
+      <w:r>
+        <w:rPr>
+          <w:lang w:val="en-GB"/>
+        </w:rPr>
+        <w:tab/>
+      </w:r>
+      <w:r>
+        <w:rPr>
+          <w:lang w:val="en-GB"/>
+        </w:rPr>
+        <w:tab/>
+      </w:r>
+      <w:proofErr w:type="gramStart"/>
+      <w:r>
+        <w:rPr>
+          <w:lang w:val="en-GB"/>
+        </w:rPr>
+        <w:t>,[</w:t>
+      </w:r>
+      <w:proofErr w:type="spellStart"/>
+      <w:proofErr w:type="gramEnd"/>
+      <w:r>
+        <w:rPr>
+          <w:lang w:val="en-GB"/>
+        </w:rPr>
+        <w:t>RoutineSequence</w:t>
+      </w:r>
+      <w:proofErr w:type="spellEnd"/>
+      <w:r>
+        <w:rPr>
+          <w:lang w:val="en-GB"/>
+        </w:rPr>
+        <w:t>]</w:t>
+      </w:r>
+    </w:p>
+    <w:p>
+      <w:pPr>
+        <w:spacing w:after="0"/>
+        <w:rPr>
+          <w:lang w:val="en-GB"/>
+        </w:rPr>
+      </w:pPr>
+      <w:r>
+        <w:rPr>
+          <w:lang w:val="en-GB"/>
+        </w:rPr>
+        <w:tab/>
+      </w:r>
+      <w:r>
+        <w:rPr>
+          <w:lang w:val="en-GB"/>
+        </w:rPr>
+        <w:tab/>
+      </w:r>
+      <w:r>
+        <w:rPr>
+          <w:lang w:val="en-GB"/>
+        </w:rPr>
+        <w:tab/>
+      </w:r>
+      <w:proofErr w:type="gramStart"/>
+      <w:r>
+        <w:rPr>
+          <w:lang w:val="en-GB"/>
+        </w:rPr>
+        <w:t>,[</w:t>
+      </w:r>
+      <w:proofErr w:type="spellStart"/>
+      <w:proofErr w:type="gramEnd"/>
+      <w:r>
+        <w:rPr>
+          <w:lang w:val="en-GB"/>
+        </w:rPr>
+        <w:t>AssignedEmpNo</w:t>
+      </w:r>
+      <w:proofErr w:type="spellEnd"/>
+      <w:r>
+        <w:rPr>
+          <w:lang w:val="en-GB"/>
+        </w:rPr>
+        <w:t>]</w:t>
+      </w:r>
+    </w:p>
+    <w:p>
+      <w:pPr>
+        <w:spacing w:after="0"/>
+        <w:rPr>
+          <w:lang w:val="en-GB"/>
+        </w:rPr>
+      </w:pPr>
+      <w:r>
+        <w:rPr>
+          <w:lang w:val="en-GB"/>
+        </w:rPr>
+        <w:tab/>
+      </w:r>
+      <w:r>
+        <w:rPr>
+          <w:lang w:val="en-GB"/>
+        </w:rPr>
+        <w:tab/>
+      </w:r>
+      <w:r>
+        <w:rPr>
+          <w:lang w:val="en-GB"/>
+        </w:rPr>
+        <w:tab/>
+      </w:r>
+      <w:proofErr w:type="gramStart"/>
+      <w:r>
+        <w:rPr>
+          <w:lang w:val="en-GB"/>
+        </w:rPr>
+        <w:t>,[</w:t>
+      </w:r>
+      <w:proofErr w:type="spellStart"/>
+      <w:proofErr w:type="gramEnd"/>
+      <w:r>
+        <w:rPr>
+          <w:lang w:val="en-GB"/>
+        </w:rPr>
+        <w:t>AssignedEmpName</w:t>
+      </w:r>
+      <w:proofErr w:type="spellEnd"/>
+      <w:r>
+        <w:rPr>
+          <w:lang w:val="en-GB"/>
+        </w:rPr>
+        <w:t>]</w:t>
+      </w:r>
+    </w:p>
+    <w:p>
+      <w:pPr>
+        <w:spacing w:after="0"/>
+        <w:rPr>
+          <w:lang w:val="en-GB"/>
+        </w:rPr>
+      </w:pPr>
+      <w:r>
+        <w:rPr>
+          <w:lang w:val="en-GB"/>
+        </w:rPr>
+        <w:tab/>
+      </w:r>
+      <w:r>
+        <w:rPr>
+          <w:lang w:val="en-GB"/>
+        </w:rPr>
+        <w:tab/>
+      </w:r>
+      <w:r>
+        <w:rPr>
+          <w:lang w:val="en-GB"/>
+        </w:rPr>
+        <w:tab/>
+      </w:r>
+      <w:proofErr w:type="gramStart"/>
+      <w:r>
+        <w:rPr>
+          <w:lang w:val="en-GB"/>
+        </w:rPr>
+        <w:t>,[</w:t>
+      </w:r>
+      <w:proofErr w:type="spellStart"/>
+      <w:proofErr w:type="gramEnd"/>
+      <w:r>
+        <w:rPr>
+          <w:lang w:val="en-GB"/>
+        </w:rPr>
+        <w:t>ApprovalRole</w:t>
+      </w:r>
+      <w:proofErr w:type="spellEnd"/>
+      <w:r>
+        <w:rPr>
+          <w:lang w:val="en-GB"/>
+        </w:rPr>
+        <w:t>]</w:t>
+      </w:r>
+    </w:p>
+    <w:p>
+      <w:pPr>
+        <w:spacing w:after="0"/>
+        <w:rPr>
+          <w:lang w:val="en-GB"/>
+        </w:rPr>
+      </w:pPr>
+      <w:r>
+        <w:rPr>
+          <w:lang w:val="en-GB"/>
+        </w:rPr>
+        <w:tab/>
+      </w:r>
+      <w:r>
+        <w:rPr>
+          <w:lang w:val="en-GB"/>
+        </w:rPr>
+        <w:tab/>
+      </w:r>
+      <w:r>
+        <w:rPr>
+          <w:lang w:val="en-GB"/>
+        </w:rPr>
+        <w:tab/>
+      </w:r>
+      <w:proofErr w:type="gramStart"/>
+      <w:r>
+        <w:rPr>
+          <w:lang w:val="en-GB"/>
+        </w:rPr>
+        <w:t>,[</w:t>
+      </w:r>
+      <w:proofErr w:type="spellStart"/>
+      <w:proofErr w:type="gramEnd"/>
+      <w:r>
+        <w:rPr>
+          <w:lang w:val="en-GB"/>
+        </w:rPr>
+        <w:t>ActionRole</w:t>
+      </w:r>
+      <w:proofErr w:type="spellEnd"/>
+      <w:r>
+        <w:rPr>
+          <w:lang w:val="en-GB"/>
+        </w:rPr>
+        <w:t>]</w:t>
+      </w:r>
+    </w:p>
+    <w:p>
+      <w:pPr>
+        <w:spacing w:after="0"/>
+        <w:rPr>
+          <w:lang w:val="en-GB"/>
+        </w:rPr>
+      </w:pPr>
+      <w:r>
+        <w:rPr>
+          <w:lang w:val="en-GB"/>
+        </w:rPr>
+        <w:tab/>
+      </w:r>
+      <w:r>
+        <w:rPr>
+          <w:lang w:val="en-GB"/>
+        </w:rPr>
+        <w:tab/>
+      </w:r>
+      <w:r>
+        <w:rPr>
+          <w:lang w:val="en-GB"/>
+        </w:rPr>
+        <w:tab/>
+      </w:r>
+      <w:proofErr w:type="gramStart"/>
+      <w:r>
+        <w:rPr>
+          <w:lang w:val="en-GB"/>
+        </w:rPr>
+        <w:t>,[</w:t>
+      </w:r>
+      <w:proofErr w:type="spellStart"/>
+      <w:proofErr w:type="gramEnd"/>
+      <w:r>
+        <w:rPr>
+          <w:lang w:val="en-GB"/>
+        </w:rPr>
+        <w:t>IsApproved</w:t>
+      </w:r>
+      <w:proofErr w:type="spellEnd"/>
+      <w:r>
+        <w:rPr>
+          <w:lang w:val="en-GB"/>
+        </w:rPr>
+        <w:t>]</w:t>
+      </w:r>
+    </w:p>
+    <w:p>
+      <w:pPr>
+        <w:spacing w:after="0"/>
+        <w:rPr>
+          <w:lang w:val="en-GB"/>
+        </w:rPr>
+      </w:pPr>
+      <w:r>
+        <w:rPr>
+          <w:lang w:val="en-GB"/>
+        </w:rPr>
+        <w:tab/>
+      </w:r>
+      <w:r>
+        <w:rPr>
+          <w:lang w:val="en-GB"/>
+        </w:rPr>
+        <w:tab/>
+      </w:r>
+      <w:r>
+        <w:rPr>
+          <w:lang w:val="en-GB"/>
+        </w:rPr>
+        <w:tab/>
+      </w:r>
+      <w:proofErr w:type="gramStart"/>
+      <w:r>
+        <w:rPr>
+          <w:lang w:val="en-GB"/>
+        </w:rPr>
+        <w:t>,[</w:t>
+      </w:r>
+      <w:proofErr w:type="spellStart"/>
+      <w:proofErr w:type="gramEnd"/>
+      <w:r>
+        <w:rPr>
+          <w:lang w:val="en-GB"/>
+        </w:rPr>
+        <w:t>IsHold</w:t>
+      </w:r>
+      <w:proofErr w:type="spellEnd"/>
+      <w:r>
+        <w:rPr>
+          <w:lang w:val="en-GB"/>
+        </w:rPr>
+        <w:t>]</w:t>
+      </w:r>
+    </w:p>
+    <w:p>
+      <w:pPr>
+        <w:spacing w:after="0"/>
+        <w:rPr>
+          <w:lang w:val="en-GB"/>
+        </w:rPr>
+      </w:pPr>
+      <w:r>
+        <w:rPr>
+          <w:lang w:val="en-GB"/>
+        </w:rPr>
+        <w:tab/>
+      </w:r>
+      <w:r>
+        <w:rPr>
+          <w:lang w:val="en-GB"/>
+        </w:rPr>
+        <w:tab/>
+      </w:r>
+      <w:r>
+        <w:rPr>
+          <w:lang w:val="en-GB"/>
+        </w:rPr>
+        <w:tab/>
+      </w:r>
+      <w:proofErr w:type="gramStart"/>
+      <w:r>
+        <w:rPr>
+          <w:lang w:val="en-GB"/>
+        </w:rPr>
+        <w:t>,[</w:t>
+      </w:r>
+      <w:proofErr w:type="gramEnd"/>
+      <w:r>
+        <w:rPr>
+          <w:lang w:val="en-GB"/>
+        </w:rPr>
+        <w:t>Remarks]</w:t>
+      </w:r>
+    </w:p>
+    <w:p>
+      <w:pPr>
+        <w:spacing w:after="0"/>
+        <w:rPr>
+          <w:lang w:val="en-GB"/>
+        </w:rPr>
+      </w:pPr>
+      <w:r>
+        <w:rPr>
+          <w:lang w:val="en-GB"/>
+        </w:rPr>
+        <w:tab/>
+      </w:r>
+      <w:r>
+        <w:rPr>
+          <w:lang w:val="en-GB"/>
+        </w:rPr>
+        <w:tab/>
+      </w:r>
+      <w:r>
+        <w:rPr>
+          <w:lang w:val="en-GB"/>
+        </w:rPr>
+        <w:tab/>
+      </w:r>
+      <w:proofErr w:type="gramStart"/>
+      <w:r>
+        <w:rPr>
+          <w:lang w:val="en-GB"/>
+        </w:rPr>
+        <w:t>,[</w:t>
+      </w:r>
+      <w:proofErr w:type="spellStart"/>
+      <w:proofErr w:type="gramEnd"/>
+      <w:r>
+        <w:rPr>
+          <w:lang w:val="en-GB"/>
+        </w:rPr>
+        <w:t>CreatedDate</w:t>
+      </w:r>
+      <w:proofErr w:type="spellEnd"/>
+      <w:r>
+        <w:rPr>
+          <w:lang w:val="en-GB"/>
+        </w:rPr>
+        <w:t>]</w:t>
+      </w:r>
+    </w:p>
+    <w:p>
+      <w:pPr>
+        <w:spacing w:after="0"/>
+        <w:rPr>
+          <w:lang w:val="en-GB"/>
+        </w:rPr>
+      </w:pPr>
+      <w:r>
+        <w:rPr>
+          <w:lang w:val="en-GB"/>
+        </w:rPr>
+        <w:tab/>
+      </w:r>
+      <w:r>
+        <w:rPr>
+          <w:lang w:val="en-GB"/>
+        </w:rPr>
+        <w:tab/>
+      </w:r>
+      <w:r>
+        <w:rPr>
+          <w:lang w:val="en-GB"/>
+        </w:rPr>
+        <w:tab/>
+      </w:r>
+      <w:proofErr w:type="gramStart"/>
+      <w:r>
+        <w:rPr>
+          <w:lang w:val="en-GB"/>
+        </w:rPr>
+        <w:t>,[</w:t>
+      </w:r>
+      <w:proofErr w:type="spellStart"/>
+      <w:proofErr w:type="gramEnd"/>
+      <w:r>
+        <w:rPr>
+          <w:lang w:val="en-GB"/>
+        </w:rPr>
+        <w:t>CreatedBy</w:t>
+      </w:r>
+      <w:proofErr w:type="spellEnd"/>
+      <w:r>
+        <w:rPr>
+          <w:lang w:val="en-GB"/>
+        </w:rPr>
+        <w:t>]</w:t>
+      </w:r>
+    </w:p>
+    <w:p>
+      <w:pPr>
+        <w:spacing w:after="0"/>
+        <w:rPr>
+          <w:lang w:val="en-GB"/>
+        </w:rPr>
+      </w:pPr>
+      <w:r>
+        <w:rPr>
+          <w:lang w:val="en-GB"/>
+        </w:rPr>
+        <w:tab/>
+      </w:r>
+      <w:r>
+        <w:rPr>
+          <w:lang w:val="en-GB"/>
+        </w:rPr>
+        <w:tab/>
+      </w:r>
+      <w:r>
+        <w:rPr>
+          <w:lang w:val="en-GB"/>
+        </w:rPr>
+        <w:tab/>
+      </w:r>
+      <w:proofErr w:type="gramStart"/>
+      <w:r>
+        <w:rPr>
+          <w:lang w:val="en-GB"/>
+        </w:rPr>
+        <w:t>,[</w:t>
+      </w:r>
+      <w:proofErr w:type="spellStart"/>
+      <w:proofErr w:type="gramEnd"/>
+      <w:r>
+        <w:rPr>
+          <w:lang w:val="en-GB"/>
+        </w:rPr>
+        <w:t>CreatedUserID</w:t>
+      </w:r>
+      <w:proofErr w:type="spellEnd"/>
+      <w:r>
+        <w:rPr>
+          <w:lang w:val="en-GB"/>
+        </w:rPr>
+        <w:t>]</w:t>
+      </w:r>
+    </w:p>
+    <w:p>
+      <w:pPr>
+        <w:spacing w:after="0"/>
+        <w:rPr>
+          <w:lang w:val="en-GB"/>
+        </w:rPr>
+      </w:pPr>
+      <w:r>
+        <w:rPr>
+          <w:lang w:val="en-GB"/>
+        </w:rPr>
+        <w:tab/>
+      </w:r>
+      <w:r>
+        <w:rPr>
+          <w:lang w:val="en-GB"/>
+        </w:rPr>
+        <w:tab/>
+        <w:t>)</w:t>
+      </w:r>
+    </w:p>
+    <w:p>
+      <w:pPr>
+        <w:spacing w:after="0"/>
+        <w:rPr>
+          <w:lang w:val="en-GB"/>
+        </w:rPr>
+      </w:pPr>
+      <w:r>
+        <w:rPr>
+          <w:lang w:val="en-GB"/>
+        </w:rPr>
+        <w:tab/>
+      </w:r>
+      <w:r>
+        <w:rPr>
+          <w:lang w:val="en-GB"/>
+        </w:rPr>
+        <w:tab/>
+        <w:t>SELECT</w:t>
+      </w:r>
+      <w:r>
+        <w:rPr>
+          <w:lang w:val="en-GB"/>
+        </w:rPr>
+        <w:tab/>
+      </w:r>
+      <w:proofErr w:type="spellStart"/>
+      <w:r>
+        <w:rPr>
+          <w:lang w:val="en-GB"/>
+        </w:rPr>
+        <w:t>D.EntityName</w:t>
+      </w:r>
+      <w:proofErr w:type="spellEnd"/>
+      <w:r>
+        <w:rPr>
+          <w:lang w:val="en-GB"/>
+        </w:rPr>
+        <w:t xml:space="preserve"> AS </w:t>
+      </w:r>
+      <w:proofErr w:type="spellStart"/>
+      <w:r>
+        <w:rPr>
+          <w:lang w:val="en-GB"/>
+        </w:rPr>
+        <w:t>RequestTypeCode</w:t>
+      </w:r>
+      <w:proofErr w:type="spellEnd"/>
+      <w:r>
+        <w:rPr>
+          <w:lang w:val="en-GB"/>
+        </w:rPr>
+        <w:t>,</w:t>
+      </w:r>
+    </w:p>
+    <w:p>
+      <w:pPr>
+        <w:spacing w:after="0"/>
+        <w:rPr>
+          <w:lang w:val="en-GB"/>
+        </w:rPr>
+      </w:pPr>
+      <w:r>
+        <w:rPr>
+          <w:lang w:val="en-GB"/>
+        </w:rPr>
+        <w:tab/>
+      </w:r>
+      <w:r>
+        <w:rPr>
+          <w:lang w:val="en-GB"/>
+        </w:rPr>
+        <w:tab/>
+      </w:r>
+      <w:r>
+        <w:rPr>
+          <w:lang w:val="en-GB"/>
+        </w:rPr>
+        <w:tab/>
+      </w:r>
+      <w:r>
+        <w:rPr>
+          <w:lang w:val="en-GB"/>
+        </w:rPr>
+        <w:tab/>
+      </w:r>
+      <w:proofErr w:type="spellStart"/>
+      <w:proofErr w:type="gramStart"/>
+      <w:r>
+        <w:rPr>
+          <w:lang w:val="en-GB"/>
+        </w:rPr>
+        <w:t>b.EntityId</w:t>
+      </w:r>
+      <w:proofErr w:type="spellEnd"/>
+      <w:proofErr w:type="gramEnd"/>
+      <w:r>
+        <w:rPr>
+          <w:lang w:val="en-GB"/>
+        </w:rPr>
+        <w:t xml:space="preserve"> AS </w:t>
+      </w:r>
+      <w:proofErr w:type="spellStart"/>
+      <w:r>
+        <w:rPr>
+          <w:lang w:val="en-GB"/>
+        </w:rPr>
+        <w:t>RequisitionNo</w:t>
+      </w:r>
+      <w:proofErr w:type="spellEnd"/>
+      <w:r>
+        <w:rPr>
+          <w:lang w:val="en-GB"/>
+        </w:rPr>
+        <w:t>,</w:t>
+      </w:r>
+    </w:p>
+    <w:p>
+      <w:pPr>
+        <w:spacing w:after="0"/>
+        <w:rPr>
+          <w:lang w:val="en-GB"/>
+        </w:rPr>
+      </w:pPr>
+      <w:r>
+        <w:rPr>
+          <w:lang w:val="en-GB"/>
+        </w:rPr>
+        <w:tab/>
+      </w:r>
+      <w:r>
+        <w:rPr>
+          <w:lang w:val="en-GB"/>
+        </w:rPr>
+        <w:tab/>
+      </w:r>
+      <w:r>
+        <w:rPr>
+          <w:lang w:val="en-GB"/>
+        </w:rPr>
+        <w:tab/>
+      </w:r>
+      <w:r>
+        <w:rPr>
+          <w:lang w:val="en-GB"/>
+        </w:rPr>
+        <w:tab/>
+      </w:r>
+      <w:proofErr w:type="spellStart"/>
+      <w:r>
+        <w:rPr>
+          <w:lang w:val="en-GB"/>
+        </w:rPr>
+        <w:t>c.StepOrder</w:t>
+      </w:r>
+      <w:proofErr w:type="spellEnd"/>
+      <w:r>
+        <w:rPr>
+          <w:lang w:val="en-GB"/>
+        </w:rPr>
+        <w:t xml:space="preserve"> AS </w:t>
+      </w:r>
+      <w:proofErr w:type="spellStart"/>
+      <w:r>
+        <w:rPr>
+          <w:lang w:val="en-GB"/>
+        </w:rPr>
+        <w:t>RoutineSequence</w:t>
+      </w:r>
+      <w:proofErr w:type="spellEnd"/>
+      <w:r>
+        <w:rPr>
+          <w:lang w:val="en-GB"/>
+        </w:rPr>
+        <w:t>,</w:t>
+      </w:r>
+    </w:p>
+    <w:p>
+      <w:pPr>
+        <w:spacing w:after="0"/>
+        <w:rPr>
+          <w:lang w:val="en-GB"/>
+        </w:rPr>
+      </w:pPr>
+      <w:r>
+        <w:rPr>
+          <w:lang w:val="en-GB"/>
+        </w:rPr>
+        <w:tab/>
+      </w:r>
+      <w:r>
+        <w:rPr>
+          <w:lang w:val="en-GB"/>
+        </w:rPr>
+        <w:tab/>
+      </w:r>
+      <w:r>
+        <w:rPr>
+          <w:lang w:val="en-GB"/>
+        </w:rPr>
+        <w:tab/>
+      </w:r>
+      <w:r>
+        <w:rPr>
+          <w:lang w:val="en-GB"/>
+        </w:rPr>
+        <w:tab/>
+      </w:r>
+      <w:proofErr w:type="spellStart"/>
+      <w:proofErr w:type="gramStart"/>
+      <w:r>
+        <w:rPr>
+          <w:lang w:val="en-GB"/>
+        </w:rPr>
+        <w:t>a.ApproverEmpNo</w:t>
+      </w:r>
+      <w:proofErr w:type="spellEnd"/>
+      <w:proofErr w:type="gramEnd"/>
+      <w:r>
+        <w:rPr>
+          <w:lang w:val="en-GB"/>
+        </w:rPr>
+        <w:t xml:space="preserve"> AS </w:t>
+      </w:r>
+      <w:proofErr w:type="spellStart"/>
+      <w:r>
+        <w:rPr>
+          <w:lang w:val="en-GB"/>
+        </w:rPr>
+        <w:t>AssignedEmpNo</w:t>
+      </w:r>
+      <w:proofErr w:type="spellEnd"/>
+      <w:r>
+        <w:rPr>
+          <w:lang w:val="en-GB"/>
+        </w:rPr>
+        <w:t>,</w:t>
+      </w:r>
+    </w:p>
+    <w:p>
+      <w:pPr>
+        <w:spacing w:after="0"/>
+        <w:rPr>
+          <w:lang w:val="en-GB"/>
+        </w:rPr>
+      </w:pPr>
+      <w:r>
+        <w:rPr>
+          <w:lang w:val="en-GB"/>
+        </w:rPr>
+        <w:tab/>
+      </w:r>
+      <w:r>
+        <w:rPr>
+          <w:lang w:val="en-GB"/>
+        </w:rPr>
+        <w:tab/>
+      </w:r>
+      <w:r>
+        <w:rPr>
+          <w:lang w:val="en-GB"/>
+        </w:rPr>
+        <w:tab/>
+      </w:r>
+      <w:r>
+        <w:rPr>
+          <w:lang w:val="en-GB"/>
+        </w:rPr>
+        <w:tab/>
+        <w:t>RTRIM(</w:t>
+      </w:r>
+      <w:proofErr w:type="spellStart"/>
+      <w:proofErr w:type="gramStart"/>
+      <w:r>
+        <w:rPr>
+          <w:lang w:val="en-GB"/>
+        </w:rPr>
+        <w:t>f.FirstName</w:t>
+      </w:r>
+      <w:proofErr w:type="spellEnd"/>
+      <w:proofErr w:type="gramEnd"/>
+      <w:r>
+        <w:rPr>
+          <w:lang w:val="en-GB"/>
+        </w:rPr>
+        <w:t>) + ' ' + RTRIM(</w:t>
+      </w:r>
+      <w:proofErr w:type="spellStart"/>
+      <w:proofErr w:type="gramStart"/>
+      <w:r>
+        <w:rPr>
+          <w:lang w:val="en-GB"/>
+        </w:rPr>
+        <w:t>f.MiddleName</w:t>
+      </w:r>
+      <w:proofErr w:type="spellEnd"/>
+      <w:proofErr w:type="gramEnd"/>
+      <w:r>
+        <w:rPr>
+          <w:lang w:val="en-GB"/>
+        </w:rPr>
+        <w:t>) + ' ' + RTRIM(</w:t>
+      </w:r>
+      <w:proofErr w:type="spellStart"/>
+      <w:proofErr w:type="gramStart"/>
+      <w:r>
+        <w:rPr>
+          <w:lang w:val="en-GB"/>
+        </w:rPr>
+        <w:t>f.LastName</w:t>
+      </w:r>
+      <w:proofErr w:type="spellEnd"/>
+      <w:proofErr w:type="gramEnd"/>
+      <w:r>
+        <w:rPr>
+          <w:lang w:val="en-GB"/>
+        </w:rPr>
+        <w:t xml:space="preserve">) AS </w:t>
+      </w:r>
+      <w:proofErr w:type="spellStart"/>
+      <w:r>
+        <w:rPr>
+          <w:lang w:val="en-GB"/>
+        </w:rPr>
+        <w:t>AssignedEmpName</w:t>
+      </w:r>
+      <w:proofErr w:type="spellEnd"/>
+      <w:r>
+        <w:rPr>
+          <w:lang w:val="en-GB"/>
+        </w:rPr>
+        <w:t>,</w:t>
+      </w:r>
+    </w:p>
+    <w:p>
+      <w:pPr>
+        <w:spacing w:after="0"/>
+        <w:rPr>
+          <w:lang w:val="en-GB"/>
+        </w:rPr>
+      </w:pPr>
+      <w:r>
+        <w:rPr>
+          <w:lang w:val="en-GB"/>
+        </w:rPr>
+        <w:tab/>
+      </w:r>
+      <w:r>
+        <w:rPr>
+          <w:lang w:val="en-GB"/>
+        </w:rPr>
+        <w:tab/>
+      </w:r>
+      <w:r>
+        <w:rPr>
+          <w:lang w:val="en-GB"/>
+        </w:rPr>
+        <w:tab/>
+      </w:r>
+      <w:r>
+        <w:rPr>
+          <w:lang w:val="en-GB"/>
+        </w:rPr>
+        <w:tab/>
+      </w:r>
+      <w:proofErr w:type="spellStart"/>
+      <w:proofErr w:type="gramStart"/>
+      <w:r>
+        <w:rPr>
+          <w:lang w:val="en-GB"/>
+        </w:rPr>
+        <w:t>e.ApprovalGroupDesc</w:t>
+      </w:r>
+      <w:proofErr w:type="spellEnd"/>
+      <w:proofErr w:type="gramEnd"/>
+      <w:r>
+        <w:rPr>
+          <w:lang w:val="en-GB"/>
+        </w:rPr>
+        <w:t xml:space="preserve"> AS </w:t>
+      </w:r>
+      <w:proofErr w:type="spellStart"/>
+      <w:r>
+        <w:rPr>
+          <w:lang w:val="en-GB"/>
+        </w:rPr>
+        <w:t>ApprovalRole</w:t>
+      </w:r>
+      <w:proofErr w:type="spellEnd"/>
+      <w:r>
+        <w:rPr>
+          <w:lang w:val="en-GB"/>
+        </w:rPr>
+        <w:t>,</w:t>
+      </w:r>
+    </w:p>
+    <w:p>
+      <w:pPr>
+        <w:spacing w:after="0"/>
+        <w:rPr>
+          <w:lang w:val="en-GB"/>
+        </w:rPr>
+      </w:pPr>
+      <w:r>
+        <w:rPr>
+          <w:lang w:val="en-GB"/>
+        </w:rPr>
+        <w:tab/>
+      </w:r>
+      <w:r>
+        <w:rPr>
+          <w:lang w:val="en-GB"/>
+        </w:rPr>
+        <w:tab/>
+      </w:r>
+      <w:r>
+        <w:rPr>
+          <w:lang w:val="en-GB"/>
+        </w:rPr>
+        <w:tab/>
+      </w:r>
+      <w:r>
+        <w:rPr>
+          <w:lang w:val="en-GB"/>
+        </w:rPr>
+        <w:tab/>
+      </w:r>
+      <w:proofErr w:type="spellStart"/>
+      <w:proofErr w:type="gramStart"/>
+      <w:r>
+        <w:rPr>
+          <w:lang w:val="en-GB"/>
+        </w:rPr>
+        <w:t>e.GroupType</w:t>
+      </w:r>
+      <w:proofErr w:type="spellEnd"/>
+      <w:proofErr w:type="gramEnd"/>
+      <w:r>
+        <w:rPr>
+          <w:lang w:val="en-GB"/>
+        </w:rPr>
+        <w:t xml:space="preserve"> AS </w:t>
+      </w:r>
+      <w:proofErr w:type="spellStart"/>
+      <w:r>
+        <w:rPr>
+          <w:lang w:val="en-GB"/>
+        </w:rPr>
+        <w:t>ActionRole</w:t>
+      </w:r>
+      <w:proofErr w:type="spellEnd"/>
+      <w:r>
+        <w:rPr>
+          <w:lang w:val="en-GB"/>
+        </w:rPr>
+        <w:t>,</w:t>
+      </w:r>
+    </w:p>
+    <w:p>
+      <w:pPr>
+        <w:spacing w:after="0"/>
+        <w:rPr>
+          <w:lang w:val="en-GB"/>
+        </w:rPr>
+      </w:pPr>
+      <w:r>
+        <w:rPr>
+          <w:lang w:val="en-GB"/>
+        </w:rPr>
+        <w:tab/>
+      </w:r>
+      <w:r>
+        <w:rPr>
+          <w:lang w:val="en-GB"/>
+        </w:rPr>
+        <w:tab/>
+      </w:r>
+      <w:r>
+        <w:rPr>
+          <w:lang w:val="en-GB"/>
+        </w:rPr>
+        <w:tab/>
+      </w:r>
+      <w:r>
+        <w:rPr>
+          <w:lang w:val="en-GB"/>
+        </w:rPr>
+        <w:tab/>
+        <w:t xml:space="preserve">@isApproved AS </w:t>
+      </w:r>
+      <w:proofErr w:type="spellStart"/>
+      <w:r>
+        <w:rPr>
+          <w:lang w:val="en-GB"/>
+        </w:rPr>
+        <w:t>IsApproved</w:t>
+      </w:r>
+      <w:proofErr w:type="spellEnd"/>
+      <w:r>
+        <w:rPr>
+          <w:lang w:val="en-GB"/>
+        </w:rPr>
+        <w:t>,</w:t>
+      </w:r>
+    </w:p>
+    <w:p>
+      <w:pPr>
+        <w:spacing w:after="0"/>
+        <w:rPr>
+          <w:lang w:val="en-GB"/>
+        </w:rPr>
+      </w:pPr>
+      <w:r>
+        <w:rPr>
+          <w:lang w:val="en-GB"/>
+        </w:rPr>
+        <w:tab/>
+      </w:r>
+      <w:r>
+        <w:rPr>
+          <w:lang w:val="en-GB"/>
+        </w:rPr>
+        <w:tab/>
+      </w:r>
+      <w:r>
+        <w:rPr>
+          <w:lang w:val="en-GB"/>
+        </w:rPr>
+        <w:tab/>
+      </w:r>
+      <w:r>
+        <w:rPr>
+          <w:lang w:val="en-GB"/>
+        </w:rPr>
+        <w:tab/>
+        <w:t xml:space="preserve">@isHold AS </w:t>
+      </w:r>
+      <w:proofErr w:type="spellStart"/>
+      <w:r>
+        <w:rPr>
+          <w:lang w:val="en-GB"/>
+        </w:rPr>
+        <w:t>IsHold</w:t>
+      </w:r>
+      <w:proofErr w:type="spellEnd"/>
+      <w:r>
+        <w:rPr>
+          <w:lang w:val="en-GB"/>
+        </w:rPr>
+        <w:t>,</w:t>
+      </w:r>
+    </w:p>
+    <w:p>
+      <w:pPr>
+        <w:spacing w:after="0"/>
+        <w:rPr>
+          <w:lang w:val="en-GB"/>
+        </w:rPr>
+      </w:pPr>
+      <w:r>
+        <w:rPr>
+          <w:lang w:val="en-GB"/>
+        </w:rPr>
+        <w:lastRenderedPageBreak/>
+        <w:tab/>
+      </w:r>
+      <w:r>
+        <w:rPr>
+          <w:lang w:val="en-GB"/>
+        </w:rPr>
+        <w:tab/>
+      </w:r>
+      <w:r>
+        <w:rPr>
+          <w:lang w:val="en-GB"/>
+        </w:rPr>
+        <w:tab/>
+      </w:r>
+      <w:r>
+        <w:rPr>
+          <w:lang w:val="en-GB"/>
+        </w:rPr>
+        <w:tab/>
+        <w:t>@approverRemarks AS Remarks,</w:t>
+      </w:r>
+    </w:p>
+    <w:p>
+      <w:pPr>
+        <w:spacing w:after="0"/>
+        <w:rPr>
+          <w:lang w:val="en-GB"/>
+        </w:rPr>
+      </w:pPr>
+      <w:r>
+        <w:rPr>
+          <w:lang w:val="en-GB"/>
+        </w:rPr>
+        <w:tab/>
+      </w:r>
+      <w:r>
+        <w:rPr>
+          <w:lang w:val="en-GB"/>
+        </w:rPr>
+        <w:tab/>
+      </w:r>
+      <w:r>
+        <w:rPr>
+          <w:lang w:val="en-GB"/>
+        </w:rPr>
+        <w:tab/>
+      </w:r>
+      <w:r>
+        <w:rPr>
+          <w:lang w:val="en-GB"/>
+        </w:rPr>
+        <w:tab/>
+      </w:r>
+      <w:proofErr w:type="gramStart"/>
+      <w:r>
+        <w:rPr>
+          <w:lang w:val="en-GB"/>
+        </w:rPr>
+        <w:t>GETDATE(</w:t>
+      </w:r>
+      <w:proofErr w:type="gramEnd"/>
+      <w:r>
+        <w:rPr>
+          <w:lang w:val="en-GB"/>
+        </w:rPr>
+        <w:t xml:space="preserve">) AS </w:t>
+      </w:r>
+      <w:proofErr w:type="spellStart"/>
+      <w:r>
+        <w:rPr>
+          <w:lang w:val="en-GB"/>
+        </w:rPr>
+        <w:t>CreatedDate</w:t>
+      </w:r>
+      <w:proofErr w:type="spellEnd"/>
+      <w:r>
+        <w:rPr>
+          <w:lang w:val="en-GB"/>
+        </w:rPr>
+        <w:t>,</w:t>
+      </w:r>
+    </w:p>
+    <w:p>
+      <w:pPr>
+        <w:spacing w:after="0"/>
+        <w:rPr>
+          <w:lang w:val="en-GB"/>
+        </w:rPr>
+      </w:pPr>
+      <w:r>
+        <w:rPr>
+          <w:lang w:val="en-GB"/>
+        </w:rPr>
+        <w:tab/>
+      </w:r>
+      <w:r>
+        <w:rPr>
+          <w:lang w:val="en-GB"/>
+        </w:rPr>
+        <w:tab/>
+      </w:r>
+      <w:r>
+        <w:rPr>
+          <w:lang w:val="en-GB"/>
+        </w:rPr>
+        <w:tab/>
+      </w:r>
+      <w:r>
+        <w:rPr>
+          <w:lang w:val="en-GB"/>
+        </w:rPr>
+        <w:tab/>
+        <w:t xml:space="preserve">@approverEmpNo AS </w:t>
+      </w:r>
+      <w:proofErr w:type="spellStart"/>
+      <w:r>
+        <w:rPr>
+          <w:lang w:val="en-GB"/>
+        </w:rPr>
+        <w:t>CreatedBy</w:t>
+      </w:r>
+      <w:proofErr w:type="spellEnd"/>
+      <w:r>
+        <w:rPr>
+          <w:lang w:val="en-GB"/>
+        </w:rPr>
+        <w:t>,</w:t>
+      </w:r>
+    </w:p>
+    <w:p>
+      <w:pPr>
+        <w:spacing w:after="0"/>
+        <w:rPr>
+          <w:lang w:val="en-GB"/>
+        </w:rPr>
+      </w:pPr>
+      <w:r>
+        <w:rPr>
+          <w:lang w:val="en-GB"/>
+        </w:rPr>
+        <w:tab/>
+      </w:r>
+      <w:r>
+        <w:rPr>
+          <w:lang w:val="en-GB"/>
+        </w:rPr>
+        <w:tab/>
+      </w:r>
+      <w:r>
+        <w:rPr>
+          <w:lang w:val="en-GB"/>
+        </w:rPr>
+        <w:tab/>
+      </w:r>
+      <w:r>
+        <w:rPr>
+          <w:lang w:val="en-GB"/>
+        </w:rPr>
+        <w:tab/>
+        <w:t xml:space="preserve">@approverUserID AS </w:t>
+      </w:r>
+      <w:proofErr w:type="spellStart"/>
+      <w:r>
+        <w:rPr>
+          <w:lang w:val="en-GB"/>
+        </w:rPr>
+        <w:t>CreatedUserID</w:t>
+      </w:r>
+      <w:proofErr w:type="spellEnd"/>
+    </w:p>
+    <w:p>
+      <w:pPr>
+        <w:spacing w:after="0"/>
+        <w:rPr>
+          <w:lang w:val="en-GB"/>
+        </w:rPr>
+      </w:pPr>
+      <w:r>
+        <w:rPr>
+          <w:lang w:val="en-GB"/>
+        </w:rPr>
+        <w:tab/>
+      </w:r>
+      <w:r>
+        <w:rPr>
+          <w:lang w:val="en-GB"/>
+        </w:rPr>
+        <w:tab/>
+        <w:t xml:space="preserve">FROM </w:t>
+      </w:r>
+      <w:proofErr w:type="spellStart"/>
+      <w:proofErr w:type="gramStart"/>
+      <w:r>
+        <w:rPr>
+          <w:lang w:val="en-GB"/>
+        </w:rPr>
+        <w:t>kenuser.WorkflowStepInstances</w:t>
+      </w:r>
+      <w:proofErr w:type="spellEnd"/>
+      <w:proofErr w:type="gramEnd"/>
+      <w:r>
+        <w:rPr>
+          <w:lang w:val="en-GB"/>
+        </w:rPr>
+        <w:t xml:space="preserve"> a WITH (NOLOCK)</w:t>
+      </w:r>
+    </w:p>
+    <w:p>
+      <w:pPr>
+        <w:spacing w:after="0"/>
+        <w:rPr>
+          <w:lang w:val="en-GB"/>
+        </w:rPr>
+      </w:pPr>
+      <w:r>
+        <w:rPr>
+          <w:lang w:val="en-GB"/>
+        </w:rPr>
+        <w:tab/>
+      </w:r>
+      <w:r>
+        <w:rPr>
+          <w:lang w:val="en-GB"/>
+        </w:rPr>
+        <w:tab/>
+      </w:r>
+      <w:r>
+        <w:rPr>
+          <w:lang w:val="en-GB"/>
+        </w:rPr>
+        <w:tab/>
+        <w:t xml:space="preserve">INNER JOIN </w:t>
+      </w:r>
+      <w:proofErr w:type="spellStart"/>
+      <w:proofErr w:type="gramStart"/>
+      <w:r>
+        <w:rPr>
+          <w:lang w:val="en-GB"/>
+        </w:rPr>
+        <w:t>kenuser.WorkflowInstances</w:t>
+      </w:r>
+      <w:proofErr w:type="spellEnd"/>
+      <w:proofErr w:type="gramEnd"/>
+      <w:r>
+        <w:rPr>
+          <w:lang w:val="en-GB"/>
+        </w:rPr>
+        <w:t xml:space="preserve"> b WITH (NOLOCK) ON </w:t>
+      </w:r>
+      <w:proofErr w:type="spellStart"/>
+      <w:proofErr w:type="gramStart"/>
+      <w:r>
+        <w:rPr>
+          <w:lang w:val="en-GB"/>
+        </w:rPr>
+        <w:t>a.WorkflowInstanceId</w:t>
+      </w:r>
+      <w:proofErr w:type="spellEnd"/>
+      <w:proofErr w:type="gramEnd"/>
+      <w:r>
+        <w:rPr>
+          <w:lang w:val="en-GB"/>
+        </w:rPr>
+        <w:t xml:space="preserve"> = </w:t>
+      </w:r>
+      <w:proofErr w:type="spellStart"/>
+      <w:proofErr w:type="gramStart"/>
+      <w:r>
+        <w:rPr>
+          <w:lang w:val="en-GB"/>
+        </w:rPr>
+        <w:t>b.WorkflowInstanceId</w:t>
+      </w:r>
+      <w:proofErr w:type="spellEnd"/>
+      <w:proofErr w:type="gramEnd"/>
+    </w:p>
+    <w:p>
+      <w:pPr>
+        <w:spacing w:after="0"/>
+        <w:rPr>
+          <w:lang w:val="en-GB"/>
+        </w:rPr>
+      </w:pPr>
+      <w:r>
+        <w:rPr>
+          <w:lang w:val="en-GB"/>
+        </w:rPr>
+        <w:tab/>
+      </w:r>
+      <w:r>
+        <w:rPr>
+          <w:lang w:val="en-GB"/>
+        </w:rPr>
+        <w:tab/>
+      </w:r>
+      <w:r>
+        <w:rPr>
+          <w:lang w:val="en-GB"/>
+        </w:rPr>
+        <w:tab/>
+        <w:t xml:space="preserve">INNER JOIN </w:t>
+      </w:r>
+      <w:proofErr w:type="spellStart"/>
+      <w:proofErr w:type="gramStart"/>
+      <w:r>
+        <w:rPr>
+          <w:lang w:val="en-GB"/>
+        </w:rPr>
+        <w:t>kenuser.WorkflowStepDefinitions</w:t>
+      </w:r>
+      <w:proofErr w:type="spellEnd"/>
+      <w:proofErr w:type="gramEnd"/>
+      <w:r>
+        <w:rPr>
+          <w:lang w:val="en-GB"/>
+        </w:rPr>
+        <w:t xml:space="preserve"> c WITH (NOLOCK) ON </w:t>
+      </w:r>
+      <w:proofErr w:type="spellStart"/>
+      <w:proofErr w:type="gramStart"/>
+      <w:r>
+        <w:rPr>
+          <w:lang w:val="en-GB"/>
+        </w:rPr>
+        <w:t>a.StepDefinitionId</w:t>
+      </w:r>
+      <w:proofErr w:type="spellEnd"/>
+      <w:proofErr w:type="gramEnd"/>
+      <w:r>
+        <w:rPr>
+          <w:lang w:val="en-GB"/>
+        </w:rPr>
+        <w:t xml:space="preserve"> = </w:t>
+      </w:r>
+      <w:proofErr w:type="spellStart"/>
+      <w:proofErr w:type="gramStart"/>
+      <w:r>
+        <w:rPr>
+          <w:lang w:val="en-GB"/>
+        </w:rPr>
+        <w:t>c.StepDefinitionId</w:t>
+      </w:r>
+      <w:proofErr w:type="spellEnd"/>
+      <w:proofErr w:type="gramEnd"/>
+    </w:p>
+    <w:p>
+      <w:pPr>
+        <w:spacing w:after="0"/>
+        <w:rPr>
+          <w:lang w:val="en-GB"/>
+        </w:rPr>
+      </w:pPr>
+      <w:r>
+        <w:rPr>
+          <w:lang w:val="en-GB"/>
+        </w:rPr>
+        <w:tab/>
+      </w:r>
+      <w:r>
+        <w:rPr>
+          <w:lang w:val="en-GB"/>
+        </w:rPr>
+        <w:tab/>
+      </w:r>
+      <w:r>
+        <w:rPr>
+          <w:lang w:val="en-GB"/>
+        </w:rPr>
+        <w:tab/>
+        <w:t xml:space="preserve">INNER JOIN </w:t>
+      </w:r>
+      <w:proofErr w:type="spellStart"/>
+      <w:proofErr w:type="gramStart"/>
+      <w:r>
+        <w:rPr>
+          <w:lang w:val="en-GB"/>
+        </w:rPr>
+        <w:t>kenuser.WorkflowDefinitions</w:t>
+      </w:r>
+      <w:proofErr w:type="spellEnd"/>
+      <w:proofErr w:type="gramEnd"/>
+      <w:r>
+        <w:rPr>
+          <w:lang w:val="en-GB"/>
+        </w:rPr>
+        <w:t xml:space="preserve"> d WITH (NOLOCK) ON </w:t>
+      </w:r>
+      <w:proofErr w:type="spellStart"/>
+      <w:proofErr w:type="gramStart"/>
+      <w:r>
+        <w:rPr>
+          <w:lang w:val="en-GB"/>
+        </w:rPr>
+        <w:t>c.WorkflowDefinitionId</w:t>
+      </w:r>
+      <w:proofErr w:type="spellEnd"/>
+      <w:proofErr w:type="gramEnd"/>
+      <w:r>
+        <w:rPr>
+          <w:lang w:val="en-GB"/>
+        </w:rPr>
+        <w:t xml:space="preserve"> = </w:t>
+      </w:r>
+      <w:proofErr w:type="spellStart"/>
+      <w:proofErr w:type="gramStart"/>
+      <w:r>
+        <w:rPr>
+          <w:lang w:val="en-GB"/>
+        </w:rPr>
+        <w:t>d.WorkflowDefinitionId</w:t>
+      </w:r>
+      <w:proofErr w:type="spellEnd"/>
+      <w:proofErr w:type="gramEnd"/>
+    </w:p>
+    <w:p>
+      <w:pPr>
+        <w:spacing w:after="0"/>
+        <w:rPr>
+          <w:lang w:val="en-GB"/>
+        </w:rPr>
+      </w:pPr>
+      <w:r>
+        <w:rPr>
+          <w:lang w:val="en-GB"/>
+        </w:rPr>
+        <w:tab/>
+      </w:r>
+      <w:r>
+        <w:rPr>
+          <w:lang w:val="en-GB"/>
+        </w:rPr>
+        <w:tab/>
+      </w:r>
+      <w:r>
+        <w:rPr>
+          <w:lang w:val="en-GB"/>
+        </w:rPr>
+        <w:tab/>
+        <w:t xml:space="preserve">INNER JOIN </w:t>
+      </w:r>
+      <w:proofErr w:type="spellStart"/>
+      <w:proofErr w:type="gramStart"/>
+      <w:r>
+        <w:rPr>
+          <w:lang w:val="en-GB"/>
+        </w:rPr>
+        <w:t>kenuser.WorkflowApprovalRoles</w:t>
+      </w:r>
+      <w:proofErr w:type="spellEnd"/>
+      <w:proofErr w:type="gramEnd"/>
+      <w:r>
+        <w:rPr>
+          <w:lang w:val="en-GB"/>
+        </w:rPr>
+        <w:t xml:space="preserve"> e WITH (NOLOCK) ON RTRIM(</w:t>
+      </w:r>
+      <w:proofErr w:type="spellStart"/>
+      <w:proofErr w:type="gramStart"/>
+      <w:r>
+        <w:rPr>
+          <w:lang w:val="en-GB"/>
+        </w:rPr>
+        <w:t>c.ApprovalRole</w:t>
+      </w:r>
+      <w:proofErr w:type="spellEnd"/>
+      <w:proofErr w:type="gramEnd"/>
+      <w:r>
+        <w:rPr>
+          <w:lang w:val="en-GB"/>
+        </w:rPr>
+        <w:t>) = RTRIM(</w:t>
+      </w:r>
+      <w:proofErr w:type="spellStart"/>
+      <w:proofErr w:type="gramStart"/>
+      <w:r>
+        <w:rPr>
+          <w:lang w:val="en-GB"/>
+        </w:rPr>
+        <w:t>e.ApprovalGroupCode</w:t>
+      </w:r>
+      <w:proofErr w:type="spellEnd"/>
+      <w:proofErr w:type="gramEnd"/>
+      <w:r>
+        <w:rPr>
+          <w:lang w:val="en-GB"/>
+        </w:rPr>
+        <w:t>)</w:t>
+      </w:r>
+    </w:p>
+    <w:p>
+      <w:pPr>
+        <w:spacing w:after="0"/>
+        <w:rPr>
+          <w:lang w:val="en-GB"/>
+        </w:rPr>
+      </w:pPr>
+      <w:r>
+        <w:rPr>
+          <w:lang w:val="en-GB"/>
+        </w:rPr>
+        <w:tab/>
+      </w:r>
+      <w:r>
+        <w:rPr>
+          <w:lang w:val="en-GB"/>
+        </w:rPr>
+        <w:tab/>
+      </w:r>
+      <w:r>
+        <w:rPr>
+          <w:lang w:val="en-GB"/>
+        </w:rPr>
+        <w:tab/>
+        <w:t xml:space="preserve">LEFT JOIN </w:t>
+      </w:r>
+      <w:proofErr w:type="spellStart"/>
+      <w:proofErr w:type="gramStart"/>
+      <w:r>
+        <w:rPr>
+          <w:lang w:val="en-GB"/>
+        </w:rPr>
+        <w:t>kenuser.Employee</w:t>
+      </w:r>
+      <w:proofErr w:type="spellEnd"/>
+      <w:proofErr w:type="gramEnd"/>
+      <w:r>
+        <w:rPr>
+          <w:lang w:val="en-GB"/>
+        </w:rPr>
+        <w:t xml:space="preserve"> f WITH (NOLOCK) ON </w:t>
+      </w:r>
+      <w:proofErr w:type="spellStart"/>
+      <w:proofErr w:type="gramStart"/>
+      <w:r>
+        <w:rPr>
+          <w:lang w:val="en-GB"/>
+        </w:rPr>
+        <w:t>a.ApproverEmpNo</w:t>
+      </w:r>
+      <w:proofErr w:type="spellEnd"/>
+      <w:proofErr w:type="gramEnd"/>
+      <w:r>
+        <w:rPr>
+          <w:lang w:val="en-GB"/>
+        </w:rPr>
+        <w:t xml:space="preserve"> = </w:t>
+      </w:r>
+      <w:proofErr w:type="spellStart"/>
+      <w:proofErr w:type="gramStart"/>
+      <w:r>
+        <w:rPr>
+          <w:lang w:val="en-GB"/>
+        </w:rPr>
+        <w:t>f.EmployeeNo</w:t>
+      </w:r>
+      <w:proofErr w:type="spellEnd"/>
+      <w:proofErr w:type="gramEnd"/>
+    </w:p>
+    <w:p>
+      <w:pPr>
+        <w:spacing w:after="0"/>
+        <w:rPr>
+          <w:lang w:val="en-GB"/>
+        </w:rPr>
+      </w:pPr>
+      <w:r>
+        <w:rPr>
+          <w:lang w:val="en-GB"/>
+        </w:rPr>
+        <w:tab/>
+      </w:r>
+      <w:r>
+        <w:rPr>
+          <w:lang w:val="en-GB"/>
+        </w:rPr>
+        <w:tab/>
+        <w:t xml:space="preserve">WHERE </w:t>
+      </w:r>
+      <w:proofErr w:type="spellStart"/>
+      <w:proofErr w:type="gramStart"/>
+      <w:r>
+        <w:rPr>
+          <w:lang w:val="en-GB"/>
+        </w:rPr>
+        <w:t>a.StepInstanceId</w:t>
+      </w:r>
+      <w:proofErr w:type="spellEnd"/>
+      <w:proofErr w:type="gramEnd"/>
+      <w:r>
+        <w:rPr>
+          <w:lang w:val="en-GB"/>
+        </w:rPr>
+        <w:t xml:space="preserve"> = @stepInstanceId</w:t>
+      </w:r>
+    </w:p>
+    <w:p>
+      <w:pPr>
+        <w:spacing w:after="0"/>
+        <w:rPr>
+          <w:lang w:val="en-GB"/>
+        </w:rPr>
+      </w:pPr>
+    </w:p>
+    <w:p>
+      <w:pPr>
+        <w:spacing w:after="0"/>
+        <w:rPr>
+          <w:lang w:val="en-GB"/>
+        </w:rPr>
+      </w:pPr>
+      <w:r>
+        <w:rPr>
+          <w:lang w:val="en-GB"/>
+        </w:rPr>
+        <w:tab/>
+      </w:r>
+      <w:r>
+        <w:rPr>
+          <w:lang w:val="en-GB"/>
+        </w:rPr>
+        <w:tab/>
+        <w:t>SELECT @affectedRow = @@ROWCOUNT</w:t>
+      </w:r>
+    </w:p>
+    <w:p>
+      <w:pPr>
+        <w:spacing w:after="0"/>
+        <w:rPr>
+          <w:lang w:val="en-GB"/>
+        </w:rPr>
+      </w:pPr>
+      <w:r>
+        <w:rPr>
+          <w:lang w:val="en-GB"/>
+        </w:rPr>
+        <w:tab/>
+        <w:t xml:space="preserve">END </w:t>
+      </w:r>
+    </w:p>
+    <w:p>
+      <w:pPr>
+        <w:spacing w:after="0"/>
+        <w:rPr>
+          <w:lang w:val="en-GB"/>
+        </w:rPr>
+      </w:pPr>
+    </w:p>
+    <w:p>
+      <w:pPr>
+        <w:spacing w:after="0"/>
+      </w:pPr>
+      <w:r>
+        <w:rPr>
+          <w:lang w:val="en-GB"/>
+        </w:rPr>
+        <w:t>END</w:t>
       </w:r>
     </w:p>
     <w:sectPr>

</xml_diff>